<commit_message>
refactor: replace Spire.Doc with DocumentFormat.OpenXml across all reports
Removed the Spire.Doc dependency and rewrote the Word document layer using
the official DocumentFormat.OpenXml SDK. WordDocumentHelper is now a set of
strongly-typed wrapper classes (WordDocument, WordTable, WordRow, WordCell)
instead of extension methods on Spire types; all report classes updated to
use the new API.

Also fixed a bug in ReplaceField where merge fields stored as w:fldSimple
elements (rather than the complex fldChar begin/separate/end structure) were
silently skipped. This caused DOC_NUMBER and DOC_DATE not to be substituted
in the TABLE_ASSETS table of the Commissioning Act report, as Word saved
those specific cells using the simple-field format.

Co-Authored-By: Claude Sonnet 4.6 <noreply@anthropic.com>
</commit_message>
<xml_diff>
--- a/Mil.Paperwork.Domain/Templates/CommissioningActTemplate.docx
+++ b/Mil.Paperwork.Domain/Templates/CommissioningActTemplate.docx
@@ -1,6 +1,6 @@
 
 <file path=word/document.xml><?xml version="1.0" encoding="utf-8"?>
-<w:document xmlns:wpc="http://schemas.microsoft.com/office/word/2010/wordprocessingCanvas" xmlns:cx="http://schemas.microsoft.com/office/drawing/2014/chartex" xmlns:cx1="http://schemas.microsoft.com/office/drawing/2015/9/8/chartex" xmlns:cx2="http://schemas.microsoft.com/office/drawing/2015/10/21/chartex" xmlns:cx3="http://schemas.microsoft.com/office/drawing/2016/5/9/chartex" xmlns:cx4="http://schemas.microsoft.com/office/drawing/2016/5/10/chartex" xmlns:cx5="http://schemas.microsoft.com/office/drawing/2016/5/11/chartex" xmlns:cx6="http://schemas.microsoft.com/office/drawing/2016/5/12/chartex" xmlns:cx7="http://schemas.microsoft.com/office/drawing/2016/5/13/chartex" xmlns:cx8="http://schemas.microsoft.com/office/drawing/2016/5/14/chartex" xmlns:mc="http://schemas.openxmlformats.org/markup-compatibility/2006" xmlns:aink="http://schemas.microsoft.com/office/drawing/2016/ink" xmlns:am3d="http://schemas.microsoft.com/office/drawing/2017/model3d" xmlns:o="urn:schemas-microsoft-com:office:office" xmlns:r="http://schemas.openxmlformats.org/officeDocument/2006/relationships" xmlns:m="http://schemas.openxmlformats.org/officeDocument/2006/math" xmlns:v="urn:schemas-microsoft-com:vml" xmlns:wp14="http://schemas.microsoft.com/office/word/2010/wordprocessingDrawing" xmlns:wp="http://schemas.openxmlformats.org/drawingml/2006/wordprocessingDrawing" xmlns:w10="urn:schemas-microsoft-com:office:word" xmlns:w="http://schemas.openxmlformats.org/wordprocessingml/2006/main" xmlns:w14="http://schemas.microsoft.com/office/word/2010/wordml" xmlns:w15="http://schemas.microsoft.com/office/word/2012/wordml" xmlns:w16cex="http://schemas.microsoft.com/office/word/2018/wordml/cex" xmlns:w16cid="http://schemas.microsoft.com/office/word/2016/wordml/cid" xmlns:w16="http://schemas.microsoft.com/office/word/2018/wordml" xmlns:w16sdtdh="http://schemas.microsoft.com/office/word/2020/wordml/sdtdatahash" xmlns:w16se="http://schemas.microsoft.com/office/word/2015/wordml/symex" xmlns:wpg="http://schemas.microsoft.com/office/word/2010/wordprocessingGroup" xmlns:wpi="http://schemas.microsoft.com/office/word/2010/wordprocessingInk" xmlns:wne="http://schemas.microsoft.com/office/word/2006/wordml" xmlns:wps="http://schemas.microsoft.com/office/word/2010/wordprocessingShape" mc:Ignorable="w14 w15 w16se w16cid w16 w16cex w16sdtdh wp14">
+<w:document xmlns:wpc="http://schemas.microsoft.com/office/word/2010/wordprocessingCanvas" xmlns:cx="http://schemas.microsoft.com/office/drawing/2014/chartex" xmlns:cx1="http://schemas.microsoft.com/office/drawing/2015/9/8/chartex" xmlns:cx2="http://schemas.microsoft.com/office/drawing/2015/10/21/chartex" xmlns:cx3="http://schemas.microsoft.com/office/drawing/2016/5/9/chartex" xmlns:cx4="http://schemas.microsoft.com/office/drawing/2016/5/10/chartex" xmlns:cx5="http://schemas.microsoft.com/office/drawing/2016/5/11/chartex" xmlns:cx6="http://schemas.microsoft.com/office/drawing/2016/5/12/chartex" xmlns:cx7="http://schemas.microsoft.com/office/drawing/2016/5/13/chartex" xmlns:cx8="http://schemas.microsoft.com/office/drawing/2016/5/14/chartex" xmlns:mc="http://schemas.openxmlformats.org/markup-compatibility/2006" xmlns:aink="http://schemas.microsoft.com/office/drawing/2016/ink" xmlns:am3d="http://schemas.microsoft.com/office/drawing/2017/model3d" xmlns:o="urn:schemas-microsoft-com:office:office" xmlns:oel="http://schemas.microsoft.com/office/2019/extlst" xmlns:r="http://schemas.openxmlformats.org/officeDocument/2006/relationships" xmlns:m="http://schemas.openxmlformats.org/officeDocument/2006/math" xmlns:v="urn:schemas-microsoft-com:vml" xmlns:wp14="http://schemas.microsoft.com/office/word/2010/wordprocessingDrawing" xmlns:wp="http://schemas.openxmlformats.org/drawingml/2006/wordprocessingDrawing" xmlns:w10="urn:schemas-microsoft-com:office:word" xmlns:w="http://schemas.openxmlformats.org/wordprocessingml/2006/main" xmlns:w14="http://schemas.microsoft.com/office/word/2010/wordml" xmlns:w15="http://schemas.microsoft.com/office/word/2012/wordml" xmlns:w16cex="http://schemas.microsoft.com/office/word/2018/wordml/cex" xmlns:w16cid="http://schemas.microsoft.com/office/word/2016/wordml/cid" xmlns:w16="http://schemas.microsoft.com/office/word/2018/wordml" xmlns:w16du="http://schemas.microsoft.com/office/word/2023/wordml/word16du" xmlns:w16sdtdh="http://schemas.microsoft.com/office/word/2020/wordml/sdtdatahash" xmlns:w16se="http://schemas.microsoft.com/office/word/2015/wordml/symex" xmlns:wpg="http://schemas.microsoft.com/office/word/2010/wordprocessingGroup" xmlns:wpi="http://schemas.microsoft.com/office/word/2010/wordprocessingInk" xmlns:wne="http://schemas.microsoft.com/office/word/2006/wordml" xmlns:wps="http://schemas.microsoft.com/office/word/2010/wordprocessingShape" mc:Ignorable="w14 w15 w16se w16cid w16 w16cex w16sdtdh w16du wp14">
   <w:body>
     <w:p>
       <w:pPr>
@@ -110,9 +110,9 @@
                 <w:color w:val="000000"/>
                 <w:sz w:val="22"/>
                 <w:szCs w:val="22"/>
-                <w:lang w:eastAsia="en-US"/>
-              </w:rPr>
-              <w:instrText xml:space="preserve"> MERGEFIELD  MILITARY_UNIT  \* MERGEFORMAT </w:instrText>
+                <w:lang w:val="ru-RU" w:eastAsia="en-US"/>
+              </w:rPr>
+              <w:instrText xml:space="preserve"> MERGEFIELD  MIL_UNIT  \* MERGEFORMAT </w:instrText>
             </w:r>
             <w:r>
               <w:rPr>
@@ -131,10 +131,11 @@
                 <w:rFonts w:eastAsia="Calibri"/>
                 <w:b/>
                 <w:bCs/>
+                <w:noProof/>
                 <w:color w:val="000000"/>
                 <w:sz w:val="22"/>
                 <w:szCs w:val="22"/>
-                <w:lang w:eastAsia="en-US"/>
+                <w:lang w:val="ru-RU" w:eastAsia="en-US"/>
               </w:rPr>
               <w:t>«MIL_UNIT»</w:t>
             </w:r>
@@ -352,8 +353,8 @@
         <w:tblLook w:val="04A0" w:firstRow="1" w:lastRow="0" w:firstColumn="1" w:lastColumn="0" w:noHBand="0" w:noVBand="1"/>
       </w:tblPr>
       <w:tblGrid>
-        <w:gridCol w:w="2298"/>
-        <w:gridCol w:w="2486"/>
+        <w:gridCol w:w="2217"/>
+        <w:gridCol w:w="2351"/>
       </w:tblGrid>
       <w:tr>
         <w:tc>
@@ -435,9 +436,9 @@
                 <w:color w:val="000000"/>
                 <w:sz w:val="22"/>
                 <w:szCs w:val="22"/>
-                <w:lang w:eastAsia="en-US"/>
-              </w:rPr>
-              <w:instrText xml:space="preserve"> MERGEFIELD  MILITARY_UNIT  \* MERGEFORMAT </w:instrText>
+                <w:lang w:val="ru-RU" w:eastAsia="en-US"/>
+              </w:rPr>
+              <w:instrText xml:space="preserve"> MERGEFIELD  MIL_UNIT  \* MERGEFORMAT </w:instrText>
             </w:r>
             <w:r>
               <w:rPr>
@@ -452,10 +453,11 @@
             <w:r>
               <w:rPr>
                 <w:rFonts w:eastAsia="Calibri"/>
+                <w:noProof/>
                 <w:color w:val="000000"/>
                 <w:sz w:val="22"/>
                 <w:szCs w:val="22"/>
-                <w:lang w:eastAsia="en-US"/>
+                <w:lang w:val="ru-RU" w:eastAsia="en-US"/>
               </w:rPr>
               <w:t>«MIL_UNIT»</w:t>
             </w:r>
@@ -503,9 +505,9 @@
                 <w:color w:val="000000"/>
                 <w:sz w:val="22"/>
                 <w:szCs w:val="22"/>
-                <w:lang w:eastAsia="en-US"/>
-              </w:rPr>
-              <w:instrText xml:space="preserve"> MERGEFIELD  COMMANDER_RANK  \* MERGEFORMAT </w:instrText>
+                <w:lang w:val="ru-RU" w:eastAsia="en-US"/>
+              </w:rPr>
+              <w:instrText xml:space="preserve"> MERGEFIELD  COMM_RANK  \* MERGEFORMAT </w:instrText>
             </w:r>
             <w:r>
               <w:rPr>
@@ -520,10 +522,11 @@
             <w:r>
               <w:rPr>
                 <w:rFonts w:eastAsia="Calibri"/>
+                <w:noProof/>
                 <w:color w:val="000000"/>
                 <w:sz w:val="22"/>
                 <w:szCs w:val="22"/>
-                <w:lang w:eastAsia="en-US"/>
+                <w:lang w:val="ru-RU" w:eastAsia="en-US"/>
               </w:rPr>
               <w:t>«COMM_RANK»</w:t>
             </w:r>
@@ -570,9 +573,9 @@
                 <w:color w:val="000000"/>
                 <w:sz w:val="22"/>
                 <w:szCs w:val="22"/>
-                <w:lang w:eastAsia="en-US"/>
-              </w:rPr>
-              <w:instrText xml:space="preserve"> MERGEFIELD  UNIT_COMMANDER  \* MERGEFORMAT </w:instrText>
+                <w:lang w:val="ru-RU" w:eastAsia="en-US"/>
+              </w:rPr>
+              <w:instrText xml:space="preserve"> MERGEFIELD  UNIT_COMM  \* MERGEFORMAT </w:instrText>
             </w:r>
             <w:r>
               <w:rPr>
@@ -587,10 +590,11 @@
             <w:r>
               <w:rPr>
                 <w:rFonts w:eastAsia="Calibri"/>
+                <w:noProof/>
                 <w:color w:val="000000"/>
                 <w:sz w:val="22"/>
                 <w:szCs w:val="22"/>
-                <w:lang w:eastAsia="en-US"/>
+                <w:lang w:val="ru-RU" w:eastAsia="en-US"/>
               </w:rPr>
               <w:t>«UNIT_COMM»</w:t>
             </w:r>
@@ -661,7 +665,7 @@
                 <w:szCs w:val="24"/>
                 <w:lang w:val="ru-RU"/>
               </w:rPr>
-              <w:t>2025</w:t>
+              <w:t>2026</w:t>
             </w:r>
             <w:r>
               <w:rPr>
@@ -737,7 +741,7 @@
         <w:tblLook w:val="04A0" w:firstRow="1" w:lastRow="0" w:firstColumn="1" w:lastColumn="0" w:noHBand="0" w:noVBand="1"/>
       </w:tblPr>
       <w:tblGrid>
-        <w:gridCol w:w="3650"/>
+        <w:gridCol w:w="3434"/>
       </w:tblGrid>
       <w:tr>
         <w:tc>
@@ -860,7 +864,7 @@
     </w:p>
     <w:tbl>
       <w:tblPr>
-        <w:tblW w:w="10349" w:type="dxa"/>
+        <w:tblW w:w="9849" w:type="dxa"/>
         <w:tblInd w:w="-356" w:type="dxa"/>
         <w:tblBorders>
           <w:top w:val="single" w:sz="4" w:space="0" w:color="auto"/>
@@ -876,18 +880,19 @@
           <w:right w:w="70" w:type="dxa"/>
         </w:tblCellMar>
         <w:tblLook w:val="0000" w:firstRow="0" w:lastRow="0" w:firstColumn="0" w:lastColumn="0" w:noHBand="0" w:noVBand="0"/>
+        <w:tblCaption w:val="TABLE_ASSETS"/>
       </w:tblPr>
       <w:tblGrid>
         <w:gridCol w:w="1702"/>
-        <w:gridCol w:w="567"/>
-        <w:gridCol w:w="992"/>
+        <w:gridCol w:w="492"/>
+        <w:gridCol w:w="1067"/>
         <w:gridCol w:w="993"/>
         <w:gridCol w:w="708"/>
         <w:gridCol w:w="709"/>
         <w:gridCol w:w="992"/>
         <w:gridCol w:w="1276"/>
         <w:gridCol w:w="992"/>
-        <w:gridCol w:w="1418"/>
+        <w:gridCol w:w="918"/>
       </w:tblGrid>
       <w:tr>
         <w:trPr>
@@ -911,7 +916,7 @@
         </w:tc>
         <w:tc>
           <w:tcPr>
-            <w:tcW w:w="2410" w:type="dxa"/>
+            <w:tcW w:w="1910" w:type="dxa"/>
             <w:gridSpan w:val="2"/>
           </w:tcPr>
           <w:p>
@@ -938,7 +943,7 @@
             <w:pPr>
               <w:jc w:val="center"/>
             </w:pPr>
-            <w:fldSimple w:instr=" MERGEFIELD  DOCUMENT_NUMBER  \* MERGEFORMAT ">
+            <w:fldSimple w:instr=" MERGEFIELD  DOC_NUMBER  \* MERGEFORMAT ">
               <w:r>
                 <w:rPr>
                   <w:noProof/>
@@ -950,34 +955,21 @@
         </w:tc>
         <w:tc>
           <w:tcPr>
-            <w:tcW w:w="2410" w:type="dxa"/>
+            <w:tcW w:w="1910" w:type="dxa"/>
             <w:gridSpan w:val="2"/>
           </w:tcPr>
           <w:p>
             <w:pPr>
               <w:jc w:val="center"/>
             </w:pPr>
-            <w:r>
-              <w:fldChar w:fldCharType="begin"/>
-            </w:r>
-            <w:r>
-              <w:instrText xml:space="preserve"> MERGEFIELD  DOC_DATE  \* MERGEFORMAT </w:instrText>
-            </w:r>
-            <w:r>
-              <w:fldChar w:fldCharType="separate"/>
-            </w:r>
-            <w:r>
-              <w:rPr>
-                <w:noProof/>
-              </w:rPr>
-              <w:t>«DOC_DATE»</w:t>
-            </w:r>
-            <w:r>
-              <w:rPr>
-                <w:noProof/>
-              </w:rPr>
-              <w:fldChar w:fldCharType="end"/>
-            </w:r>
+            <w:fldSimple w:instr=" MERGEFIELD  DOC_DATE  \* MERGEFORMAT ">
+              <w:r>
+                <w:rPr>
+                  <w:noProof/>
+                </w:rPr>
+                <w:t>«DOC_DATE»</w:t>
+              </w:r>
+            </w:fldSimple>
           </w:p>
         </w:tc>
       </w:tr>
@@ -1009,7 +1001,7 @@
         </w:tc>
         <w:tc>
           <w:tcPr>
-            <w:tcW w:w="567" w:type="dxa"/>
+            <w:tcW w:w="492" w:type="dxa"/>
             <w:vMerge w:val="restart"/>
           </w:tcPr>
           <w:p>
@@ -1027,6 +1019,72 @@
                 <w:szCs w:val="18"/>
               </w:rPr>
               <w:t>К-сть</w:t>
+            </w:r>
+          </w:p>
+        </w:tc>
+        <w:tc>
+          <w:tcPr>
+            <w:tcW w:w="1067" w:type="dxa"/>
+            <w:vMerge w:val="restart"/>
+          </w:tcPr>
+          <w:p>
+            <w:pPr>
+              <w:jc w:val="center"/>
+              <w:rPr>
+                <w:sz w:val="18"/>
+                <w:szCs w:val="18"/>
+              </w:rPr>
+            </w:pPr>
+            <w:r>
+              <w:rPr>
+                <w:sz w:val="18"/>
+                <w:szCs w:val="18"/>
+              </w:rPr>
+              <w:t>Первісна вартість</w:t>
+            </w:r>
+          </w:p>
+        </w:tc>
+        <w:tc>
+          <w:tcPr>
+            <w:tcW w:w="993" w:type="dxa"/>
+            <w:vMerge w:val="restart"/>
+          </w:tcPr>
+          <w:p>
+            <w:pPr>
+              <w:jc w:val="center"/>
+              <w:rPr>
+                <w:sz w:val="18"/>
+                <w:szCs w:val="18"/>
+              </w:rPr>
+            </w:pPr>
+            <w:r>
+              <w:rPr>
+                <w:sz w:val="18"/>
+                <w:szCs w:val="18"/>
+              </w:rPr>
+              <w:t>Сума всього</w:t>
+            </w:r>
+          </w:p>
+        </w:tc>
+        <w:tc>
+          <w:tcPr>
+            <w:tcW w:w="1417" w:type="dxa"/>
+            <w:gridSpan w:val="2"/>
+          </w:tcPr>
+          <w:p>
+            <w:pPr>
+              <w:jc w:val="center"/>
+              <w:rPr>
+                <w:sz w:val="18"/>
+                <w:szCs w:val="18"/>
+              </w:rPr>
+            </w:pPr>
+            <w:r>
+              <w:rPr>
+                <w:sz w:val="18"/>
+                <w:szCs w:val="18"/>
+              </w:rPr>
+              <w:t>Знос</w:t>
             </w:r>
           </w:p>
         </w:tc>
@@ -1048,13 +1106,13 @@
                 <w:sz w:val="18"/>
                 <w:szCs w:val="18"/>
               </w:rPr>
-              <w:t>Первісна вартість</w:t>
-            </w:r>
-          </w:p>
-        </w:tc>
-        <w:tc>
-          <w:tcPr>
-            <w:tcW w:w="993" w:type="dxa"/>
+              <w:t>Ліквідаційна вартість</w:t>
+            </w:r>
+          </w:p>
+        </w:tc>
+        <w:tc>
+          <w:tcPr>
+            <w:tcW w:w="1276" w:type="dxa"/>
             <w:vMerge w:val="restart"/>
           </w:tcPr>
           <w:p>
@@ -1070,29 +1128,7 @@
                 <w:sz w:val="18"/>
                 <w:szCs w:val="18"/>
               </w:rPr>
-              <w:t>Сума всього</w:t>
-            </w:r>
-          </w:p>
-        </w:tc>
-        <w:tc>
-          <w:tcPr>
-            <w:tcW w:w="1417" w:type="dxa"/>
-            <w:gridSpan w:val="2"/>
-          </w:tcPr>
-          <w:p>
-            <w:pPr>
-              <w:jc w:val="center"/>
-              <w:rPr>
-                <w:sz w:val="18"/>
-                <w:szCs w:val="18"/>
-              </w:rPr>
-            </w:pPr>
-            <w:r>
-              <w:rPr>
-                <w:sz w:val="18"/>
-                <w:szCs w:val="18"/>
-              </w:rPr>
-              <w:t>Знос</w:t>
+              <w:t>Строк корисного використання</w:t>
             </w:r>
           </w:p>
         </w:tc>
@@ -1103,50 +1139,7 @@
           </w:tcPr>
           <w:p>
             <w:pPr>
-              <w:jc w:val="center"/>
-              <w:rPr>
-                <w:sz w:val="18"/>
-                <w:szCs w:val="18"/>
-              </w:rPr>
-            </w:pPr>
-            <w:r>
-              <w:rPr>
-                <w:sz w:val="18"/>
-                <w:szCs w:val="18"/>
-              </w:rPr>
-              <w:t>Ліквідаційна вартість</w:t>
-            </w:r>
-          </w:p>
-        </w:tc>
-        <w:tc>
-          <w:tcPr>
-            <w:tcW w:w="1276" w:type="dxa"/>
-            <w:vMerge w:val="restart"/>
-          </w:tcPr>
-          <w:p>
-            <w:pPr>
-              <w:jc w:val="center"/>
-              <w:rPr>
-                <w:sz w:val="18"/>
-                <w:szCs w:val="18"/>
-              </w:rPr>
-            </w:pPr>
-            <w:r>
-              <w:rPr>
-                <w:sz w:val="18"/>
-                <w:szCs w:val="18"/>
-              </w:rPr>
-              <w:t>Строк корисного використання</w:t>
-            </w:r>
-          </w:p>
-        </w:tc>
-        <w:tc>
-          <w:tcPr>
-            <w:tcW w:w="992" w:type="dxa"/>
-            <w:vMerge w:val="restart"/>
-          </w:tcPr>
-          <w:p>
-            <w:pPr>
+              <w:ind w:left="-7" w:right="-1"/>
               <w:jc w:val="center"/>
               <w:rPr>
                 <w:sz w:val="18"/>
@@ -1180,7 +1173,7 @@
         </w:tc>
         <w:tc>
           <w:tcPr>
-            <w:tcW w:w="1418" w:type="dxa"/>
+            <w:tcW w:w="918" w:type="dxa"/>
             <w:vMerge w:val="restart"/>
           </w:tcPr>
           <w:p>
@@ -1227,13 +1220,79 @@
         </w:tc>
         <w:tc>
           <w:tcPr>
-            <w:tcW w:w="567" w:type="dxa"/>
+            <w:tcW w:w="492" w:type="dxa"/>
             <w:vMerge/>
           </w:tcPr>
           <w:p>
             <w:pPr>
               <w:jc w:val="center"/>
             </w:pPr>
+          </w:p>
+        </w:tc>
+        <w:tc>
+          <w:tcPr>
+            <w:tcW w:w="1067" w:type="dxa"/>
+            <w:vMerge/>
+          </w:tcPr>
+          <w:p>
+            <w:pPr>
+              <w:jc w:val="center"/>
+            </w:pPr>
+          </w:p>
+        </w:tc>
+        <w:tc>
+          <w:tcPr>
+            <w:tcW w:w="993" w:type="dxa"/>
+            <w:vMerge/>
+          </w:tcPr>
+          <w:p>
+            <w:pPr>
+              <w:jc w:val="center"/>
+            </w:pPr>
+          </w:p>
+        </w:tc>
+        <w:tc>
+          <w:tcPr>
+            <w:tcW w:w="708" w:type="dxa"/>
+          </w:tcPr>
+          <w:p>
+            <w:pPr>
+              <w:ind w:right="-70"/>
+              <w:jc w:val="center"/>
+              <w:rPr>
+                <w:sz w:val="16"/>
+                <w:szCs w:val="16"/>
+              </w:rPr>
+            </w:pPr>
+            <w:r>
+              <w:rPr>
+                <w:sz w:val="16"/>
+                <w:szCs w:val="16"/>
+              </w:rPr>
+              <w:t>за одиницю</w:t>
+            </w:r>
+          </w:p>
+        </w:tc>
+        <w:tc>
+          <w:tcPr>
+            <w:tcW w:w="709" w:type="dxa"/>
+          </w:tcPr>
+          <w:p>
+            <w:pPr>
+              <w:ind w:right="-70"/>
+              <w:jc w:val="center"/>
+              <w:rPr>
+                <w:sz w:val="16"/>
+                <w:szCs w:val="16"/>
+              </w:rPr>
+            </w:pPr>
+            <w:r>
+              <w:rPr>
+                <w:sz w:val="16"/>
+                <w:szCs w:val="16"/>
+              </w:rPr>
+              <w:t>всього</w:t>
+            </w:r>
           </w:p>
         </w:tc>
         <w:tc>
@@ -1249,57 +1308,13 @@
         </w:tc>
         <w:tc>
           <w:tcPr>
-            <w:tcW w:w="993" w:type="dxa"/>
+            <w:tcW w:w="1276" w:type="dxa"/>
             <w:vMerge/>
           </w:tcPr>
           <w:p>
             <w:pPr>
               <w:jc w:val="center"/>
             </w:pPr>
-          </w:p>
-        </w:tc>
-        <w:tc>
-          <w:tcPr>
-            <w:tcW w:w="708" w:type="dxa"/>
-          </w:tcPr>
-          <w:p>
-            <w:pPr>
-              <w:ind w:right="-70"/>
-              <w:jc w:val="center"/>
-              <w:rPr>
-                <w:sz w:val="16"/>
-                <w:szCs w:val="16"/>
-              </w:rPr>
-            </w:pPr>
-            <w:r>
-              <w:rPr>
-                <w:sz w:val="16"/>
-                <w:szCs w:val="16"/>
-              </w:rPr>
-              <w:t>за одиницю</w:t>
-            </w:r>
-          </w:p>
-        </w:tc>
-        <w:tc>
-          <w:tcPr>
-            <w:tcW w:w="709" w:type="dxa"/>
-          </w:tcPr>
-          <w:p>
-            <w:pPr>
-              <w:ind w:right="-70"/>
-              <w:jc w:val="center"/>
-              <w:rPr>
-                <w:sz w:val="16"/>
-                <w:szCs w:val="16"/>
-              </w:rPr>
-            </w:pPr>
-            <w:r>
-              <w:rPr>
-                <w:sz w:val="16"/>
-                <w:szCs w:val="16"/>
-              </w:rPr>
-              <w:t>всього</w:t>
-            </w:r>
           </w:p>
         </w:tc>
         <w:tc>
@@ -1315,29 +1330,7 @@
         </w:tc>
         <w:tc>
           <w:tcPr>
-            <w:tcW w:w="1276" w:type="dxa"/>
-            <w:vMerge/>
-          </w:tcPr>
-          <w:p>
-            <w:pPr>
-              <w:jc w:val="center"/>
-            </w:pPr>
-          </w:p>
-        </w:tc>
-        <w:tc>
-          <w:tcPr>
-            <w:tcW w:w="992" w:type="dxa"/>
-            <w:vMerge/>
-          </w:tcPr>
-          <w:p>
-            <w:pPr>
-              <w:jc w:val="center"/>
-            </w:pPr>
-          </w:p>
-        </w:tc>
-        <w:tc>
-          <w:tcPr>
-            <w:tcW w:w="1418" w:type="dxa"/>
+            <w:tcW w:w="918" w:type="dxa"/>
             <w:vMerge/>
           </w:tcPr>
           <w:p>
@@ -1363,7 +1356,7 @@
         </w:tc>
         <w:tc>
           <w:tcPr>
-            <w:tcW w:w="567" w:type="dxa"/>
+            <w:tcW w:w="492" w:type="dxa"/>
           </w:tcPr>
           <w:p>
             <w:pPr>
@@ -1376,6 +1369,58 @@
         </w:tc>
         <w:tc>
           <w:tcPr>
+            <w:tcW w:w="1067" w:type="dxa"/>
+          </w:tcPr>
+          <w:p>
+            <w:pPr>
+              <w:jc w:val="center"/>
+            </w:pPr>
+            <w:r>
+              <w:t>3</w:t>
+            </w:r>
+          </w:p>
+        </w:tc>
+        <w:tc>
+          <w:tcPr>
+            <w:tcW w:w="993" w:type="dxa"/>
+          </w:tcPr>
+          <w:p>
+            <w:pPr>
+              <w:jc w:val="center"/>
+            </w:pPr>
+            <w:r>
+              <w:t>4</w:t>
+            </w:r>
+          </w:p>
+        </w:tc>
+        <w:tc>
+          <w:tcPr>
+            <w:tcW w:w="708" w:type="dxa"/>
+          </w:tcPr>
+          <w:p>
+            <w:pPr>
+              <w:jc w:val="center"/>
+            </w:pPr>
+            <w:r>
+              <w:t>5</w:t>
+            </w:r>
+          </w:p>
+        </w:tc>
+        <w:tc>
+          <w:tcPr>
+            <w:tcW w:w="709" w:type="dxa"/>
+          </w:tcPr>
+          <w:p>
+            <w:pPr>
+              <w:jc w:val="center"/>
+            </w:pPr>
+            <w:r>
+              <w:t>6</w:t>
+            </w:r>
+          </w:p>
+        </w:tc>
+        <w:tc>
+          <w:tcPr>
             <w:tcW w:w="992" w:type="dxa"/>
           </w:tcPr>
           <w:p>
@@ -1383,46 +1428,20 @@
               <w:jc w:val="center"/>
             </w:pPr>
             <w:r>
-              <w:t>3</w:t>
-            </w:r>
-          </w:p>
-        </w:tc>
-        <w:tc>
-          <w:tcPr>
-            <w:tcW w:w="993" w:type="dxa"/>
-          </w:tcPr>
-          <w:p>
-            <w:pPr>
-              <w:jc w:val="center"/>
-            </w:pPr>
-            <w:r>
-              <w:t>4</w:t>
-            </w:r>
-          </w:p>
-        </w:tc>
-        <w:tc>
-          <w:tcPr>
-            <w:tcW w:w="708" w:type="dxa"/>
-          </w:tcPr>
-          <w:p>
-            <w:pPr>
-              <w:jc w:val="center"/>
-            </w:pPr>
-            <w:r>
-              <w:t>5</w:t>
-            </w:r>
-          </w:p>
-        </w:tc>
-        <w:tc>
-          <w:tcPr>
-            <w:tcW w:w="709" w:type="dxa"/>
-          </w:tcPr>
-          <w:p>
-            <w:pPr>
-              <w:jc w:val="center"/>
-            </w:pPr>
-            <w:r>
-              <w:t>6</w:t>
+              <w:t>7</w:t>
+            </w:r>
+          </w:p>
+        </w:tc>
+        <w:tc>
+          <w:tcPr>
+            <w:tcW w:w="1276" w:type="dxa"/>
+          </w:tcPr>
+          <w:p>
+            <w:pPr>
+              <w:jc w:val="center"/>
+            </w:pPr>
+            <w:r>
+              <w:t>8</w:t>
             </w:r>
           </w:p>
         </w:tc>
@@ -1435,39 +1454,13 @@
               <w:jc w:val="center"/>
             </w:pPr>
             <w:r>
-              <w:t>7</w:t>
-            </w:r>
-          </w:p>
-        </w:tc>
-        <w:tc>
-          <w:tcPr>
-            <w:tcW w:w="1276" w:type="dxa"/>
-          </w:tcPr>
-          <w:p>
-            <w:pPr>
-              <w:jc w:val="center"/>
-            </w:pPr>
-            <w:r>
-              <w:t>8</w:t>
-            </w:r>
-          </w:p>
-        </w:tc>
-        <w:tc>
-          <w:tcPr>
-            <w:tcW w:w="992" w:type="dxa"/>
-          </w:tcPr>
-          <w:p>
-            <w:pPr>
-              <w:jc w:val="center"/>
-            </w:pPr>
-            <w:r>
               <w:t>9</w:t>
             </w:r>
           </w:p>
         </w:tc>
         <w:tc>
           <w:tcPr>
-            <w:tcW w:w="1418" w:type="dxa"/>
+            <w:tcW w:w="918" w:type="dxa"/>
           </w:tcPr>
           <w:p>
             <w:pPr>
@@ -1492,7 +1485,47 @@
         </w:tc>
         <w:tc>
           <w:tcPr>
-            <w:tcW w:w="567" w:type="dxa"/>
+            <w:tcW w:w="492" w:type="dxa"/>
+          </w:tcPr>
+          <w:p>
+            <w:pPr>
+              <w:jc w:val="center"/>
+            </w:pPr>
+          </w:p>
+        </w:tc>
+        <w:tc>
+          <w:tcPr>
+            <w:tcW w:w="1067" w:type="dxa"/>
+          </w:tcPr>
+          <w:p>
+            <w:pPr>
+              <w:jc w:val="center"/>
+            </w:pPr>
+          </w:p>
+        </w:tc>
+        <w:tc>
+          <w:tcPr>
+            <w:tcW w:w="993" w:type="dxa"/>
+          </w:tcPr>
+          <w:p>
+            <w:pPr>
+              <w:jc w:val="center"/>
+            </w:pPr>
+          </w:p>
+        </w:tc>
+        <w:tc>
+          <w:tcPr>
+            <w:tcW w:w="708" w:type="dxa"/>
+          </w:tcPr>
+          <w:p>
+            <w:pPr>
+              <w:jc w:val="center"/>
+            </w:pPr>
+          </w:p>
+        </w:tc>
+        <w:tc>
+          <w:tcPr>
+            <w:tcW w:w="709" w:type="dxa"/>
           </w:tcPr>
           <w:p>
             <w:pPr>
@@ -1512,27 +1545,7 @@
         </w:tc>
         <w:tc>
           <w:tcPr>
-            <w:tcW w:w="993" w:type="dxa"/>
-          </w:tcPr>
-          <w:p>
-            <w:pPr>
-              <w:jc w:val="center"/>
-            </w:pPr>
-          </w:p>
-        </w:tc>
-        <w:tc>
-          <w:tcPr>
-            <w:tcW w:w="708" w:type="dxa"/>
-          </w:tcPr>
-          <w:p>
-            <w:pPr>
-              <w:jc w:val="center"/>
-            </w:pPr>
-          </w:p>
-        </w:tc>
-        <w:tc>
-          <w:tcPr>
-            <w:tcW w:w="709" w:type="dxa"/>
+            <w:tcW w:w="1276" w:type="dxa"/>
           </w:tcPr>
           <w:p>
             <w:pPr>
@@ -1552,27 +1565,7 @@
         </w:tc>
         <w:tc>
           <w:tcPr>
-            <w:tcW w:w="1276" w:type="dxa"/>
-          </w:tcPr>
-          <w:p>
-            <w:pPr>
-              <w:jc w:val="center"/>
-            </w:pPr>
-          </w:p>
-        </w:tc>
-        <w:tc>
-          <w:tcPr>
-            <w:tcW w:w="992" w:type="dxa"/>
-          </w:tcPr>
-          <w:p>
-            <w:pPr>
-              <w:jc w:val="center"/>
-            </w:pPr>
-          </w:p>
-        </w:tc>
-        <w:tc>
-          <w:tcPr>
-            <w:tcW w:w="1418" w:type="dxa"/>
+            <w:tcW w:w="918" w:type="dxa"/>
           </w:tcPr>
           <w:p>
             <w:pPr>
@@ -1769,7 +1762,23 @@
           <w:sz w:val="18"/>
           <w:szCs w:val="18"/>
         </w:rPr>
-        <w:t>(назва об’єкта(ів))</w:t>
+        <w:t>(назва об’єкта(</w:t>
+      </w:r>
+      <w:proofErr w:type="spellStart"/>
+      <w:r>
+        <w:rPr>
+          <w:sz w:val="18"/>
+          <w:szCs w:val="18"/>
+        </w:rPr>
+        <w:t>ів</w:t>
+      </w:r>
+      <w:proofErr w:type="spellEnd"/>
+      <w:r>
+        <w:rPr>
+          <w:sz w:val="18"/>
+          <w:szCs w:val="18"/>
+        </w:rPr>
+        <w:t>))</w:t>
       </w:r>
     </w:p>
     <w:tbl>
@@ -1820,7 +1829,27 @@
                 <w:szCs w:val="22"/>
                 <w:lang w:eastAsia="en-US"/>
               </w:rPr>
-              <w:t xml:space="preserve">у момент введення в експлуатацію об’єкт(и) знаходиться(яться) </w:t>
+              <w:t>у момент введення в експлуатацію об’єкт(и) знаходиться(</w:t>
+            </w:r>
+            <w:proofErr w:type="spellStart"/>
+            <w:r>
+              <w:rPr>
+                <w:rFonts w:eastAsia="Calibri"/>
+                <w:sz w:val="22"/>
+                <w:szCs w:val="22"/>
+                <w:lang w:eastAsia="en-US"/>
+              </w:rPr>
+              <w:t>яться</w:t>
+            </w:r>
+            <w:proofErr w:type="spellEnd"/>
+            <w:r>
+              <w:rPr>
+                <w:rFonts w:eastAsia="Calibri"/>
+                <w:sz w:val="22"/>
+                <w:szCs w:val="22"/>
+                <w:lang w:eastAsia="en-US"/>
+              </w:rPr>
+              <w:t xml:space="preserve">) </w:t>
             </w:r>
           </w:p>
         </w:tc>
@@ -1861,7 +1890,7 @@
                 <w:u w:val="single"/>
                 <w:lang w:val="en-US" w:eastAsia="en-US"/>
               </w:rPr>
-              <w:instrText xml:space="preserve"> MERGEFIELD  PLACE_CREATED  \* MERGEFORMAT </w:instrText>
+              <w:instrText xml:space="preserve"> MERGEFIELD  COMMISSIONED_LOCATION  \* MERGEFORMAT </w:instrText>
             </w:r>
             <w:r>
               <w:rPr>
@@ -1884,31 +1913,7 @@
                 <w:u w:val="single"/>
                 <w:lang w:val="en-US" w:eastAsia="en-US"/>
               </w:rPr>
-              <w:t>«COMM</w:t>
-            </w:r>
-            <w:r>
-              <w:rPr>
-                <w:rFonts w:eastAsia="Calibri"/>
-                <w:bCs/>
-                <w:noProof/>
-                <w:sz w:val="22"/>
-                <w:szCs w:val="22"/>
-                <w:u w:val="single"/>
-                <w:lang w:val="en-US" w:eastAsia="en-US"/>
-              </w:rPr>
-              <w:t>ISSIONED</w:t>
-            </w:r>
-            <w:r>
-              <w:rPr>
-                <w:rFonts w:eastAsia="Calibri"/>
-                <w:bCs/>
-                <w:noProof/>
-                <w:sz w:val="22"/>
-                <w:szCs w:val="22"/>
-                <w:u w:val="single"/>
-                <w:lang w:val="en-US" w:eastAsia="en-US"/>
-              </w:rPr>
-              <w:t>_LOCATION»</w:t>
+              <w:t>«COMMISSIONED_LOCATION»</w:t>
             </w:r>
             <w:r>
               <w:rPr>
@@ -1971,7 +1976,27 @@
                 <w:szCs w:val="18"/>
                 <w:lang w:eastAsia="en-US"/>
               </w:rPr>
-              <w:t>(місцезнаходження об’єкта(ів))</w:t>
+              <w:t>(місцезнаходження об’єкта(</w:t>
+            </w:r>
+            <w:proofErr w:type="spellStart"/>
+            <w:r>
+              <w:rPr>
+                <w:rFonts w:eastAsia="Calibri"/>
+                <w:sz w:val="18"/>
+                <w:szCs w:val="18"/>
+                <w:lang w:eastAsia="en-US"/>
+              </w:rPr>
+              <w:t>ів</w:t>
+            </w:r>
+            <w:proofErr w:type="spellEnd"/>
+            <w:r>
+              <w:rPr>
+                <w:rFonts w:eastAsia="Calibri"/>
+                <w:sz w:val="18"/>
+                <w:szCs w:val="18"/>
+                <w:lang w:eastAsia="en-US"/>
+              </w:rPr>
+              <w:t>))</w:t>
             </w:r>
           </w:p>
         </w:tc>
@@ -2019,7 +2044,27 @@
                 <w:szCs w:val="22"/>
                 <w:lang w:eastAsia="en-US"/>
               </w:rPr>
-              <w:t xml:space="preserve">Коротка характеристика об’єкта(ів) </w:t>
+              <w:t>Коротка характеристика об’єкта(</w:t>
+            </w:r>
+            <w:proofErr w:type="spellStart"/>
+            <w:r>
+              <w:rPr>
+                <w:rFonts w:eastAsia="Calibri"/>
+                <w:sz w:val="22"/>
+                <w:szCs w:val="22"/>
+                <w:lang w:eastAsia="en-US"/>
+              </w:rPr>
+              <w:t>ів</w:t>
+            </w:r>
+            <w:proofErr w:type="spellEnd"/>
+            <w:r>
+              <w:rPr>
+                <w:rFonts w:eastAsia="Calibri"/>
+                <w:sz w:val="22"/>
+                <w:szCs w:val="22"/>
+                <w:lang w:eastAsia="en-US"/>
+              </w:rPr>
+              <w:t xml:space="preserve">) </w:t>
             </w:r>
           </w:p>
         </w:tc>
@@ -2066,7 +2111,7 @@
                 <w:u w:val="single"/>
                 <w:lang w:val="en-US" w:eastAsia="en-US"/>
               </w:rPr>
-              <w:instrText xml:space="preserve"> MERGEFIELD  PLACE_CREATED  \* MERGEFORMAT </w:instrText>
+              <w:instrText xml:space="preserve"> MERGEFIELD  SHORT_CHARACTERISTIC  \* MERGEFORMAT </w:instrText>
             </w:r>
             <w:r>
               <w:rPr>
@@ -2089,31 +2134,7 @@
                 <w:u w:val="single"/>
                 <w:lang w:val="en-US" w:eastAsia="en-US"/>
               </w:rPr>
-              <w:t>«SHORT_</w:t>
-            </w:r>
-            <w:r>
-              <w:rPr>
-                <w:rFonts w:eastAsia="Calibri"/>
-                <w:bCs/>
-                <w:noProof/>
-                <w:sz w:val="22"/>
-                <w:szCs w:val="22"/>
-                <w:u w:val="single"/>
-                <w:lang w:val="en-US" w:eastAsia="en-US"/>
-              </w:rPr>
-              <w:t>CHARACTERISTIC</w:t>
-            </w:r>
-            <w:r>
-              <w:rPr>
-                <w:rFonts w:eastAsia="Calibri"/>
-                <w:bCs/>
-                <w:noProof/>
-                <w:sz w:val="22"/>
-                <w:szCs w:val="22"/>
-                <w:u w:val="single"/>
-                <w:lang w:val="en-US" w:eastAsia="en-US"/>
-              </w:rPr>
-              <w:t>»</w:t>
+              <w:t>«SHORT_CHARACTERISTIC»</w:t>
             </w:r>
             <w:r>
               <w:rPr>
@@ -2212,7 +2233,7 @@
                 <w:u w:val="single"/>
                 <w:lang w:val="en-US" w:eastAsia="en-US"/>
               </w:rPr>
-              <w:instrText xml:space="preserve"> MERGEFIELD  PLACE_CREATED  \* MERGEFORMAT </w:instrText>
+              <w:instrText xml:space="preserve"> MERGEFIELD  ASSET_COMPLIANCE  \* MERGEFORMAT </w:instrText>
             </w:r>
             <w:r>
               <w:rPr>
@@ -2389,7 +2410,7 @@
                 <w:u w:val="single"/>
                 <w:lang w:val="en-US" w:eastAsia="en-US"/>
               </w:rPr>
-              <w:instrText xml:space="preserve"> MERGEFIELD  PLACE_CREATED  \* MERGEFORMAT </w:instrText>
+              <w:instrText xml:space="preserve"> MERGEFIELD  COMPLETION_STATE  \* MERGEFORMAT </w:instrText>
             </w:r>
             <w:r>
               <w:rPr>
@@ -2525,7 +2546,27 @@
                 <w:szCs w:val="22"/>
                 <w:lang w:eastAsia="en-US"/>
               </w:rPr>
-              <w:t>Результати випробування об’єкта(ів)</w:t>
+              <w:t>Результати випробування об’єкта(</w:t>
+            </w:r>
+            <w:proofErr w:type="spellStart"/>
+            <w:r>
+              <w:rPr>
+                <w:rFonts w:eastAsia="Calibri"/>
+                <w:sz w:val="22"/>
+                <w:szCs w:val="22"/>
+                <w:lang w:eastAsia="en-US"/>
+              </w:rPr>
+              <w:t>ів</w:t>
+            </w:r>
+            <w:proofErr w:type="spellEnd"/>
+            <w:r>
+              <w:rPr>
+                <w:rFonts w:eastAsia="Calibri"/>
+                <w:sz w:val="22"/>
+                <w:szCs w:val="22"/>
+                <w:lang w:eastAsia="en-US"/>
+              </w:rPr>
+              <w:t>)</w:t>
             </w:r>
           </w:p>
         </w:tc>
@@ -2573,7 +2614,7 @@
                 <w:u w:val="single"/>
                 <w:lang w:val="en-US" w:eastAsia="en-US"/>
               </w:rPr>
-              <w:instrText xml:space="preserve"> MERGEFIELD  PLACE_CREATED  \* MERGEFORMAT </w:instrText>
+              <w:instrText xml:space="preserve"> MERGEFIELD  TEST_RESULTS  \* MERGEFORMAT </w:instrText>
             </w:r>
             <w:r>
               <w:rPr>
@@ -2703,7 +2744,7 @@
                 <w:u w:val="single"/>
                 <w:lang w:val="en-US" w:eastAsia="en-US"/>
               </w:rPr>
-              <w:instrText xml:space="preserve"> MERGEFIELD  PLACE_CREATED  \* MERGEFORMAT </w:instrText>
+              <w:instrText xml:space="preserve"> MERGEFIELD  OTHER_INFO  \* MERGEFORMAT </w:instrText>
             </w:r>
             <w:r>
               <w:rPr>
@@ -2726,31 +2767,7 @@
                 <w:u w:val="single"/>
                 <w:lang w:val="en-US" w:eastAsia="en-US"/>
               </w:rPr>
-              <w:t>«</w:t>
-            </w:r>
-            <w:r>
-              <w:rPr>
-                <w:rFonts w:eastAsia="Calibri"/>
-                <w:bCs/>
-                <w:noProof/>
-                <w:sz w:val="22"/>
-                <w:szCs w:val="22"/>
-                <w:u w:val="single"/>
-                <w:lang w:val="en-US" w:eastAsia="en-US"/>
-              </w:rPr>
-              <w:t>OTHER_INFO</w:t>
-            </w:r>
-            <w:r>
-              <w:rPr>
-                <w:rFonts w:eastAsia="Calibri"/>
-                <w:bCs/>
-                <w:noProof/>
-                <w:sz w:val="22"/>
-                <w:szCs w:val="22"/>
-                <w:u w:val="single"/>
-                <w:lang w:val="en-US" w:eastAsia="en-US"/>
-              </w:rPr>
-              <w:t>»</w:t>
+              <w:t>«OTHER_INFO»</w:t>
             </w:r>
             <w:r>
               <w:rPr>
@@ -2858,7 +2875,7 @@
                 <w:u w:val="single"/>
                 <w:lang w:val="en-US" w:eastAsia="en-US"/>
               </w:rPr>
-              <w:instrText xml:space="preserve"> MERGEFIELD  PLACE_CREATED  \* MERGEFORMAT </w:instrText>
+              <w:instrText xml:space="preserve"> MERGEFIELD  COMISSION_CONCLUSION  \* MERGEFORMAT </w:instrText>
             </w:r>
             <w:r>
               <w:rPr>
@@ -2881,31 +2898,7 @@
                 <w:u w:val="single"/>
                 <w:lang w:val="en-US" w:eastAsia="en-US"/>
               </w:rPr>
-              <w:t>«</w:t>
-            </w:r>
-            <w:r>
-              <w:rPr>
-                <w:rFonts w:eastAsia="Calibri"/>
-                <w:bCs/>
-                <w:noProof/>
-                <w:sz w:val="22"/>
-                <w:szCs w:val="22"/>
-                <w:u w:val="single"/>
-                <w:lang w:val="en-US" w:eastAsia="en-US"/>
-              </w:rPr>
-              <w:t>COMISSION_CONCLUSION</w:t>
-            </w:r>
-            <w:r>
-              <w:rPr>
-                <w:rFonts w:eastAsia="Calibri"/>
-                <w:bCs/>
-                <w:noProof/>
-                <w:sz w:val="22"/>
-                <w:szCs w:val="22"/>
-                <w:u w:val="single"/>
-                <w:lang w:val="en-US" w:eastAsia="en-US"/>
-              </w:rPr>
-              <w:t>»</w:t>
+              <w:t>«COMISSION_CONCLUSION»</w:t>
             </w:r>
             <w:r>
               <w:rPr>
@@ -3013,7 +3006,7 @@
                 <w:u w:val="single"/>
                 <w:lang w:val="en-US" w:eastAsia="en-US"/>
               </w:rPr>
-              <w:instrText xml:space="preserve"> MERGEFIELD  PLACE_CREATED  \* MERGEFORMAT </w:instrText>
+              <w:instrText xml:space="preserve"> MERGEFIELD  ATTACHED_DOCUMENTATION  \* MERGEFORMAT </w:instrText>
             </w:r>
             <w:r>
               <w:rPr>
@@ -3036,31 +3029,7 @@
                 <w:u w:val="single"/>
                 <w:lang w:val="en-US" w:eastAsia="en-US"/>
               </w:rPr>
-              <w:t>«</w:t>
-            </w:r>
-            <w:r>
-              <w:rPr>
-                <w:rFonts w:eastAsia="Calibri"/>
-                <w:bCs/>
-                <w:noProof/>
-                <w:sz w:val="22"/>
-                <w:szCs w:val="22"/>
-                <w:u w:val="single"/>
-                <w:lang w:val="en-US" w:eastAsia="en-US"/>
-              </w:rPr>
-              <w:t>ATTACHED_DOCUMENTATION</w:t>
-            </w:r>
-            <w:r>
-              <w:rPr>
-                <w:rFonts w:eastAsia="Calibri"/>
-                <w:bCs/>
-                <w:noProof/>
-                <w:sz w:val="22"/>
-                <w:szCs w:val="22"/>
-                <w:u w:val="single"/>
-                <w:lang w:val="en-US" w:eastAsia="en-US"/>
-              </w:rPr>
-              <w:t>»</w:t>
+              <w:t>«ATTACHED_DOCUMENTATION»</w:t>
             </w:r>
             <w:r>
               <w:rPr>
@@ -3505,7 +3474,27 @@
                 <w:szCs w:val="18"/>
                 <w:lang w:val="ru-RU" w:eastAsia="en-US"/>
               </w:rPr>
-              <w:t>(підпис)</w:t>
+              <w:t>(</w:t>
+            </w:r>
+            <w:proofErr w:type="spellStart"/>
+            <w:r>
+              <w:rPr>
+                <w:rFonts w:eastAsia="Calibri"/>
+                <w:sz w:val="18"/>
+                <w:szCs w:val="18"/>
+                <w:lang w:val="ru-RU" w:eastAsia="en-US"/>
+              </w:rPr>
+              <w:t>підпис</w:t>
+            </w:r>
+            <w:proofErr w:type="spellEnd"/>
+            <w:r>
+              <w:rPr>
+                <w:rFonts w:eastAsia="Calibri"/>
+                <w:sz w:val="18"/>
+                <w:szCs w:val="18"/>
+                <w:lang w:val="ru-RU" w:eastAsia="en-US"/>
+              </w:rPr>
+              <w:t>)</w:t>
             </w:r>
           </w:p>
         </w:tc>
@@ -3539,7 +3528,47 @@
                 <w:szCs w:val="18"/>
                 <w:lang w:val="ru-RU" w:eastAsia="en-US"/>
               </w:rPr>
-              <w:t>(ініціали та прізвище)</w:t>
+              <w:t>(</w:t>
+            </w:r>
+            <w:proofErr w:type="spellStart"/>
+            <w:r>
+              <w:rPr>
+                <w:rFonts w:eastAsia="Calibri"/>
+                <w:sz w:val="18"/>
+                <w:szCs w:val="18"/>
+                <w:lang w:val="ru-RU" w:eastAsia="en-US"/>
+              </w:rPr>
+              <w:t>ініціали</w:t>
+            </w:r>
+            <w:proofErr w:type="spellEnd"/>
+            <w:r>
+              <w:rPr>
+                <w:rFonts w:eastAsia="Calibri"/>
+                <w:sz w:val="18"/>
+                <w:szCs w:val="18"/>
+                <w:lang w:val="ru-RU" w:eastAsia="en-US"/>
+              </w:rPr>
+              <w:t xml:space="preserve"> та </w:t>
+            </w:r>
+            <w:proofErr w:type="spellStart"/>
+            <w:r>
+              <w:rPr>
+                <w:rFonts w:eastAsia="Calibri"/>
+                <w:sz w:val="18"/>
+                <w:szCs w:val="18"/>
+                <w:lang w:val="ru-RU" w:eastAsia="en-US"/>
+              </w:rPr>
+              <w:t>прізвище</w:t>
+            </w:r>
+            <w:proofErr w:type="spellEnd"/>
+            <w:r>
+              <w:rPr>
+                <w:rFonts w:eastAsia="Calibri"/>
+                <w:sz w:val="18"/>
+                <w:szCs w:val="18"/>
+                <w:lang w:val="ru-RU" w:eastAsia="en-US"/>
+              </w:rPr>
+              <w:t>)</w:t>
             </w:r>
           </w:p>
         </w:tc>
@@ -3983,7 +4012,47 @@
                 <w:szCs w:val="18"/>
                 <w:lang w:val="ru-RU" w:eastAsia="en-US"/>
               </w:rPr>
-              <w:t>(ініціали та прізвище)</w:t>
+              <w:t>(</w:t>
+            </w:r>
+            <w:proofErr w:type="spellStart"/>
+            <w:r>
+              <w:rPr>
+                <w:rFonts w:eastAsia="Calibri"/>
+                <w:sz w:val="18"/>
+                <w:szCs w:val="18"/>
+                <w:lang w:val="ru-RU" w:eastAsia="en-US"/>
+              </w:rPr>
+              <w:t>ініціали</w:t>
+            </w:r>
+            <w:proofErr w:type="spellEnd"/>
+            <w:r>
+              <w:rPr>
+                <w:rFonts w:eastAsia="Calibri"/>
+                <w:sz w:val="18"/>
+                <w:szCs w:val="18"/>
+                <w:lang w:val="ru-RU" w:eastAsia="en-US"/>
+              </w:rPr>
+              <w:t xml:space="preserve"> та </w:t>
+            </w:r>
+            <w:proofErr w:type="spellStart"/>
+            <w:r>
+              <w:rPr>
+                <w:rFonts w:eastAsia="Calibri"/>
+                <w:sz w:val="18"/>
+                <w:szCs w:val="18"/>
+                <w:lang w:val="ru-RU" w:eastAsia="en-US"/>
+              </w:rPr>
+              <w:t>прізвище</w:t>
+            </w:r>
+            <w:proofErr w:type="spellEnd"/>
+            <w:r>
+              <w:rPr>
+                <w:rFonts w:eastAsia="Calibri"/>
+                <w:sz w:val="18"/>
+                <w:szCs w:val="18"/>
+                <w:lang w:val="ru-RU" w:eastAsia="en-US"/>
+              </w:rPr>
+              <w:t>)</w:t>
             </w:r>
           </w:p>
         </w:tc>
@@ -4382,7 +4451,27 @@
                 <w:szCs w:val="18"/>
                 <w:lang w:val="ru-RU" w:eastAsia="en-US"/>
               </w:rPr>
-              <w:t>(підпис)</w:t>
+              <w:t>(</w:t>
+            </w:r>
+            <w:proofErr w:type="spellStart"/>
+            <w:r>
+              <w:rPr>
+                <w:rFonts w:eastAsia="Calibri"/>
+                <w:sz w:val="18"/>
+                <w:szCs w:val="18"/>
+                <w:lang w:val="ru-RU" w:eastAsia="en-US"/>
+              </w:rPr>
+              <w:t>підпис</w:t>
+            </w:r>
+            <w:proofErr w:type="spellEnd"/>
+            <w:r>
+              <w:rPr>
+                <w:rFonts w:eastAsia="Calibri"/>
+                <w:sz w:val="18"/>
+                <w:szCs w:val="18"/>
+                <w:lang w:val="ru-RU" w:eastAsia="en-US"/>
+              </w:rPr>
+              <w:t>)</w:t>
             </w:r>
           </w:p>
         </w:tc>
@@ -4416,7 +4505,47 @@
                 <w:szCs w:val="18"/>
                 <w:lang w:val="ru-RU" w:eastAsia="en-US"/>
               </w:rPr>
-              <w:t>(ініціали та прізвище)</w:t>
+              <w:t>(</w:t>
+            </w:r>
+            <w:proofErr w:type="spellStart"/>
+            <w:r>
+              <w:rPr>
+                <w:rFonts w:eastAsia="Calibri"/>
+                <w:sz w:val="18"/>
+                <w:szCs w:val="18"/>
+                <w:lang w:val="ru-RU" w:eastAsia="en-US"/>
+              </w:rPr>
+              <w:t>ініціали</w:t>
+            </w:r>
+            <w:proofErr w:type="spellEnd"/>
+            <w:r>
+              <w:rPr>
+                <w:rFonts w:eastAsia="Calibri"/>
+                <w:sz w:val="18"/>
+                <w:szCs w:val="18"/>
+                <w:lang w:val="ru-RU" w:eastAsia="en-US"/>
+              </w:rPr>
+              <w:t xml:space="preserve"> та </w:t>
+            </w:r>
+            <w:proofErr w:type="spellStart"/>
+            <w:r>
+              <w:rPr>
+                <w:rFonts w:eastAsia="Calibri"/>
+                <w:sz w:val="18"/>
+                <w:szCs w:val="18"/>
+                <w:lang w:val="ru-RU" w:eastAsia="en-US"/>
+              </w:rPr>
+              <w:t>прізвище</w:t>
+            </w:r>
+            <w:proofErr w:type="spellEnd"/>
+            <w:r>
+              <w:rPr>
+                <w:rFonts w:eastAsia="Calibri"/>
+                <w:sz w:val="18"/>
+                <w:szCs w:val="18"/>
+                <w:lang w:val="ru-RU" w:eastAsia="en-US"/>
+              </w:rPr>
+              <w:t>)</w:t>
             </w:r>
           </w:p>
         </w:tc>
@@ -4953,9 +5082,9 @@
                 <w:rFonts w:eastAsia="Calibri"/>
                 <w:sz w:val="22"/>
                 <w:szCs w:val="22"/>
-                <w:lang w:eastAsia="en-US"/>
-              </w:rPr>
-              <w:instrText xml:space="preserve"> MERGEFIELD  COMMISION_HEAD_POSITION  \* MERGEFORMAT </w:instrText>
+                <w:lang w:val="ru-RU" w:eastAsia="en-US"/>
+              </w:rPr>
+              <w:instrText xml:space="preserve"> MERGEFIELD  ACCEPTED_PERSON_POSITION  \* MERGEFORMAT </w:instrText>
             </w:r>
             <w:r>
               <w:rPr>
@@ -4972,29 +5101,9 @@
                 <w:noProof/>
                 <w:sz w:val="22"/>
                 <w:szCs w:val="22"/>
-                <w:lang w:eastAsia="en-US"/>
-              </w:rPr>
-              <w:t>«</w:t>
-            </w:r>
-            <w:r>
-              <w:rPr>
-                <w:rFonts w:eastAsia="Calibri"/>
-                <w:noProof/>
-                <w:sz w:val="22"/>
-                <w:szCs w:val="22"/>
-                <w:lang w:val="en-US" w:eastAsia="en-US"/>
-              </w:rPr>
-              <w:t>ACCEPTED_PERSON</w:t>
-            </w:r>
-            <w:r>
-              <w:rPr>
-                <w:rFonts w:eastAsia="Calibri"/>
-                <w:noProof/>
-                <w:sz w:val="22"/>
-                <w:szCs w:val="22"/>
-                <w:lang w:eastAsia="en-US"/>
-              </w:rPr>
-              <w:t>_POSITION»</w:t>
+                <w:lang w:val="ru-RU" w:eastAsia="en-US"/>
+              </w:rPr>
+              <w:t>«ACCEPTED_PERSON_POSITION»</w:t>
             </w:r>
             <w:r>
               <w:rPr>
@@ -5044,9 +5153,9 @@
                 <w:rFonts w:eastAsia="Calibri"/>
                 <w:sz w:val="22"/>
                 <w:szCs w:val="22"/>
-                <w:lang w:eastAsia="en-US"/>
-              </w:rPr>
-              <w:instrText xml:space="preserve"> MERGEFIELD  COMMISION_HEAD_NAME  \* MERGEFORMAT </w:instrText>
+                <w:lang w:val="ru-RU" w:eastAsia="en-US"/>
+              </w:rPr>
+              <w:instrText xml:space="preserve"> MERGEFIELD  ACCEPTED_PERSON_NAME  \* MERGEFORMAT </w:instrText>
             </w:r>
             <w:r>
               <w:rPr>
@@ -5063,39 +5172,9 @@
                 <w:noProof/>
                 <w:sz w:val="22"/>
                 <w:szCs w:val="22"/>
-                <w:lang w:eastAsia="en-US"/>
-              </w:rPr>
-              <w:t>«</w:t>
-            </w:r>
-            <w:r>
-              <w:rPr>
-                <w:rFonts w:eastAsia="Calibri"/>
-                <w:noProof/>
-                <w:sz w:val="22"/>
-                <w:szCs w:val="22"/>
-                <w:lang w:val="en-US" w:eastAsia="en-US"/>
-              </w:rPr>
-              <w:t>ACCEPTED_PERSON</w:t>
-            </w:r>
-            <w:r>
-              <w:rPr>
-                <w:rFonts w:eastAsia="Calibri"/>
-                <w:noProof/>
-                <w:sz w:val="22"/>
-                <w:szCs w:val="22"/>
-                <w:lang w:eastAsia="en-US"/>
-              </w:rPr>
-              <w:t>_</w:t>
-            </w:r>
-            <w:r>
-              <w:rPr>
-                <w:rFonts w:eastAsia="Calibri"/>
-                <w:noProof/>
-                <w:sz w:val="22"/>
-                <w:szCs w:val="22"/>
-                <w:lang w:eastAsia="en-US"/>
-              </w:rPr>
-              <w:t>NAME»</w:t>
+                <w:lang w:val="ru-RU" w:eastAsia="en-US"/>
+              </w:rPr>
+              <w:t>«ACCEPTED_PERSON_NAME»</w:t>
             </w:r>
             <w:r>
               <w:rPr>
@@ -5166,9 +5245,9 @@
                 <w:rFonts w:eastAsia="Calibri"/>
                 <w:sz w:val="22"/>
                 <w:szCs w:val="22"/>
-                <w:lang w:eastAsia="en-US"/>
-              </w:rPr>
-              <w:instrText xml:space="preserve"> MERGEFIELD  COMMISION_HEAD_RANK  \* MERGEFORMAT </w:instrText>
+                <w:lang w:val="ru-RU" w:eastAsia="en-US"/>
+              </w:rPr>
+              <w:instrText xml:space="preserve"> MERGEFIELD  ACCEPTED_PERSON_RANK  \* MERGEFORMAT </w:instrText>
             </w:r>
             <w:r>
               <w:rPr>
@@ -5185,39 +5264,9 @@
                 <w:noProof/>
                 <w:sz w:val="22"/>
                 <w:szCs w:val="22"/>
-                <w:lang w:eastAsia="en-US"/>
-              </w:rPr>
-              <w:t>«</w:t>
-            </w:r>
-            <w:r>
-              <w:rPr>
-                <w:rFonts w:eastAsia="Calibri"/>
-                <w:noProof/>
-                <w:sz w:val="22"/>
-                <w:szCs w:val="22"/>
-                <w:lang w:val="en-US" w:eastAsia="en-US"/>
-              </w:rPr>
-              <w:t>ACCEPTED_PERSON</w:t>
-            </w:r>
-            <w:r>
-              <w:rPr>
-                <w:rFonts w:eastAsia="Calibri"/>
-                <w:noProof/>
-                <w:sz w:val="22"/>
-                <w:szCs w:val="22"/>
-                <w:lang w:eastAsia="en-US"/>
-              </w:rPr>
-              <w:t>_</w:t>
-            </w:r>
-            <w:r>
-              <w:rPr>
-                <w:rFonts w:eastAsia="Calibri"/>
-                <w:noProof/>
-                <w:sz w:val="22"/>
-                <w:szCs w:val="22"/>
-                <w:lang w:eastAsia="en-US"/>
-              </w:rPr>
-              <w:t>RANK»</w:t>
+                <w:lang w:val="ru-RU" w:eastAsia="en-US"/>
+              </w:rPr>
+              <w:t>«ACCEPTED_PERSON_RANK»</w:t>
             </w:r>
             <w:r>
               <w:rPr>
@@ -5365,7 +5414,27 @@
                 <w:szCs w:val="18"/>
                 <w:lang w:val="ru-RU" w:eastAsia="en-US"/>
               </w:rPr>
-              <w:t>(підпис)</w:t>
+              <w:t>(</w:t>
+            </w:r>
+            <w:proofErr w:type="spellStart"/>
+            <w:r>
+              <w:rPr>
+                <w:rFonts w:eastAsia="Calibri"/>
+                <w:sz w:val="18"/>
+                <w:szCs w:val="18"/>
+                <w:lang w:val="ru-RU" w:eastAsia="en-US"/>
+              </w:rPr>
+              <w:t>підпис</w:t>
+            </w:r>
+            <w:proofErr w:type="spellEnd"/>
+            <w:r>
+              <w:rPr>
+                <w:rFonts w:eastAsia="Calibri"/>
+                <w:sz w:val="18"/>
+                <w:szCs w:val="18"/>
+                <w:lang w:val="ru-RU" w:eastAsia="en-US"/>
+              </w:rPr>
+              <w:t>)</w:t>
             </w:r>
           </w:p>
         </w:tc>
@@ -5398,7 +5467,47 @@
                 <w:szCs w:val="18"/>
                 <w:lang w:val="ru-RU" w:eastAsia="en-US"/>
               </w:rPr>
-              <w:t>(ініціали та прізвище)</w:t>
+              <w:t>(</w:t>
+            </w:r>
+            <w:proofErr w:type="spellStart"/>
+            <w:r>
+              <w:rPr>
+                <w:rFonts w:eastAsia="Calibri"/>
+                <w:sz w:val="18"/>
+                <w:szCs w:val="18"/>
+                <w:lang w:val="ru-RU" w:eastAsia="en-US"/>
+              </w:rPr>
+              <w:t>ініціали</w:t>
+            </w:r>
+            <w:proofErr w:type="spellEnd"/>
+            <w:r>
+              <w:rPr>
+                <w:rFonts w:eastAsia="Calibri"/>
+                <w:sz w:val="18"/>
+                <w:szCs w:val="18"/>
+                <w:lang w:val="ru-RU" w:eastAsia="en-US"/>
+              </w:rPr>
+              <w:t xml:space="preserve"> та </w:t>
+            </w:r>
+            <w:proofErr w:type="spellStart"/>
+            <w:r>
+              <w:rPr>
+                <w:rFonts w:eastAsia="Calibri"/>
+                <w:sz w:val="18"/>
+                <w:szCs w:val="18"/>
+                <w:lang w:val="ru-RU" w:eastAsia="en-US"/>
+              </w:rPr>
+              <w:t>прізвище</w:t>
+            </w:r>
+            <w:proofErr w:type="spellEnd"/>
+            <w:r>
+              <w:rPr>
+                <w:rFonts w:eastAsia="Calibri"/>
+                <w:sz w:val="18"/>
+                <w:szCs w:val="18"/>
+                <w:lang w:val="ru-RU" w:eastAsia="en-US"/>
+              </w:rPr>
+              <w:t>)</w:t>
             </w:r>
           </w:p>
         </w:tc>
@@ -5487,9 +5596,9 @@
                 <w:rFonts w:eastAsia="Calibri"/>
                 <w:sz w:val="22"/>
                 <w:szCs w:val="22"/>
-                <w:lang w:eastAsia="en-US"/>
-              </w:rPr>
-              <w:instrText xml:space="preserve"> MERGEFIELD  COMMISION_HEAD_POSITION  \* MERGEFORMAT </w:instrText>
+                <w:lang w:val="ru-RU" w:eastAsia="en-US"/>
+              </w:rPr>
+              <w:instrText xml:space="preserve"> MERGEFIELD  HANDED_PERSON_POSITION  \* MERGEFORMAT </w:instrText>
             </w:r>
             <w:r>
               <w:rPr>
@@ -5506,29 +5615,9 @@
                 <w:noProof/>
                 <w:sz w:val="22"/>
                 <w:szCs w:val="22"/>
-                <w:lang w:eastAsia="en-US"/>
-              </w:rPr>
-              <w:t>«</w:t>
-            </w:r>
-            <w:r>
-              <w:rPr>
-                <w:rFonts w:eastAsia="Calibri"/>
-                <w:noProof/>
-                <w:sz w:val="22"/>
-                <w:szCs w:val="22"/>
-                <w:lang w:val="en-US" w:eastAsia="en-US"/>
-              </w:rPr>
-              <w:t>HANDED_PERSON</w:t>
-            </w:r>
-            <w:r>
-              <w:rPr>
-                <w:rFonts w:eastAsia="Calibri"/>
-                <w:noProof/>
-                <w:sz w:val="22"/>
-                <w:szCs w:val="22"/>
-                <w:lang w:eastAsia="en-US"/>
-              </w:rPr>
-              <w:t>_POSITION»</w:t>
+                <w:lang w:val="ru-RU" w:eastAsia="en-US"/>
+              </w:rPr>
+              <w:t>«HANDED_PERSON_POSITION»</w:t>
             </w:r>
             <w:r>
               <w:rPr>
@@ -5578,9 +5667,9 @@
                 <w:rFonts w:eastAsia="Calibri"/>
                 <w:sz w:val="22"/>
                 <w:szCs w:val="22"/>
-                <w:lang w:eastAsia="en-US"/>
-              </w:rPr>
-              <w:instrText xml:space="preserve"> MERGEFIELD  COMMISION_HEAD_NAME  \* MERGEFORMAT </w:instrText>
+                <w:lang w:val="ru-RU" w:eastAsia="en-US"/>
+              </w:rPr>
+              <w:instrText xml:space="preserve"> MERGEFIELD  HANDED_PERSON_NAME  \* MERGEFORMAT </w:instrText>
             </w:r>
             <w:r>
               <w:rPr>
@@ -5597,29 +5686,9 @@
                 <w:noProof/>
                 <w:sz w:val="22"/>
                 <w:szCs w:val="22"/>
-                <w:lang w:eastAsia="en-US"/>
-              </w:rPr>
-              <w:t>«</w:t>
-            </w:r>
-            <w:r>
-              <w:rPr>
-                <w:rFonts w:eastAsia="Calibri"/>
-                <w:noProof/>
-                <w:sz w:val="22"/>
-                <w:szCs w:val="22"/>
-                <w:lang w:val="en-US" w:eastAsia="en-US"/>
-              </w:rPr>
-              <w:t>HANDED_PERSON</w:t>
-            </w:r>
-            <w:r>
-              <w:rPr>
-                <w:rFonts w:eastAsia="Calibri"/>
-                <w:noProof/>
-                <w:sz w:val="22"/>
-                <w:szCs w:val="22"/>
-                <w:lang w:eastAsia="en-US"/>
-              </w:rPr>
-              <w:t>_NAME»</w:t>
+                <w:lang w:val="ru-RU" w:eastAsia="en-US"/>
+              </w:rPr>
+              <w:t>«HANDED_PERSON_NAME»</w:t>
             </w:r>
             <w:r>
               <w:rPr>
@@ -5690,9 +5759,9 @@
                 <w:rFonts w:eastAsia="Calibri"/>
                 <w:sz w:val="22"/>
                 <w:szCs w:val="22"/>
-                <w:lang w:eastAsia="en-US"/>
-              </w:rPr>
-              <w:instrText xml:space="preserve"> MERGEFIELD  COMMISION_HEAD_RANK  \* MERGEFORMAT </w:instrText>
+                <w:lang w:val="ru-RU" w:eastAsia="en-US"/>
+              </w:rPr>
+              <w:instrText xml:space="preserve"> MERGEFIELD  HANDED_PERSON_RANK  \* MERGEFORMAT </w:instrText>
             </w:r>
             <w:r>
               <w:rPr>
@@ -5709,29 +5778,9 @@
                 <w:noProof/>
                 <w:sz w:val="22"/>
                 <w:szCs w:val="22"/>
-                <w:lang w:eastAsia="en-US"/>
-              </w:rPr>
-              <w:t>«</w:t>
-            </w:r>
-            <w:r>
-              <w:rPr>
-                <w:rFonts w:eastAsia="Calibri"/>
-                <w:noProof/>
-                <w:sz w:val="22"/>
-                <w:szCs w:val="22"/>
-                <w:lang w:val="en-US" w:eastAsia="en-US"/>
-              </w:rPr>
-              <w:t>HANDED_PERSON</w:t>
-            </w:r>
-            <w:r>
-              <w:rPr>
-                <w:rFonts w:eastAsia="Calibri"/>
-                <w:noProof/>
-                <w:sz w:val="22"/>
-                <w:szCs w:val="22"/>
-                <w:lang w:eastAsia="en-US"/>
-              </w:rPr>
-              <w:t>_RANK»</w:t>
+                <w:lang w:val="ru-RU" w:eastAsia="en-US"/>
+              </w:rPr>
+              <w:t>«HANDED_PERSON_RANK»</w:t>
             </w:r>
             <w:r>
               <w:rPr>
@@ -5879,7 +5928,27 @@
                 <w:szCs w:val="18"/>
                 <w:lang w:val="ru-RU" w:eastAsia="en-US"/>
               </w:rPr>
-              <w:t>(підпис)</w:t>
+              <w:t>(</w:t>
+            </w:r>
+            <w:proofErr w:type="spellStart"/>
+            <w:r>
+              <w:rPr>
+                <w:rFonts w:eastAsia="Calibri"/>
+                <w:sz w:val="18"/>
+                <w:szCs w:val="18"/>
+                <w:lang w:val="ru-RU" w:eastAsia="en-US"/>
+              </w:rPr>
+              <w:t>підпис</w:t>
+            </w:r>
+            <w:proofErr w:type="spellEnd"/>
+            <w:r>
+              <w:rPr>
+                <w:rFonts w:eastAsia="Calibri"/>
+                <w:sz w:val="18"/>
+                <w:szCs w:val="18"/>
+                <w:lang w:val="ru-RU" w:eastAsia="en-US"/>
+              </w:rPr>
+              <w:t>)</w:t>
             </w:r>
           </w:p>
         </w:tc>
@@ -5912,7 +5981,47 @@
                 <w:szCs w:val="18"/>
                 <w:lang w:val="ru-RU" w:eastAsia="en-US"/>
               </w:rPr>
-              <w:t>(ініціали та прізвище)</w:t>
+              <w:t>(</w:t>
+            </w:r>
+            <w:proofErr w:type="spellStart"/>
+            <w:r>
+              <w:rPr>
+                <w:rFonts w:eastAsia="Calibri"/>
+                <w:sz w:val="18"/>
+                <w:szCs w:val="18"/>
+                <w:lang w:val="ru-RU" w:eastAsia="en-US"/>
+              </w:rPr>
+              <w:t>ініціали</w:t>
+            </w:r>
+            <w:proofErr w:type="spellEnd"/>
+            <w:r>
+              <w:rPr>
+                <w:rFonts w:eastAsia="Calibri"/>
+                <w:sz w:val="18"/>
+                <w:szCs w:val="18"/>
+                <w:lang w:val="ru-RU" w:eastAsia="en-US"/>
+              </w:rPr>
+              <w:t xml:space="preserve"> та </w:t>
+            </w:r>
+            <w:proofErr w:type="spellStart"/>
+            <w:r>
+              <w:rPr>
+                <w:rFonts w:eastAsia="Calibri"/>
+                <w:sz w:val="18"/>
+                <w:szCs w:val="18"/>
+                <w:lang w:val="ru-RU" w:eastAsia="en-US"/>
+              </w:rPr>
+              <w:t>прізвище</w:t>
+            </w:r>
+            <w:proofErr w:type="spellEnd"/>
+            <w:r>
+              <w:rPr>
+                <w:rFonts w:eastAsia="Calibri"/>
+                <w:sz w:val="18"/>
+                <w:szCs w:val="18"/>
+                <w:lang w:val="ru-RU" w:eastAsia="en-US"/>
+              </w:rPr>
+              <w:t>)</w:t>
             </w:r>
           </w:p>
         </w:tc>
@@ -6368,6 +6477,726 @@
           </w:p>
         </w:tc>
       </w:tr>
+      <w:tr>
+        <w:tc>
+          <w:tcPr>
+            <w:tcW w:w="2553" w:type="dxa"/>
+            <w:tcBorders>
+              <w:top w:val="single" w:sz="4" w:space="0" w:color="auto"/>
+              <w:left w:val="single" w:sz="4" w:space="0" w:color="auto"/>
+              <w:bottom w:val="single" w:sz="4" w:space="0" w:color="auto"/>
+              <w:right w:val="single" w:sz="4" w:space="0" w:color="auto"/>
+            </w:tcBorders>
+          </w:tcPr>
+          <w:p>
+            <w:pPr>
+              <w:keepNext/>
+              <w:keepLines/>
+              <w:jc w:val="both"/>
+              <w:rPr>
+                <w:sz w:val="22"/>
+                <w:szCs w:val="22"/>
+              </w:rPr>
+            </w:pPr>
+          </w:p>
+        </w:tc>
+        <w:tc>
+          <w:tcPr>
+            <w:tcW w:w="2835" w:type="dxa"/>
+            <w:tcBorders>
+              <w:top w:val="single" w:sz="4" w:space="0" w:color="auto"/>
+              <w:left w:val="single" w:sz="4" w:space="0" w:color="auto"/>
+              <w:bottom w:val="single" w:sz="4" w:space="0" w:color="auto"/>
+              <w:right w:val="single" w:sz="4" w:space="0" w:color="auto"/>
+            </w:tcBorders>
+          </w:tcPr>
+          <w:p>
+            <w:pPr>
+              <w:keepNext/>
+              <w:keepLines/>
+              <w:jc w:val="both"/>
+              <w:rPr>
+                <w:sz w:val="22"/>
+                <w:szCs w:val="22"/>
+              </w:rPr>
+            </w:pPr>
+          </w:p>
+        </w:tc>
+        <w:tc>
+          <w:tcPr>
+            <w:tcW w:w="2693" w:type="dxa"/>
+            <w:tcBorders>
+              <w:top w:val="single" w:sz="4" w:space="0" w:color="auto"/>
+              <w:left w:val="single" w:sz="4" w:space="0" w:color="auto"/>
+              <w:bottom w:val="single" w:sz="4" w:space="0" w:color="auto"/>
+              <w:right w:val="single" w:sz="4" w:space="0" w:color="auto"/>
+            </w:tcBorders>
+          </w:tcPr>
+          <w:p>
+            <w:pPr>
+              <w:keepNext/>
+              <w:keepLines/>
+              <w:jc w:val="both"/>
+              <w:rPr>
+                <w:sz w:val="22"/>
+                <w:szCs w:val="22"/>
+              </w:rPr>
+            </w:pPr>
+          </w:p>
+        </w:tc>
+        <w:tc>
+          <w:tcPr>
+            <w:tcW w:w="1276" w:type="dxa"/>
+            <w:tcBorders>
+              <w:top w:val="single" w:sz="4" w:space="0" w:color="auto"/>
+              <w:left w:val="single" w:sz="4" w:space="0" w:color="auto"/>
+              <w:bottom w:val="single" w:sz="4" w:space="0" w:color="auto"/>
+              <w:right w:val="single" w:sz="4" w:space="0" w:color="auto"/>
+            </w:tcBorders>
+          </w:tcPr>
+          <w:p>
+            <w:pPr>
+              <w:keepNext/>
+              <w:keepLines/>
+              <w:jc w:val="both"/>
+              <w:rPr>
+                <w:sz w:val="22"/>
+                <w:szCs w:val="22"/>
+              </w:rPr>
+            </w:pPr>
+          </w:p>
+        </w:tc>
+      </w:tr>
+      <w:tr>
+        <w:tc>
+          <w:tcPr>
+            <w:tcW w:w="2553" w:type="dxa"/>
+            <w:tcBorders>
+              <w:top w:val="single" w:sz="4" w:space="0" w:color="auto"/>
+              <w:left w:val="single" w:sz="4" w:space="0" w:color="auto"/>
+              <w:bottom w:val="single" w:sz="4" w:space="0" w:color="auto"/>
+              <w:right w:val="single" w:sz="4" w:space="0" w:color="auto"/>
+            </w:tcBorders>
+          </w:tcPr>
+          <w:p>
+            <w:pPr>
+              <w:keepNext/>
+              <w:keepLines/>
+              <w:jc w:val="both"/>
+              <w:rPr>
+                <w:sz w:val="22"/>
+                <w:szCs w:val="22"/>
+              </w:rPr>
+            </w:pPr>
+          </w:p>
+        </w:tc>
+        <w:tc>
+          <w:tcPr>
+            <w:tcW w:w="2835" w:type="dxa"/>
+            <w:tcBorders>
+              <w:top w:val="single" w:sz="4" w:space="0" w:color="auto"/>
+              <w:left w:val="single" w:sz="4" w:space="0" w:color="auto"/>
+              <w:bottom w:val="single" w:sz="4" w:space="0" w:color="auto"/>
+              <w:right w:val="single" w:sz="4" w:space="0" w:color="auto"/>
+            </w:tcBorders>
+          </w:tcPr>
+          <w:p>
+            <w:pPr>
+              <w:keepNext/>
+              <w:keepLines/>
+              <w:jc w:val="both"/>
+              <w:rPr>
+                <w:sz w:val="22"/>
+                <w:szCs w:val="22"/>
+              </w:rPr>
+            </w:pPr>
+          </w:p>
+        </w:tc>
+        <w:tc>
+          <w:tcPr>
+            <w:tcW w:w="2693" w:type="dxa"/>
+            <w:tcBorders>
+              <w:top w:val="single" w:sz="4" w:space="0" w:color="auto"/>
+              <w:left w:val="single" w:sz="4" w:space="0" w:color="auto"/>
+              <w:bottom w:val="single" w:sz="4" w:space="0" w:color="auto"/>
+              <w:right w:val="single" w:sz="4" w:space="0" w:color="auto"/>
+            </w:tcBorders>
+          </w:tcPr>
+          <w:p>
+            <w:pPr>
+              <w:keepNext/>
+              <w:keepLines/>
+              <w:jc w:val="both"/>
+              <w:rPr>
+                <w:sz w:val="22"/>
+                <w:szCs w:val="22"/>
+              </w:rPr>
+            </w:pPr>
+          </w:p>
+        </w:tc>
+        <w:tc>
+          <w:tcPr>
+            <w:tcW w:w="1276" w:type="dxa"/>
+            <w:tcBorders>
+              <w:top w:val="single" w:sz="4" w:space="0" w:color="auto"/>
+              <w:left w:val="single" w:sz="4" w:space="0" w:color="auto"/>
+              <w:bottom w:val="single" w:sz="4" w:space="0" w:color="auto"/>
+              <w:right w:val="single" w:sz="4" w:space="0" w:color="auto"/>
+            </w:tcBorders>
+          </w:tcPr>
+          <w:p>
+            <w:pPr>
+              <w:keepNext/>
+              <w:keepLines/>
+              <w:jc w:val="both"/>
+              <w:rPr>
+                <w:sz w:val="22"/>
+                <w:szCs w:val="22"/>
+              </w:rPr>
+            </w:pPr>
+          </w:p>
+        </w:tc>
+      </w:tr>
+      <w:tr>
+        <w:tc>
+          <w:tcPr>
+            <w:tcW w:w="2553" w:type="dxa"/>
+            <w:tcBorders>
+              <w:top w:val="single" w:sz="4" w:space="0" w:color="auto"/>
+              <w:left w:val="single" w:sz="4" w:space="0" w:color="auto"/>
+              <w:bottom w:val="single" w:sz="4" w:space="0" w:color="auto"/>
+              <w:right w:val="single" w:sz="4" w:space="0" w:color="auto"/>
+            </w:tcBorders>
+          </w:tcPr>
+          <w:p>
+            <w:pPr>
+              <w:keepNext/>
+              <w:keepLines/>
+              <w:jc w:val="both"/>
+              <w:rPr>
+                <w:sz w:val="22"/>
+                <w:szCs w:val="22"/>
+              </w:rPr>
+            </w:pPr>
+          </w:p>
+        </w:tc>
+        <w:tc>
+          <w:tcPr>
+            <w:tcW w:w="2835" w:type="dxa"/>
+            <w:tcBorders>
+              <w:top w:val="single" w:sz="4" w:space="0" w:color="auto"/>
+              <w:left w:val="single" w:sz="4" w:space="0" w:color="auto"/>
+              <w:bottom w:val="single" w:sz="4" w:space="0" w:color="auto"/>
+              <w:right w:val="single" w:sz="4" w:space="0" w:color="auto"/>
+            </w:tcBorders>
+          </w:tcPr>
+          <w:p>
+            <w:pPr>
+              <w:keepNext/>
+              <w:keepLines/>
+              <w:jc w:val="both"/>
+              <w:rPr>
+                <w:sz w:val="22"/>
+                <w:szCs w:val="22"/>
+              </w:rPr>
+            </w:pPr>
+          </w:p>
+        </w:tc>
+        <w:tc>
+          <w:tcPr>
+            <w:tcW w:w="2693" w:type="dxa"/>
+            <w:tcBorders>
+              <w:top w:val="single" w:sz="4" w:space="0" w:color="auto"/>
+              <w:left w:val="single" w:sz="4" w:space="0" w:color="auto"/>
+              <w:bottom w:val="single" w:sz="4" w:space="0" w:color="auto"/>
+              <w:right w:val="single" w:sz="4" w:space="0" w:color="auto"/>
+            </w:tcBorders>
+          </w:tcPr>
+          <w:p>
+            <w:pPr>
+              <w:keepNext/>
+              <w:keepLines/>
+              <w:jc w:val="both"/>
+              <w:rPr>
+                <w:sz w:val="22"/>
+                <w:szCs w:val="22"/>
+              </w:rPr>
+            </w:pPr>
+          </w:p>
+        </w:tc>
+        <w:tc>
+          <w:tcPr>
+            <w:tcW w:w="1276" w:type="dxa"/>
+            <w:tcBorders>
+              <w:top w:val="single" w:sz="4" w:space="0" w:color="auto"/>
+              <w:left w:val="single" w:sz="4" w:space="0" w:color="auto"/>
+              <w:bottom w:val="single" w:sz="4" w:space="0" w:color="auto"/>
+              <w:right w:val="single" w:sz="4" w:space="0" w:color="auto"/>
+            </w:tcBorders>
+          </w:tcPr>
+          <w:p>
+            <w:pPr>
+              <w:keepNext/>
+              <w:keepLines/>
+              <w:jc w:val="both"/>
+              <w:rPr>
+                <w:sz w:val="22"/>
+                <w:szCs w:val="22"/>
+              </w:rPr>
+            </w:pPr>
+          </w:p>
+        </w:tc>
+      </w:tr>
+      <w:tr>
+        <w:tc>
+          <w:tcPr>
+            <w:tcW w:w="2553" w:type="dxa"/>
+            <w:tcBorders>
+              <w:top w:val="single" w:sz="4" w:space="0" w:color="auto"/>
+              <w:left w:val="single" w:sz="4" w:space="0" w:color="auto"/>
+              <w:bottom w:val="single" w:sz="4" w:space="0" w:color="auto"/>
+              <w:right w:val="single" w:sz="4" w:space="0" w:color="auto"/>
+            </w:tcBorders>
+          </w:tcPr>
+          <w:p>
+            <w:pPr>
+              <w:keepNext/>
+              <w:keepLines/>
+              <w:jc w:val="both"/>
+              <w:rPr>
+                <w:sz w:val="22"/>
+                <w:szCs w:val="22"/>
+              </w:rPr>
+            </w:pPr>
+          </w:p>
+        </w:tc>
+        <w:tc>
+          <w:tcPr>
+            <w:tcW w:w="2835" w:type="dxa"/>
+            <w:tcBorders>
+              <w:top w:val="single" w:sz="4" w:space="0" w:color="auto"/>
+              <w:left w:val="single" w:sz="4" w:space="0" w:color="auto"/>
+              <w:bottom w:val="single" w:sz="4" w:space="0" w:color="auto"/>
+              <w:right w:val="single" w:sz="4" w:space="0" w:color="auto"/>
+            </w:tcBorders>
+          </w:tcPr>
+          <w:p>
+            <w:pPr>
+              <w:keepNext/>
+              <w:keepLines/>
+              <w:jc w:val="both"/>
+              <w:rPr>
+                <w:sz w:val="22"/>
+                <w:szCs w:val="22"/>
+              </w:rPr>
+            </w:pPr>
+          </w:p>
+        </w:tc>
+        <w:tc>
+          <w:tcPr>
+            <w:tcW w:w="2693" w:type="dxa"/>
+            <w:tcBorders>
+              <w:top w:val="single" w:sz="4" w:space="0" w:color="auto"/>
+              <w:left w:val="single" w:sz="4" w:space="0" w:color="auto"/>
+              <w:bottom w:val="single" w:sz="4" w:space="0" w:color="auto"/>
+              <w:right w:val="single" w:sz="4" w:space="0" w:color="auto"/>
+            </w:tcBorders>
+          </w:tcPr>
+          <w:p>
+            <w:pPr>
+              <w:keepNext/>
+              <w:keepLines/>
+              <w:jc w:val="both"/>
+              <w:rPr>
+                <w:sz w:val="22"/>
+                <w:szCs w:val="22"/>
+              </w:rPr>
+            </w:pPr>
+          </w:p>
+        </w:tc>
+        <w:tc>
+          <w:tcPr>
+            <w:tcW w:w="1276" w:type="dxa"/>
+            <w:tcBorders>
+              <w:top w:val="single" w:sz="4" w:space="0" w:color="auto"/>
+              <w:left w:val="single" w:sz="4" w:space="0" w:color="auto"/>
+              <w:bottom w:val="single" w:sz="4" w:space="0" w:color="auto"/>
+              <w:right w:val="single" w:sz="4" w:space="0" w:color="auto"/>
+            </w:tcBorders>
+          </w:tcPr>
+          <w:p>
+            <w:pPr>
+              <w:keepNext/>
+              <w:keepLines/>
+              <w:jc w:val="both"/>
+              <w:rPr>
+                <w:sz w:val="22"/>
+                <w:szCs w:val="22"/>
+              </w:rPr>
+            </w:pPr>
+          </w:p>
+        </w:tc>
+      </w:tr>
+      <w:tr>
+        <w:tc>
+          <w:tcPr>
+            <w:tcW w:w="2553" w:type="dxa"/>
+            <w:tcBorders>
+              <w:top w:val="single" w:sz="4" w:space="0" w:color="auto"/>
+              <w:left w:val="single" w:sz="4" w:space="0" w:color="auto"/>
+              <w:bottom w:val="single" w:sz="4" w:space="0" w:color="auto"/>
+              <w:right w:val="single" w:sz="4" w:space="0" w:color="auto"/>
+            </w:tcBorders>
+          </w:tcPr>
+          <w:p>
+            <w:pPr>
+              <w:keepNext/>
+              <w:keepLines/>
+              <w:jc w:val="both"/>
+              <w:rPr>
+                <w:sz w:val="22"/>
+                <w:szCs w:val="22"/>
+              </w:rPr>
+            </w:pPr>
+          </w:p>
+        </w:tc>
+        <w:tc>
+          <w:tcPr>
+            <w:tcW w:w="2835" w:type="dxa"/>
+            <w:tcBorders>
+              <w:top w:val="single" w:sz="4" w:space="0" w:color="auto"/>
+              <w:left w:val="single" w:sz="4" w:space="0" w:color="auto"/>
+              <w:bottom w:val="single" w:sz="4" w:space="0" w:color="auto"/>
+              <w:right w:val="single" w:sz="4" w:space="0" w:color="auto"/>
+            </w:tcBorders>
+          </w:tcPr>
+          <w:p>
+            <w:pPr>
+              <w:keepNext/>
+              <w:keepLines/>
+              <w:jc w:val="both"/>
+              <w:rPr>
+                <w:sz w:val="22"/>
+                <w:szCs w:val="22"/>
+              </w:rPr>
+            </w:pPr>
+          </w:p>
+        </w:tc>
+        <w:tc>
+          <w:tcPr>
+            <w:tcW w:w="2693" w:type="dxa"/>
+            <w:tcBorders>
+              <w:top w:val="single" w:sz="4" w:space="0" w:color="auto"/>
+              <w:left w:val="single" w:sz="4" w:space="0" w:color="auto"/>
+              <w:bottom w:val="single" w:sz="4" w:space="0" w:color="auto"/>
+              <w:right w:val="single" w:sz="4" w:space="0" w:color="auto"/>
+            </w:tcBorders>
+          </w:tcPr>
+          <w:p>
+            <w:pPr>
+              <w:keepNext/>
+              <w:keepLines/>
+              <w:jc w:val="both"/>
+              <w:rPr>
+                <w:sz w:val="22"/>
+                <w:szCs w:val="22"/>
+              </w:rPr>
+            </w:pPr>
+          </w:p>
+        </w:tc>
+        <w:tc>
+          <w:tcPr>
+            <w:tcW w:w="1276" w:type="dxa"/>
+            <w:tcBorders>
+              <w:top w:val="single" w:sz="4" w:space="0" w:color="auto"/>
+              <w:left w:val="single" w:sz="4" w:space="0" w:color="auto"/>
+              <w:bottom w:val="single" w:sz="4" w:space="0" w:color="auto"/>
+              <w:right w:val="single" w:sz="4" w:space="0" w:color="auto"/>
+            </w:tcBorders>
+          </w:tcPr>
+          <w:p>
+            <w:pPr>
+              <w:keepNext/>
+              <w:keepLines/>
+              <w:jc w:val="both"/>
+              <w:rPr>
+                <w:sz w:val="22"/>
+                <w:szCs w:val="22"/>
+              </w:rPr>
+            </w:pPr>
+          </w:p>
+        </w:tc>
+      </w:tr>
+      <w:tr>
+        <w:tc>
+          <w:tcPr>
+            <w:tcW w:w="2553" w:type="dxa"/>
+            <w:tcBorders>
+              <w:top w:val="single" w:sz="4" w:space="0" w:color="auto"/>
+              <w:left w:val="single" w:sz="4" w:space="0" w:color="auto"/>
+              <w:bottom w:val="single" w:sz="4" w:space="0" w:color="auto"/>
+              <w:right w:val="single" w:sz="4" w:space="0" w:color="auto"/>
+            </w:tcBorders>
+          </w:tcPr>
+          <w:p>
+            <w:pPr>
+              <w:keepNext/>
+              <w:keepLines/>
+              <w:jc w:val="both"/>
+              <w:rPr>
+                <w:sz w:val="22"/>
+                <w:szCs w:val="22"/>
+              </w:rPr>
+            </w:pPr>
+          </w:p>
+        </w:tc>
+        <w:tc>
+          <w:tcPr>
+            <w:tcW w:w="2835" w:type="dxa"/>
+            <w:tcBorders>
+              <w:top w:val="single" w:sz="4" w:space="0" w:color="auto"/>
+              <w:left w:val="single" w:sz="4" w:space="0" w:color="auto"/>
+              <w:bottom w:val="single" w:sz="4" w:space="0" w:color="auto"/>
+              <w:right w:val="single" w:sz="4" w:space="0" w:color="auto"/>
+            </w:tcBorders>
+          </w:tcPr>
+          <w:p>
+            <w:pPr>
+              <w:keepNext/>
+              <w:keepLines/>
+              <w:jc w:val="both"/>
+              <w:rPr>
+                <w:sz w:val="22"/>
+                <w:szCs w:val="22"/>
+              </w:rPr>
+            </w:pPr>
+          </w:p>
+        </w:tc>
+        <w:tc>
+          <w:tcPr>
+            <w:tcW w:w="2693" w:type="dxa"/>
+            <w:tcBorders>
+              <w:top w:val="single" w:sz="4" w:space="0" w:color="auto"/>
+              <w:left w:val="single" w:sz="4" w:space="0" w:color="auto"/>
+              <w:bottom w:val="single" w:sz="4" w:space="0" w:color="auto"/>
+              <w:right w:val="single" w:sz="4" w:space="0" w:color="auto"/>
+            </w:tcBorders>
+          </w:tcPr>
+          <w:p>
+            <w:pPr>
+              <w:keepNext/>
+              <w:keepLines/>
+              <w:jc w:val="both"/>
+              <w:rPr>
+                <w:sz w:val="22"/>
+                <w:szCs w:val="22"/>
+              </w:rPr>
+            </w:pPr>
+          </w:p>
+        </w:tc>
+        <w:tc>
+          <w:tcPr>
+            <w:tcW w:w="1276" w:type="dxa"/>
+            <w:tcBorders>
+              <w:top w:val="single" w:sz="4" w:space="0" w:color="auto"/>
+              <w:left w:val="single" w:sz="4" w:space="0" w:color="auto"/>
+              <w:bottom w:val="single" w:sz="4" w:space="0" w:color="auto"/>
+              <w:right w:val="single" w:sz="4" w:space="0" w:color="auto"/>
+            </w:tcBorders>
+          </w:tcPr>
+          <w:p>
+            <w:pPr>
+              <w:keepNext/>
+              <w:keepLines/>
+              <w:jc w:val="both"/>
+              <w:rPr>
+                <w:sz w:val="22"/>
+                <w:szCs w:val="22"/>
+              </w:rPr>
+            </w:pPr>
+          </w:p>
+        </w:tc>
+      </w:tr>
+      <w:tr>
+        <w:tc>
+          <w:tcPr>
+            <w:tcW w:w="2553" w:type="dxa"/>
+            <w:tcBorders>
+              <w:top w:val="single" w:sz="4" w:space="0" w:color="auto"/>
+              <w:left w:val="single" w:sz="4" w:space="0" w:color="auto"/>
+              <w:bottom w:val="single" w:sz="4" w:space="0" w:color="auto"/>
+              <w:right w:val="single" w:sz="4" w:space="0" w:color="auto"/>
+            </w:tcBorders>
+          </w:tcPr>
+          <w:p>
+            <w:pPr>
+              <w:keepNext/>
+              <w:keepLines/>
+              <w:jc w:val="both"/>
+              <w:rPr>
+                <w:sz w:val="22"/>
+                <w:szCs w:val="22"/>
+              </w:rPr>
+            </w:pPr>
+          </w:p>
+        </w:tc>
+        <w:tc>
+          <w:tcPr>
+            <w:tcW w:w="2835" w:type="dxa"/>
+            <w:tcBorders>
+              <w:top w:val="single" w:sz="4" w:space="0" w:color="auto"/>
+              <w:left w:val="single" w:sz="4" w:space="0" w:color="auto"/>
+              <w:bottom w:val="single" w:sz="4" w:space="0" w:color="auto"/>
+              <w:right w:val="single" w:sz="4" w:space="0" w:color="auto"/>
+            </w:tcBorders>
+          </w:tcPr>
+          <w:p>
+            <w:pPr>
+              <w:keepNext/>
+              <w:keepLines/>
+              <w:jc w:val="both"/>
+              <w:rPr>
+                <w:sz w:val="22"/>
+                <w:szCs w:val="22"/>
+              </w:rPr>
+            </w:pPr>
+          </w:p>
+        </w:tc>
+        <w:tc>
+          <w:tcPr>
+            <w:tcW w:w="2693" w:type="dxa"/>
+            <w:tcBorders>
+              <w:top w:val="single" w:sz="4" w:space="0" w:color="auto"/>
+              <w:left w:val="single" w:sz="4" w:space="0" w:color="auto"/>
+              <w:bottom w:val="single" w:sz="4" w:space="0" w:color="auto"/>
+              <w:right w:val="single" w:sz="4" w:space="0" w:color="auto"/>
+            </w:tcBorders>
+          </w:tcPr>
+          <w:p>
+            <w:pPr>
+              <w:keepNext/>
+              <w:keepLines/>
+              <w:jc w:val="both"/>
+              <w:rPr>
+                <w:sz w:val="22"/>
+                <w:szCs w:val="22"/>
+              </w:rPr>
+            </w:pPr>
+          </w:p>
+        </w:tc>
+        <w:tc>
+          <w:tcPr>
+            <w:tcW w:w="1276" w:type="dxa"/>
+            <w:tcBorders>
+              <w:top w:val="single" w:sz="4" w:space="0" w:color="auto"/>
+              <w:left w:val="single" w:sz="4" w:space="0" w:color="auto"/>
+              <w:bottom w:val="single" w:sz="4" w:space="0" w:color="auto"/>
+              <w:right w:val="single" w:sz="4" w:space="0" w:color="auto"/>
+            </w:tcBorders>
+          </w:tcPr>
+          <w:p>
+            <w:pPr>
+              <w:keepNext/>
+              <w:keepLines/>
+              <w:jc w:val="both"/>
+              <w:rPr>
+                <w:sz w:val="22"/>
+                <w:szCs w:val="22"/>
+              </w:rPr>
+            </w:pPr>
+          </w:p>
+        </w:tc>
+      </w:tr>
+      <w:tr>
+        <w:tc>
+          <w:tcPr>
+            <w:tcW w:w="2553" w:type="dxa"/>
+            <w:tcBorders>
+              <w:top w:val="single" w:sz="4" w:space="0" w:color="auto"/>
+              <w:left w:val="single" w:sz="4" w:space="0" w:color="auto"/>
+              <w:bottom w:val="single" w:sz="4" w:space="0" w:color="auto"/>
+              <w:right w:val="single" w:sz="4" w:space="0" w:color="auto"/>
+            </w:tcBorders>
+          </w:tcPr>
+          <w:p>
+            <w:pPr>
+              <w:keepNext/>
+              <w:keepLines/>
+              <w:jc w:val="both"/>
+              <w:rPr>
+                <w:sz w:val="22"/>
+                <w:szCs w:val="22"/>
+              </w:rPr>
+            </w:pPr>
+          </w:p>
+        </w:tc>
+        <w:tc>
+          <w:tcPr>
+            <w:tcW w:w="2835" w:type="dxa"/>
+            <w:tcBorders>
+              <w:top w:val="single" w:sz="4" w:space="0" w:color="auto"/>
+              <w:left w:val="single" w:sz="4" w:space="0" w:color="auto"/>
+              <w:bottom w:val="single" w:sz="4" w:space="0" w:color="auto"/>
+              <w:right w:val="single" w:sz="4" w:space="0" w:color="auto"/>
+            </w:tcBorders>
+          </w:tcPr>
+          <w:p>
+            <w:pPr>
+              <w:keepNext/>
+              <w:keepLines/>
+              <w:jc w:val="both"/>
+              <w:rPr>
+                <w:sz w:val="22"/>
+                <w:szCs w:val="22"/>
+              </w:rPr>
+            </w:pPr>
+          </w:p>
+        </w:tc>
+        <w:tc>
+          <w:tcPr>
+            <w:tcW w:w="2693" w:type="dxa"/>
+            <w:tcBorders>
+              <w:top w:val="single" w:sz="4" w:space="0" w:color="auto"/>
+              <w:left w:val="single" w:sz="4" w:space="0" w:color="auto"/>
+              <w:bottom w:val="single" w:sz="4" w:space="0" w:color="auto"/>
+              <w:right w:val="single" w:sz="4" w:space="0" w:color="auto"/>
+            </w:tcBorders>
+          </w:tcPr>
+          <w:p>
+            <w:pPr>
+              <w:keepNext/>
+              <w:keepLines/>
+              <w:jc w:val="both"/>
+              <w:rPr>
+                <w:sz w:val="22"/>
+                <w:szCs w:val="22"/>
+              </w:rPr>
+            </w:pPr>
+          </w:p>
+        </w:tc>
+        <w:tc>
+          <w:tcPr>
+            <w:tcW w:w="1276" w:type="dxa"/>
+            <w:tcBorders>
+              <w:top w:val="single" w:sz="4" w:space="0" w:color="auto"/>
+              <w:left w:val="single" w:sz="4" w:space="0" w:color="auto"/>
+              <w:bottom w:val="single" w:sz="4" w:space="0" w:color="auto"/>
+              <w:right w:val="single" w:sz="4" w:space="0" w:color="auto"/>
+            </w:tcBorders>
+          </w:tcPr>
+          <w:p>
+            <w:pPr>
+              <w:keepNext/>
+              <w:keepLines/>
+              <w:jc w:val="both"/>
+              <w:rPr>
+                <w:sz w:val="22"/>
+                <w:szCs w:val="22"/>
+              </w:rPr>
+            </w:pPr>
+          </w:p>
+        </w:tc>
+      </w:tr>
     </w:tbl>
     <w:p>
       <w:pPr>
@@ -6964,7 +7793,7 @@
 </file>
 
 <file path=word/endnotes.xml><?xml version="1.0" encoding="utf-8"?>
-<w:endnotes xmlns:wpc="http://schemas.microsoft.com/office/word/2010/wordprocessingCanvas" xmlns:cx="http://schemas.microsoft.com/office/drawing/2014/chartex" xmlns:cx1="http://schemas.microsoft.com/office/drawing/2015/9/8/chartex" xmlns:cx2="http://schemas.microsoft.com/office/drawing/2015/10/21/chartex" xmlns:cx3="http://schemas.microsoft.com/office/drawing/2016/5/9/chartex" xmlns:cx4="http://schemas.microsoft.com/office/drawing/2016/5/10/chartex" xmlns:cx5="http://schemas.microsoft.com/office/drawing/2016/5/11/chartex" xmlns:cx6="http://schemas.microsoft.com/office/drawing/2016/5/12/chartex" xmlns:cx7="http://schemas.microsoft.com/office/drawing/2016/5/13/chartex" xmlns:cx8="http://schemas.microsoft.com/office/drawing/2016/5/14/chartex" xmlns:mc="http://schemas.openxmlformats.org/markup-compatibility/2006" xmlns:aink="http://schemas.microsoft.com/office/drawing/2016/ink" xmlns:am3d="http://schemas.microsoft.com/office/drawing/2017/model3d" xmlns:o="urn:schemas-microsoft-com:office:office" xmlns:r="http://schemas.openxmlformats.org/officeDocument/2006/relationships" xmlns:m="http://schemas.openxmlformats.org/officeDocument/2006/math" xmlns:v="urn:schemas-microsoft-com:vml" xmlns:wp14="http://schemas.microsoft.com/office/word/2010/wordprocessingDrawing" xmlns:wp="http://schemas.openxmlformats.org/drawingml/2006/wordprocessingDrawing" xmlns:w10="urn:schemas-microsoft-com:office:word" xmlns:w="http://schemas.openxmlformats.org/wordprocessingml/2006/main" xmlns:w14="http://schemas.microsoft.com/office/word/2010/wordml" xmlns:w15="http://schemas.microsoft.com/office/word/2012/wordml" xmlns:w16cex="http://schemas.microsoft.com/office/word/2018/wordml/cex" xmlns:w16cid="http://schemas.microsoft.com/office/word/2016/wordml/cid" xmlns:w16="http://schemas.microsoft.com/office/word/2018/wordml" xmlns:w16sdtdh="http://schemas.microsoft.com/office/word/2020/wordml/sdtdatahash" xmlns:w16se="http://schemas.microsoft.com/office/word/2015/wordml/symex" xmlns:wpg="http://schemas.microsoft.com/office/word/2010/wordprocessingGroup" xmlns:wpi="http://schemas.microsoft.com/office/word/2010/wordprocessingInk" xmlns:wne="http://schemas.microsoft.com/office/word/2006/wordml" xmlns:wps="http://schemas.microsoft.com/office/word/2010/wordprocessingShape" mc:Ignorable="w14 w15 w16se w16cid w16 w16cex w16sdtdh wp14">
+<w:endnotes xmlns:wpc="http://schemas.microsoft.com/office/word/2010/wordprocessingCanvas" xmlns:cx="http://schemas.microsoft.com/office/drawing/2014/chartex" xmlns:cx1="http://schemas.microsoft.com/office/drawing/2015/9/8/chartex" xmlns:cx2="http://schemas.microsoft.com/office/drawing/2015/10/21/chartex" xmlns:cx3="http://schemas.microsoft.com/office/drawing/2016/5/9/chartex" xmlns:cx4="http://schemas.microsoft.com/office/drawing/2016/5/10/chartex" xmlns:cx5="http://schemas.microsoft.com/office/drawing/2016/5/11/chartex" xmlns:cx6="http://schemas.microsoft.com/office/drawing/2016/5/12/chartex" xmlns:cx7="http://schemas.microsoft.com/office/drawing/2016/5/13/chartex" xmlns:cx8="http://schemas.microsoft.com/office/drawing/2016/5/14/chartex" xmlns:mc="http://schemas.openxmlformats.org/markup-compatibility/2006" xmlns:aink="http://schemas.microsoft.com/office/drawing/2016/ink" xmlns:am3d="http://schemas.microsoft.com/office/drawing/2017/model3d" xmlns:o="urn:schemas-microsoft-com:office:office" xmlns:oel="http://schemas.microsoft.com/office/2019/extlst" xmlns:r="http://schemas.openxmlformats.org/officeDocument/2006/relationships" xmlns:m="http://schemas.openxmlformats.org/officeDocument/2006/math" xmlns:v="urn:schemas-microsoft-com:vml" xmlns:wp14="http://schemas.microsoft.com/office/word/2010/wordprocessingDrawing" xmlns:wp="http://schemas.openxmlformats.org/drawingml/2006/wordprocessingDrawing" xmlns:w10="urn:schemas-microsoft-com:office:word" xmlns:w="http://schemas.openxmlformats.org/wordprocessingml/2006/main" xmlns:w14="http://schemas.microsoft.com/office/word/2010/wordml" xmlns:w15="http://schemas.microsoft.com/office/word/2012/wordml" xmlns:w16cex="http://schemas.microsoft.com/office/word/2018/wordml/cex" xmlns:w16cid="http://schemas.microsoft.com/office/word/2016/wordml/cid" xmlns:w16="http://schemas.microsoft.com/office/word/2018/wordml" xmlns:w16du="http://schemas.microsoft.com/office/word/2023/wordml/word16du" xmlns:w16sdtdh="http://schemas.microsoft.com/office/word/2020/wordml/sdtdatahash" xmlns:w16se="http://schemas.microsoft.com/office/word/2015/wordml/symex" xmlns:wpg="http://schemas.microsoft.com/office/word/2010/wordprocessingGroup" xmlns:wpi="http://schemas.microsoft.com/office/word/2010/wordprocessingInk" xmlns:wne="http://schemas.microsoft.com/office/word/2006/wordml" xmlns:wps="http://schemas.microsoft.com/office/word/2010/wordprocessingShape" mc:Ignorable="w14 w15 w16se w16cid w16 w16cex w16sdtdh w16du wp14">
   <w:endnote w:type="separator" w:id="-1">
     <w:p>
       <w:r>
@@ -6983,7 +7812,7 @@
 </file>
 
 <file path=word/footnotes.xml><?xml version="1.0" encoding="utf-8"?>
-<w:footnotes xmlns:wpc="http://schemas.microsoft.com/office/word/2010/wordprocessingCanvas" xmlns:cx="http://schemas.microsoft.com/office/drawing/2014/chartex" xmlns:cx1="http://schemas.microsoft.com/office/drawing/2015/9/8/chartex" xmlns:cx2="http://schemas.microsoft.com/office/drawing/2015/10/21/chartex" xmlns:cx3="http://schemas.microsoft.com/office/drawing/2016/5/9/chartex" xmlns:cx4="http://schemas.microsoft.com/office/drawing/2016/5/10/chartex" xmlns:cx5="http://schemas.microsoft.com/office/drawing/2016/5/11/chartex" xmlns:cx6="http://schemas.microsoft.com/office/drawing/2016/5/12/chartex" xmlns:cx7="http://schemas.microsoft.com/office/drawing/2016/5/13/chartex" xmlns:cx8="http://schemas.microsoft.com/office/drawing/2016/5/14/chartex" xmlns:mc="http://schemas.openxmlformats.org/markup-compatibility/2006" xmlns:aink="http://schemas.microsoft.com/office/drawing/2016/ink" xmlns:am3d="http://schemas.microsoft.com/office/drawing/2017/model3d" xmlns:o="urn:schemas-microsoft-com:office:office" xmlns:r="http://schemas.openxmlformats.org/officeDocument/2006/relationships" xmlns:m="http://schemas.openxmlformats.org/officeDocument/2006/math" xmlns:v="urn:schemas-microsoft-com:vml" xmlns:wp14="http://schemas.microsoft.com/office/word/2010/wordprocessingDrawing" xmlns:wp="http://schemas.openxmlformats.org/drawingml/2006/wordprocessingDrawing" xmlns:w10="urn:schemas-microsoft-com:office:word" xmlns:w="http://schemas.openxmlformats.org/wordprocessingml/2006/main" xmlns:w14="http://schemas.microsoft.com/office/word/2010/wordml" xmlns:w15="http://schemas.microsoft.com/office/word/2012/wordml" xmlns:w16cex="http://schemas.microsoft.com/office/word/2018/wordml/cex" xmlns:w16cid="http://schemas.microsoft.com/office/word/2016/wordml/cid" xmlns:w16="http://schemas.microsoft.com/office/word/2018/wordml" xmlns:w16sdtdh="http://schemas.microsoft.com/office/word/2020/wordml/sdtdatahash" xmlns:w16se="http://schemas.microsoft.com/office/word/2015/wordml/symex" xmlns:wpg="http://schemas.microsoft.com/office/word/2010/wordprocessingGroup" xmlns:wpi="http://schemas.microsoft.com/office/word/2010/wordprocessingInk" xmlns:wne="http://schemas.microsoft.com/office/word/2006/wordml" xmlns:wps="http://schemas.microsoft.com/office/word/2010/wordprocessingShape" mc:Ignorable="w14 w15 w16se w16cid w16 w16cex w16sdtdh wp14">
+<w:footnotes xmlns:wpc="http://schemas.microsoft.com/office/word/2010/wordprocessingCanvas" xmlns:cx="http://schemas.microsoft.com/office/drawing/2014/chartex" xmlns:cx1="http://schemas.microsoft.com/office/drawing/2015/9/8/chartex" xmlns:cx2="http://schemas.microsoft.com/office/drawing/2015/10/21/chartex" xmlns:cx3="http://schemas.microsoft.com/office/drawing/2016/5/9/chartex" xmlns:cx4="http://schemas.microsoft.com/office/drawing/2016/5/10/chartex" xmlns:cx5="http://schemas.microsoft.com/office/drawing/2016/5/11/chartex" xmlns:cx6="http://schemas.microsoft.com/office/drawing/2016/5/12/chartex" xmlns:cx7="http://schemas.microsoft.com/office/drawing/2016/5/13/chartex" xmlns:cx8="http://schemas.microsoft.com/office/drawing/2016/5/14/chartex" xmlns:mc="http://schemas.openxmlformats.org/markup-compatibility/2006" xmlns:aink="http://schemas.microsoft.com/office/drawing/2016/ink" xmlns:am3d="http://schemas.microsoft.com/office/drawing/2017/model3d" xmlns:o="urn:schemas-microsoft-com:office:office" xmlns:oel="http://schemas.microsoft.com/office/2019/extlst" xmlns:r="http://schemas.openxmlformats.org/officeDocument/2006/relationships" xmlns:m="http://schemas.openxmlformats.org/officeDocument/2006/math" xmlns:v="urn:schemas-microsoft-com:vml" xmlns:wp14="http://schemas.microsoft.com/office/word/2010/wordprocessingDrawing" xmlns:wp="http://schemas.openxmlformats.org/drawingml/2006/wordprocessingDrawing" xmlns:w10="urn:schemas-microsoft-com:office:word" xmlns:w="http://schemas.openxmlformats.org/wordprocessingml/2006/main" xmlns:w14="http://schemas.microsoft.com/office/word/2010/wordml" xmlns:w15="http://schemas.microsoft.com/office/word/2012/wordml" xmlns:w16cex="http://schemas.microsoft.com/office/word/2018/wordml/cex" xmlns:w16cid="http://schemas.microsoft.com/office/word/2016/wordml/cid" xmlns:w16="http://schemas.microsoft.com/office/word/2018/wordml" xmlns:w16du="http://schemas.microsoft.com/office/word/2023/wordml/word16du" xmlns:w16sdtdh="http://schemas.microsoft.com/office/word/2020/wordml/sdtdatahash" xmlns:w16se="http://schemas.microsoft.com/office/word/2015/wordml/symex" xmlns:wpg="http://schemas.microsoft.com/office/word/2010/wordprocessingGroup" xmlns:wpi="http://schemas.microsoft.com/office/word/2010/wordprocessingInk" xmlns:wne="http://schemas.microsoft.com/office/word/2006/wordml" xmlns:wps="http://schemas.microsoft.com/office/word/2010/wordprocessingShape" mc:Ignorable="w14 w15 w16se w16cid w16 w16cex w16sdtdh w16du wp14">
   <w:footnote w:type="separator" w:id="-1">
     <w:p>
       <w:r>
@@ -7002,7 +7831,7 @@
 </file>
 
 <file path=word/header1.xml><?xml version="1.0" encoding="utf-8"?>
-<w:hdr xmlns:wpc="http://schemas.microsoft.com/office/word/2010/wordprocessingCanvas" xmlns:cx="http://schemas.microsoft.com/office/drawing/2014/chartex" xmlns:cx1="http://schemas.microsoft.com/office/drawing/2015/9/8/chartex" xmlns:cx2="http://schemas.microsoft.com/office/drawing/2015/10/21/chartex" xmlns:cx3="http://schemas.microsoft.com/office/drawing/2016/5/9/chartex" xmlns:cx4="http://schemas.microsoft.com/office/drawing/2016/5/10/chartex" xmlns:cx5="http://schemas.microsoft.com/office/drawing/2016/5/11/chartex" xmlns:cx6="http://schemas.microsoft.com/office/drawing/2016/5/12/chartex" xmlns:cx7="http://schemas.microsoft.com/office/drawing/2016/5/13/chartex" xmlns:cx8="http://schemas.microsoft.com/office/drawing/2016/5/14/chartex" xmlns:mc="http://schemas.openxmlformats.org/markup-compatibility/2006" xmlns:aink="http://schemas.microsoft.com/office/drawing/2016/ink" xmlns:am3d="http://schemas.microsoft.com/office/drawing/2017/model3d" xmlns:o="urn:schemas-microsoft-com:office:office" xmlns:r="http://schemas.openxmlformats.org/officeDocument/2006/relationships" xmlns:m="http://schemas.openxmlformats.org/officeDocument/2006/math" xmlns:v="urn:schemas-microsoft-com:vml" xmlns:wp14="http://schemas.microsoft.com/office/word/2010/wordprocessingDrawing" xmlns:wp="http://schemas.openxmlformats.org/drawingml/2006/wordprocessingDrawing" xmlns:w10="urn:schemas-microsoft-com:office:word" xmlns:w="http://schemas.openxmlformats.org/wordprocessingml/2006/main" xmlns:w14="http://schemas.microsoft.com/office/word/2010/wordml" xmlns:w15="http://schemas.microsoft.com/office/word/2012/wordml" xmlns:w16cex="http://schemas.microsoft.com/office/word/2018/wordml/cex" xmlns:w16cid="http://schemas.microsoft.com/office/word/2016/wordml/cid" xmlns:w16="http://schemas.microsoft.com/office/word/2018/wordml" xmlns:w16sdtdh="http://schemas.microsoft.com/office/word/2020/wordml/sdtdatahash" xmlns:w16se="http://schemas.microsoft.com/office/word/2015/wordml/symex" xmlns:wpg="http://schemas.microsoft.com/office/word/2010/wordprocessingGroup" xmlns:wpi="http://schemas.microsoft.com/office/word/2010/wordprocessingInk" xmlns:wne="http://schemas.microsoft.com/office/word/2006/wordml" xmlns:wps="http://schemas.microsoft.com/office/word/2010/wordprocessingShape" mc:Ignorable="w14 w15 w16se w16cid w16 w16cex w16sdtdh wp14">
+<w:hdr xmlns:wpc="http://schemas.microsoft.com/office/word/2010/wordprocessingCanvas" xmlns:cx="http://schemas.microsoft.com/office/drawing/2014/chartex" xmlns:cx1="http://schemas.microsoft.com/office/drawing/2015/9/8/chartex" xmlns:cx2="http://schemas.microsoft.com/office/drawing/2015/10/21/chartex" xmlns:cx3="http://schemas.microsoft.com/office/drawing/2016/5/9/chartex" xmlns:cx4="http://schemas.microsoft.com/office/drawing/2016/5/10/chartex" xmlns:cx5="http://schemas.microsoft.com/office/drawing/2016/5/11/chartex" xmlns:cx6="http://schemas.microsoft.com/office/drawing/2016/5/12/chartex" xmlns:cx7="http://schemas.microsoft.com/office/drawing/2016/5/13/chartex" xmlns:cx8="http://schemas.microsoft.com/office/drawing/2016/5/14/chartex" xmlns:mc="http://schemas.openxmlformats.org/markup-compatibility/2006" xmlns:aink="http://schemas.microsoft.com/office/drawing/2016/ink" xmlns:am3d="http://schemas.microsoft.com/office/drawing/2017/model3d" xmlns:o="urn:schemas-microsoft-com:office:office" xmlns:oel="http://schemas.microsoft.com/office/2019/extlst" xmlns:r="http://schemas.openxmlformats.org/officeDocument/2006/relationships" xmlns:m="http://schemas.openxmlformats.org/officeDocument/2006/math" xmlns:v="urn:schemas-microsoft-com:vml" xmlns:wp14="http://schemas.microsoft.com/office/word/2010/wordprocessingDrawing" xmlns:wp="http://schemas.openxmlformats.org/drawingml/2006/wordprocessingDrawing" xmlns:w10="urn:schemas-microsoft-com:office:word" xmlns:w="http://schemas.openxmlformats.org/wordprocessingml/2006/main" xmlns:w14="http://schemas.microsoft.com/office/word/2010/wordml" xmlns:w15="http://schemas.microsoft.com/office/word/2012/wordml" xmlns:w16cex="http://schemas.microsoft.com/office/word/2018/wordml/cex" xmlns:w16cid="http://schemas.microsoft.com/office/word/2016/wordml/cid" xmlns:w16="http://schemas.microsoft.com/office/word/2018/wordml" xmlns:w16du="http://schemas.microsoft.com/office/word/2023/wordml/word16du" xmlns:w16sdtdh="http://schemas.microsoft.com/office/word/2020/wordml/sdtdatahash" xmlns:w16se="http://schemas.microsoft.com/office/word/2015/wordml/symex" xmlns:wpg="http://schemas.microsoft.com/office/word/2010/wordprocessingGroup" xmlns:wpi="http://schemas.microsoft.com/office/word/2010/wordprocessingInk" xmlns:wne="http://schemas.microsoft.com/office/word/2006/wordml" xmlns:wps="http://schemas.microsoft.com/office/word/2010/wordprocessingShape" mc:Ignorable="w14 w15 w16se w16cid w16 w16cex w16sdtdh w16du wp14">
   <w:p>
     <w:pPr>
       <w:pStyle w:val="a6"/>
@@ -7026,7 +7855,7 @@
 </file>
 
 <file path=word/numbering.xml><?xml version="1.0" encoding="utf-8"?>
-<w:numbering xmlns:wpc="http://schemas.microsoft.com/office/word/2010/wordprocessingCanvas" xmlns:cx="http://schemas.microsoft.com/office/drawing/2014/chartex" xmlns:cx1="http://schemas.microsoft.com/office/drawing/2015/9/8/chartex" xmlns:cx2="http://schemas.microsoft.com/office/drawing/2015/10/21/chartex" xmlns:cx3="http://schemas.microsoft.com/office/drawing/2016/5/9/chartex" xmlns:cx4="http://schemas.microsoft.com/office/drawing/2016/5/10/chartex" xmlns:cx5="http://schemas.microsoft.com/office/drawing/2016/5/11/chartex" xmlns:cx6="http://schemas.microsoft.com/office/drawing/2016/5/12/chartex" xmlns:cx7="http://schemas.microsoft.com/office/drawing/2016/5/13/chartex" xmlns:cx8="http://schemas.microsoft.com/office/drawing/2016/5/14/chartex" xmlns:mc="http://schemas.openxmlformats.org/markup-compatibility/2006" xmlns:aink="http://schemas.microsoft.com/office/drawing/2016/ink" xmlns:am3d="http://schemas.microsoft.com/office/drawing/2017/model3d" xmlns:o="urn:schemas-microsoft-com:office:office" xmlns:r="http://schemas.openxmlformats.org/officeDocument/2006/relationships" xmlns:m="http://schemas.openxmlformats.org/officeDocument/2006/math" xmlns:v="urn:schemas-microsoft-com:vml" xmlns:wp14="http://schemas.microsoft.com/office/word/2010/wordprocessingDrawing" xmlns:wp="http://schemas.openxmlformats.org/drawingml/2006/wordprocessingDrawing" xmlns:w10="urn:schemas-microsoft-com:office:word" xmlns:w="http://schemas.openxmlformats.org/wordprocessingml/2006/main" xmlns:w14="http://schemas.microsoft.com/office/word/2010/wordml" xmlns:w15="http://schemas.microsoft.com/office/word/2012/wordml" xmlns:w16cex="http://schemas.microsoft.com/office/word/2018/wordml/cex" xmlns:w16cid="http://schemas.microsoft.com/office/word/2016/wordml/cid" xmlns:w16="http://schemas.microsoft.com/office/word/2018/wordml" xmlns:w16sdtdh="http://schemas.microsoft.com/office/word/2020/wordml/sdtdatahash" xmlns:w16se="http://schemas.microsoft.com/office/word/2015/wordml/symex" xmlns:wpg="http://schemas.microsoft.com/office/word/2010/wordprocessingGroup" xmlns:wpi="http://schemas.microsoft.com/office/word/2010/wordprocessingInk" xmlns:wne="http://schemas.microsoft.com/office/word/2006/wordml" xmlns:wps="http://schemas.microsoft.com/office/word/2010/wordprocessingShape" mc:Ignorable="w14 w15 w16se w16cid w16 w16cex w16sdtdh wp14">
+<w:numbering xmlns:wpc="http://schemas.microsoft.com/office/word/2010/wordprocessingCanvas" xmlns:cx="http://schemas.microsoft.com/office/drawing/2014/chartex" xmlns:cx1="http://schemas.microsoft.com/office/drawing/2015/9/8/chartex" xmlns:cx2="http://schemas.microsoft.com/office/drawing/2015/10/21/chartex" xmlns:cx3="http://schemas.microsoft.com/office/drawing/2016/5/9/chartex" xmlns:cx4="http://schemas.microsoft.com/office/drawing/2016/5/10/chartex" xmlns:cx5="http://schemas.microsoft.com/office/drawing/2016/5/11/chartex" xmlns:cx6="http://schemas.microsoft.com/office/drawing/2016/5/12/chartex" xmlns:cx7="http://schemas.microsoft.com/office/drawing/2016/5/13/chartex" xmlns:cx8="http://schemas.microsoft.com/office/drawing/2016/5/14/chartex" xmlns:mc="http://schemas.openxmlformats.org/markup-compatibility/2006" xmlns:aink="http://schemas.microsoft.com/office/drawing/2016/ink" xmlns:am3d="http://schemas.microsoft.com/office/drawing/2017/model3d" xmlns:o="urn:schemas-microsoft-com:office:office" xmlns:oel="http://schemas.microsoft.com/office/2019/extlst" xmlns:r="http://schemas.openxmlformats.org/officeDocument/2006/relationships" xmlns:m="http://schemas.openxmlformats.org/officeDocument/2006/math" xmlns:v="urn:schemas-microsoft-com:vml" xmlns:wp14="http://schemas.microsoft.com/office/word/2010/wordprocessingDrawing" xmlns:wp="http://schemas.openxmlformats.org/drawingml/2006/wordprocessingDrawing" xmlns:w10="urn:schemas-microsoft-com:office:word" xmlns:w="http://schemas.openxmlformats.org/wordprocessingml/2006/main" xmlns:w14="http://schemas.microsoft.com/office/word/2010/wordml" xmlns:w15="http://schemas.microsoft.com/office/word/2012/wordml" xmlns:w16cex="http://schemas.microsoft.com/office/word/2018/wordml/cex" xmlns:w16cid="http://schemas.microsoft.com/office/word/2016/wordml/cid" xmlns:w16="http://schemas.microsoft.com/office/word/2018/wordml" xmlns:w16du="http://schemas.microsoft.com/office/word/2023/wordml/word16du" xmlns:w16sdtdh="http://schemas.microsoft.com/office/word/2020/wordml/sdtdatahash" xmlns:w16se="http://schemas.microsoft.com/office/word/2015/wordml/symex" xmlns:wpg="http://schemas.microsoft.com/office/word/2010/wordprocessingGroup" xmlns:wpi="http://schemas.microsoft.com/office/word/2010/wordprocessingInk" xmlns:wne="http://schemas.microsoft.com/office/word/2006/wordml" xmlns:wps="http://schemas.microsoft.com/office/word/2010/wordprocessingShape" mc:Ignorable="w14 w15 w16se w16cid w16 w16cex w16sdtdh w16du wp14">
   <w:abstractNum w:abstractNumId="0" w15:restartNumberingAfterBreak="0">
     <w:nsid w:val="4B5E1A49"/>
     <w:multiLevelType w:val="hybridMultilevel"/>
@@ -7140,14 +7969,14 @@
       </w:rPr>
     </w:lvl>
   </w:abstractNum>
-  <w:num w:numId="1">
+  <w:num w:numId="1" w16cid:durableId="1089817387">
     <w:abstractNumId w:val="0"/>
   </w:num>
 </w:numbering>
 </file>
 
 <file path=word/styles.xml><?xml version="1.0" encoding="utf-8"?>
-<w:styles xmlns:mc="http://schemas.openxmlformats.org/markup-compatibility/2006" xmlns:r="http://schemas.openxmlformats.org/officeDocument/2006/relationships" xmlns:w="http://schemas.openxmlformats.org/wordprocessingml/2006/main" xmlns:w14="http://schemas.microsoft.com/office/word/2010/wordml" xmlns:w15="http://schemas.microsoft.com/office/word/2012/wordml" xmlns:w16cex="http://schemas.microsoft.com/office/word/2018/wordml/cex" xmlns:w16cid="http://schemas.microsoft.com/office/word/2016/wordml/cid" xmlns:w16="http://schemas.microsoft.com/office/word/2018/wordml" xmlns:w16sdtdh="http://schemas.microsoft.com/office/word/2020/wordml/sdtdatahash" xmlns:w16se="http://schemas.microsoft.com/office/word/2015/wordml/symex" mc:Ignorable="w14 w15 w16se w16cid w16 w16cex w16sdtdh">
+<w:styles xmlns:mc="http://schemas.openxmlformats.org/markup-compatibility/2006" xmlns:r="http://schemas.openxmlformats.org/officeDocument/2006/relationships" xmlns:w="http://schemas.openxmlformats.org/wordprocessingml/2006/main" xmlns:w14="http://schemas.microsoft.com/office/word/2010/wordml" xmlns:w15="http://schemas.microsoft.com/office/word/2012/wordml" xmlns:w16cex="http://schemas.microsoft.com/office/word/2018/wordml/cex" xmlns:w16cid="http://schemas.microsoft.com/office/word/2016/wordml/cid" xmlns:w16="http://schemas.microsoft.com/office/word/2018/wordml" xmlns:w16du="http://schemas.microsoft.com/office/word/2023/wordml/word16du" xmlns:w16sdtdh="http://schemas.microsoft.com/office/word/2020/wordml/sdtdatahash" xmlns:w16se="http://schemas.microsoft.com/office/word/2015/wordml/symex" mc:Ignorable="w14 w15 w16se w16cid w16 w16cex w16sdtdh w16du">
   <w:docDefaults>
     <w:rPrDefault>
       <w:rPr>

</xml_diff>

<commit_message>
refactor: replace Spire.Doc with DocumentFormat.OpenXml across all reports (#44)
Removed the Spire.Doc dependency and rewrote the Word document layer using
the official DocumentFormat.OpenXml SDK. WordDocumentHelper is now a set of
strongly-typed wrapper classes (WordDocument, WordTable, WordRow, WordCell)
instead of extension methods on Spire types; all report classes updated to
use the new API.

Also fixed a bug in ReplaceField where merge fields stored as w:fldSimple
elements (rather than the complex fldChar begin/separate/end structure) were
silently skipped. This caused DOC_NUMBER and DOC_DATE not to be substituted
in the TABLE_ASSETS table of the Commissioning Act report, as Word saved
those specific cells using the simple-field format.

Co-authored-by: Claude Sonnet 4.6 <noreply@anthropic.com>
</commit_message>
<xml_diff>
--- a/Mil.Paperwork.Domain/Templates/CommissioningActTemplate.docx
+++ b/Mil.Paperwork.Domain/Templates/CommissioningActTemplate.docx
@@ -1,6 +1,6 @@
 
 <file path=word/document.xml><?xml version="1.0" encoding="utf-8"?>
-<w:document xmlns:wpc="http://schemas.microsoft.com/office/word/2010/wordprocessingCanvas" xmlns:cx="http://schemas.microsoft.com/office/drawing/2014/chartex" xmlns:cx1="http://schemas.microsoft.com/office/drawing/2015/9/8/chartex" xmlns:cx2="http://schemas.microsoft.com/office/drawing/2015/10/21/chartex" xmlns:cx3="http://schemas.microsoft.com/office/drawing/2016/5/9/chartex" xmlns:cx4="http://schemas.microsoft.com/office/drawing/2016/5/10/chartex" xmlns:cx5="http://schemas.microsoft.com/office/drawing/2016/5/11/chartex" xmlns:cx6="http://schemas.microsoft.com/office/drawing/2016/5/12/chartex" xmlns:cx7="http://schemas.microsoft.com/office/drawing/2016/5/13/chartex" xmlns:cx8="http://schemas.microsoft.com/office/drawing/2016/5/14/chartex" xmlns:mc="http://schemas.openxmlformats.org/markup-compatibility/2006" xmlns:aink="http://schemas.microsoft.com/office/drawing/2016/ink" xmlns:am3d="http://schemas.microsoft.com/office/drawing/2017/model3d" xmlns:o="urn:schemas-microsoft-com:office:office" xmlns:r="http://schemas.openxmlformats.org/officeDocument/2006/relationships" xmlns:m="http://schemas.openxmlformats.org/officeDocument/2006/math" xmlns:v="urn:schemas-microsoft-com:vml" xmlns:wp14="http://schemas.microsoft.com/office/word/2010/wordprocessingDrawing" xmlns:wp="http://schemas.openxmlformats.org/drawingml/2006/wordprocessingDrawing" xmlns:w10="urn:schemas-microsoft-com:office:word" xmlns:w="http://schemas.openxmlformats.org/wordprocessingml/2006/main" xmlns:w14="http://schemas.microsoft.com/office/word/2010/wordml" xmlns:w15="http://schemas.microsoft.com/office/word/2012/wordml" xmlns:w16cex="http://schemas.microsoft.com/office/word/2018/wordml/cex" xmlns:w16cid="http://schemas.microsoft.com/office/word/2016/wordml/cid" xmlns:w16="http://schemas.microsoft.com/office/word/2018/wordml" xmlns:w16sdtdh="http://schemas.microsoft.com/office/word/2020/wordml/sdtdatahash" xmlns:w16se="http://schemas.microsoft.com/office/word/2015/wordml/symex" xmlns:wpg="http://schemas.microsoft.com/office/word/2010/wordprocessingGroup" xmlns:wpi="http://schemas.microsoft.com/office/word/2010/wordprocessingInk" xmlns:wne="http://schemas.microsoft.com/office/word/2006/wordml" xmlns:wps="http://schemas.microsoft.com/office/word/2010/wordprocessingShape" mc:Ignorable="w14 w15 w16se w16cid w16 w16cex w16sdtdh wp14">
+<w:document xmlns:wpc="http://schemas.microsoft.com/office/word/2010/wordprocessingCanvas" xmlns:cx="http://schemas.microsoft.com/office/drawing/2014/chartex" xmlns:cx1="http://schemas.microsoft.com/office/drawing/2015/9/8/chartex" xmlns:cx2="http://schemas.microsoft.com/office/drawing/2015/10/21/chartex" xmlns:cx3="http://schemas.microsoft.com/office/drawing/2016/5/9/chartex" xmlns:cx4="http://schemas.microsoft.com/office/drawing/2016/5/10/chartex" xmlns:cx5="http://schemas.microsoft.com/office/drawing/2016/5/11/chartex" xmlns:cx6="http://schemas.microsoft.com/office/drawing/2016/5/12/chartex" xmlns:cx7="http://schemas.microsoft.com/office/drawing/2016/5/13/chartex" xmlns:cx8="http://schemas.microsoft.com/office/drawing/2016/5/14/chartex" xmlns:mc="http://schemas.openxmlformats.org/markup-compatibility/2006" xmlns:aink="http://schemas.microsoft.com/office/drawing/2016/ink" xmlns:am3d="http://schemas.microsoft.com/office/drawing/2017/model3d" xmlns:o="urn:schemas-microsoft-com:office:office" xmlns:oel="http://schemas.microsoft.com/office/2019/extlst" xmlns:r="http://schemas.openxmlformats.org/officeDocument/2006/relationships" xmlns:m="http://schemas.openxmlformats.org/officeDocument/2006/math" xmlns:v="urn:schemas-microsoft-com:vml" xmlns:wp14="http://schemas.microsoft.com/office/word/2010/wordprocessingDrawing" xmlns:wp="http://schemas.openxmlformats.org/drawingml/2006/wordprocessingDrawing" xmlns:w10="urn:schemas-microsoft-com:office:word" xmlns:w="http://schemas.openxmlformats.org/wordprocessingml/2006/main" xmlns:w14="http://schemas.microsoft.com/office/word/2010/wordml" xmlns:w15="http://schemas.microsoft.com/office/word/2012/wordml" xmlns:w16cex="http://schemas.microsoft.com/office/word/2018/wordml/cex" xmlns:w16cid="http://schemas.microsoft.com/office/word/2016/wordml/cid" xmlns:w16="http://schemas.microsoft.com/office/word/2018/wordml" xmlns:w16du="http://schemas.microsoft.com/office/word/2023/wordml/word16du" xmlns:w16sdtdh="http://schemas.microsoft.com/office/word/2020/wordml/sdtdatahash" xmlns:w16se="http://schemas.microsoft.com/office/word/2015/wordml/symex" xmlns:wpg="http://schemas.microsoft.com/office/word/2010/wordprocessingGroup" xmlns:wpi="http://schemas.microsoft.com/office/word/2010/wordprocessingInk" xmlns:wne="http://schemas.microsoft.com/office/word/2006/wordml" xmlns:wps="http://schemas.microsoft.com/office/word/2010/wordprocessingShape" mc:Ignorable="w14 w15 w16se w16cid w16 w16cex w16sdtdh w16du wp14">
   <w:body>
     <w:p>
       <w:pPr>
@@ -110,9 +110,9 @@
                 <w:color w:val="000000"/>
                 <w:sz w:val="22"/>
                 <w:szCs w:val="22"/>
-                <w:lang w:eastAsia="en-US"/>
-              </w:rPr>
-              <w:instrText xml:space="preserve"> MERGEFIELD  MILITARY_UNIT  \* MERGEFORMAT </w:instrText>
+                <w:lang w:val="ru-RU" w:eastAsia="en-US"/>
+              </w:rPr>
+              <w:instrText xml:space="preserve"> MERGEFIELD  MIL_UNIT  \* MERGEFORMAT </w:instrText>
             </w:r>
             <w:r>
               <w:rPr>
@@ -131,10 +131,11 @@
                 <w:rFonts w:eastAsia="Calibri"/>
                 <w:b/>
                 <w:bCs/>
+                <w:noProof/>
                 <w:color w:val="000000"/>
                 <w:sz w:val="22"/>
                 <w:szCs w:val="22"/>
-                <w:lang w:eastAsia="en-US"/>
+                <w:lang w:val="ru-RU" w:eastAsia="en-US"/>
               </w:rPr>
               <w:t>«MIL_UNIT»</w:t>
             </w:r>
@@ -352,8 +353,8 @@
         <w:tblLook w:val="04A0" w:firstRow="1" w:lastRow="0" w:firstColumn="1" w:lastColumn="0" w:noHBand="0" w:noVBand="1"/>
       </w:tblPr>
       <w:tblGrid>
-        <w:gridCol w:w="2298"/>
-        <w:gridCol w:w="2486"/>
+        <w:gridCol w:w="2217"/>
+        <w:gridCol w:w="2351"/>
       </w:tblGrid>
       <w:tr>
         <w:tc>
@@ -435,9 +436,9 @@
                 <w:color w:val="000000"/>
                 <w:sz w:val="22"/>
                 <w:szCs w:val="22"/>
-                <w:lang w:eastAsia="en-US"/>
-              </w:rPr>
-              <w:instrText xml:space="preserve"> MERGEFIELD  MILITARY_UNIT  \* MERGEFORMAT </w:instrText>
+                <w:lang w:val="ru-RU" w:eastAsia="en-US"/>
+              </w:rPr>
+              <w:instrText xml:space="preserve"> MERGEFIELD  MIL_UNIT  \* MERGEFORMAT </w:instrText>
             </w:r>
             <w:r>
               <w:rPr>
@@ -452,10 +453,11 @@
             <w:r>
               <w:rPr>
                 <w:rFonts w:eastAsia="Calibri"/>
+                <w:noProof/>
                 <w:color w:val="000000"/>
                 <w:sz w:val="22"/>
                 <w:szCs w:val="22"/>
-                <w:lang w:eastAsia="en-US"/>
+                <w:lang w:val="ru-RU" w:eastAsia="en-US"/>
               </w:rPr>
               <w:t>«MIL_UNIT»</w:t>
             </w:r>
@@ -503,9 +505,9 @@
                 <w:color w:val="000000"/>
                 <w:sz w:val="22"/>
                 <w:szCs w:val="22"/>
-                <w:lang w:eastAsia="en-US"/>
-              </w:rPr>
-              <w:instrText xml:space="preserve"> MERGEFIELD  COMMANDER_RANK  \* MERGEFORMAT </w:instrText>
+                <w:lang w:val="ru-RU" w:eastAsia="en-US"/>
+              </w:rPr>
+              <w:instrText xml:space="preserve"> MERGEFIELD  COMM_RANK  \* MERGEFORMAT </w:instrText>
             </w:r>
             <w:r>
               <w:rPr>
@@ -520,10 +522,11 @@
             <w:r>
               <w:rPr>
                 <w:rFonts w:eastAsia="Calibri"/>
+                <w:noProof/>
                 <w:color w:val="000000"/>
                 <w:sz w:val="22"/>
                 <w:szCs w:val="22"/>
-                <w:lang w:eastAsia="en-US"/>
+                <w:lang w:val="ru-RU" w:eastAsia="en-US"/>
               </w:rPr>
               <w:t>«COMM_RANK»</w:t>
             </w:r>
@@ -570,9 +573,9 @@
                 <w:color w:val="000000"/>
                 <w:sz w:val="22"/>
                 <w:szCs w:val="22"/>
-                <w:lang w:eastAsia="en-US"/>
-              </w:rPr>
-              <w:instrText xml:space="preserve"> MERGEFIELD  UNIT_COMMANDER  \* MERGEFORMAT </w:instrText>
+                <w:lang w:val="ru-RU" w:eastAsia="en-US"/>
+              </w:rPr>
+              <w:instrText xml:space="preserve"> MERGEFIELD  UNIT_COMM  \* MERGEFORMAT </w:instrText>
             </w:r>
             <w:r>
               <w:rPr>
@@ -587,10 +590,11 @@
             <w:r>
               <w:rPr>
                 <w:rFonts w:eastAsia="Calibri"/>
+                <w:noProof/>
                 <w:color w:val="000000"/>
                 <w:sz w:val="22"/>
                 <w:szCs w:val="22"/>
-                <w:lang w:eastAsia="en-US"/>
+                <w:lang w:val="ru-RU" w:eastAsia="en-US"/>
               </w:rPr>
               <w:t>«UNIT_COMM»</w:t>
             </w:r>
@@ -661,7 +665,7 @@
                 <w:szCs w:val="24"/>
                 <w:lang w:val="ru-RU"/>
               </w:rPr>
-              <w:t>2025</w:t>
+              <w:t>2026</w:t>
             </w:r>
             <w:r>
               <w:rPr>
@@ -737,7 +741,7 @@
         <w:tblLook w:val="04A0" w:firstRow="1" w:lastRow="0" w:firstColumn="1" w:lastColumn="0" w:noHBand="0" w:noVBand="1"/>
       </w:tblPr>
       <w:tblGrid>
-        <w:gridCol w:w="3650"/>
+        <w:gridCol w:w="3434"/>
       </w:tblGrid>
       <w:tr>
         <w:tc>
@@ -860,7 +864,7 @@
     </w:p>
     <w:tbl>
       <w:tblPr>
-        <w:tblW w:w="10349" w:type="dxa"/>
+        <w:tblW w:w="9849" w:type="dxa"/>
         <w:tblInd w:w="-356" w:type="dxa"/>
         <w:tblBorders>
           <w:top w:val="single" w:sz="4" w:space="0" w:color="auto"/>
@@ -876,18 +880,19 @@
           <w:right w:w="70" w:type="dxa"/>
         </w:tblCellMar>
         <w:tblLook w:val="0000" w:firstRow="0" w:lastRow="0" w:firstColumn="0" w:lastColumn="0" w:noHBand="0" w:noVBand="0"/>
+        <w:tblCaption w:val="TABLE_ASSETS"/>
       </w:tblPr>
       <w:tblGrid>
         <w:gridCol w:w="1702"/>
-        <w:gridCol w:w="567"/>
-        <w:gridCol w:w="992"/>
+        <w:gridCol w:w="492"/>
+        <w:gridCol w:w="1067"/>
         <w:gridCol w:w="993"/>
         <w:gridCol w:w="708"/>
         <w:gridCol w:w="709"/>
         <w:gridCol w:w="992"/>
         <w:gridCol w:w="1276"/>
         <w:gridCol w:w="992"/>
-        <w:gridCol w:w="1418"/>
+        <w:gridCol w:w="918"/>
       </w:tblGrid>
       <w:tr>
         <w:trPr>
@@ -911,7 +916,7 @@
         </w:tc>
         <w:tc>
           <w:tcPr>
-            <w:tcW w:w="2410" w:type="dxa"/>
+            <w:tcW w:w="1910" w:type="dxa"/>
             <w:gridSpan w:val="2"/>
           </w:tcPr>
           <w:p>
@@ -938,7 +943,7 @@
             <w:pPr>
               <w:jc w:val="center"/>
             </w:pPr>
-            <w:fldSimple w:instr=" MERGEFIELD  DOCUMENT_NUMBER  \* MERGEFORMAT ">
+            <w:fldSimple w:instr=" MERGEFIELD  DOC_NUMBER  \* MERGEFORMAT ">
               <w:r>
                 <w:rPr>
                   <w:noProof/>
@@ -950,34 +955,21 @@
         </w:tc>
         <w:tc>
           <w:tcPr>
-            <w:tcW w:w="2410" w:type="dxa"/>
+            <w:tcW w:w="1910" w:type="dxa"/>
             <w:gridSpan w:val="2"/>
           </w:tcPr>
           <w:p>
             <w:pPr>
               <w:jc w:val="center"/>
             </w:pPr>
-            <w:r>
-              <w:fldChar w:fldCharType="begin"/>
-            </w:r>
-            <w:r>
-              <w:instrText xml:space="preserve"> MERGEFIELD  DOC_DATE  \* MERGEFORMAT </w:instrText>
-            </w:r>
-            <w:r>
-              <w:fldChar w:fldCharType="separate"/>
-            </w:r>
-            <w:r>
-              <w:rPr>
-                <w:noProof/>
-              </w:rPr>
-              <w:t>«DOC_DATE»</w:t>
-            </w:r>
-            <w:r>
-              <w:rPr>
-                <w:noProof/>
-              </w:rPr>
-              <w:fldChar w:fldCharType="end"/>
-            </w:r>
+            <w:fldSimple w:instr=" MERGEFIELD  DOC_DATE  \* MERGEFORMAT ">
+              <w:r>
+                <w:rPr>
+                  <w:noProof/>
+                </w:rPr>
+                <w:t>«DOC_DATE»</w:t>
+              </w:r>
+            </w:fldSimple>
           </w:p>
         </w:tc>
       </w:tr>
@@ -1009,7 +1001,7 @@
         </w:tc>
         <w:tc>
           <w:tcPr>
-            <w:tcW w:w="567" w:type="dxa"/>
+            <w:tcW w:w="492" w:type="dxa"/>
             <w:vMerge w:val="restart"/>
           </w:tcPr>
           <w:p>
@@ -1027,6 +1019,72 @@
                 <w:szCs w:val="18"/>
               </w:rPr>
               <w:t>К-сть</w:t>
+            </w:r>
+          </w:p>
+        </w:tc>
+        <w:tc>
+          <w:tcPr>
+            <w:tcW w:w="1067" w:type="dxa"/>
+            <w:vMerge w:val="restart"/>
+          </w:tcPr>
+          <w:p>
+            <w:pPr>
+              <w:jc w:val="center"/>
+              <w:rPr>
+                <w:sz w:val="18"/>
+                <w:szCs w:val="18"/>
+              </w:rPr>
+            </w:pPr>
+            <w:r>
+              <w:rPr>
+                <w:sz w:val="18"/>
+                <w:szCs w:val="18"/>
+              </w:rPr>
+              <w:t>Первісна вартість</w:t>
+            </w:r>
+          </w:p>
+        </w:tc>
+        <w:tc>
+          <w:tcPr>
+            <w:tcW w:w="993" w:type="dxa"/>
+            <w:vMerge w:val="restart"/>
+          </w:tcPr>
+          <w:p>
+            <w:pPr>
+              <w:jc w:val="center"/>
+              <w:rPr>
+                <w:sz w:val="18"/>
+                <w:szCs w:val="18"/>
+              </w:rPr>
+            </w:pPr>
+            <w:r>
+              <w:rPr>
+                <w:sz w:val="18"/>
+                <w:szCs w:val="18"/>
+              </w:rPr>
+              <w:t>Сума всього</w:t>
+            </w:r>
+          </w:p>
+        </w:tc>
+        <w:tc>
+          <w:tcPr>
+            <w:tcW w:w="1417" w:type="dxa"/>
+            <w:gridSpan w:val="2"/>
+          </w:tcPr>
+          <w:p>
+            <w:pPr>
+              <w:jc w:val="center"/>
+              <w:rPr>
+                <w:sz w:val="18"/>
+                <w:szCs w:val="18"/>
+              </w:rPr>
+            </w:pPr>
+            <w:r>
+              <w:rPr>
+                <w:sz w:val="18"/>
+                <w:szCs w:val="18"/>
+              </w:rPr>
+              <w:t>Знос</w:t>
             </w:r>
           </w:p>
         </w:tc>
@@ -1048,13 +1106,13 @@
                 <w:sz w:val="18"/>
                 <w:szCs w:val="18"/>
               </w:rPr>
-              <w:t>Первісна вартість</w:t>
-            </w:r>
-          </w:p>
-        </w:tc>
-        <w:tc>
-          <w:tcPr>
-            <w:tcW w:w="993" w:type="dxa"/>
+              <w:t>Ліквідаційна вартість</w:t>
+            </w:r>
+          </w:p>
+        </w:tc>
+        <w:tc>
+          <w:tcPr>
+            <w:tcW w:w="1276" w:type="dxa"/>
             <w:vMerge w:val="restart"/>
           </w:tcPr>
           <w:p>
@@ -1070,29 +1128,7 @@
                 <w:sz w:val="18"/>
                 <w:szCs w:val="18"/>
               </w:rPr>
-              <w:t>Сума всього</w:t>
-            </w:r>
-          </w:p>
-        </w:tc>
-        <w:tc>
-          <w:tcPr>
-            <w:tcW w:w="1417" w:type="dxa"/>
-            <w:gridSpan w:val="2"/>
-          </w:tcPr>
-          <w:p>
-            <w:pPr>
-              <w:jc w:val="center"/>
-              <w:rPr>
-                <w:sz w:val="18"/>
-                <w:szCs w:val="18"/>
-              </w:rPr>
-            </w:pPr>
-            <w:r>
-              <w:rPr>
-                <w:sz w:val="18"/>
-                <w:szCs w:val="18"/>
-              </w:rPr>
-              <w:t>Знос</w:t>
+              <w:t>Строк корисного використання</w:t>
             </w:r>
           </w:p>
         </w:tc>
@@ -1103,50 +1139,7 @@
           </w:tcPr>
           <w:p>
             <w:pPr>
-              <w:jc w:val="center"/>
-              <w:rPr>
-                <w:sz w:val="18"/>
-                <w:szCs w:val="18"/>
-              </w:rPr>
-            </w:pPr>
-            <w:r>
-              <w:rPr>
-                <w:sz w:val="18"/>
-                <w:szCs w:val="18"/>
-              </w:rPr>
-              <w:t>Ліквідаційна вартість</w:t>
-            </w:r>
-          </w:p>
-        </w:tc>
-        <w:tc>
-          <w:tcPr>
-            <w:tcW w:w="1276" w:type="dxa"/>
-            <w:vMerge w:val="restart"/>
-          </w:tcPr>
-          <w:p>
-            <w:pPr>
-              <w:jc w:val="center"/>
-              <w:rPr>
-                <w:sz w:val="18"/>
-                <w:szCs w:val="18"/>
-              </w:rPr>
-            </w:pPr>
-            <w:r>
-              <w:rPr>
-                <w:sz w:val="18"/>
-                <w:szCs w:val="18"/>
-              </w:rPr>
-              <w:t>Строк корисного використання</w:t>
-            </w:r>
-          </w:p>
-        </w:tc>
-        <w:tc>
-          <w:tcPr>
-            <w:tcW w:w="992" w:type="dxa"/>
-            <w:vMerge w:val="restart"/>
-          </w:tcPr>
-          <w:p>
-            <w:pPr>
+              <w:ind w:left="-7" w:right="-1"/>
               <w:jc w:val="center"/>
               <w:rPr>
                 <w:sz w:val="18"/>
@@ -1180,7 +1173,7 @@
         </w:tc>
         <w:tc>
           <w:tcPr>
-            <w:tcW w:w="1418" w:type="dxa"/>
+            <w:tcW w:w="918" w:type="dxa"/>
             <w:vMerge w:val="restart"/>
           </w:tcPr>
           <w:p>
@@ -1227,13 +1220,79 @@
         </w:tc>
         <w:tc>
           <w:tcPr>
-            <w:tcW w:w="567" w:type="dxa"/>
+            <w:tcW w:w="492" w:type="dxa"/>
             <w:vMerge/>
           </w:tcPr>
           <w:p>
             <w:pPr>
               <w:jc w:val="center"/>
             </w:pPr>
+          </w:p>
+        </w:tc>
+        <w:tc>
+          <w:tcPr>
+            <w:tcW w:w="1067" w:type="dxa"/>
+            <w:vMerge/>
+          </w:tcPr>
+          <w:p>
+            <w:pPr>
+              <w:jc w:val="center"/>
+            </w:pPr>
+          </w:p>
+        </w:tc>
+        <w:tc>
+          <w:tcPr>
+            <w:tcW w:w="993" w:type="dxa"/>
+            <w:vMerge/>
+          </w:tcPr>
+          <w:p>
+            <w:pPr>
+              <w:jc w:val="center"/>
+            </w:pPr>
+          </w:p>
+        </w:tc>
+        <w:tc>
+          <w:tcPr>
+            <w:tcW w:w="708" w:type="dxa"/>
+          </w:tcPr>
+          <w:p>
+            <w:pPr>
+              <w:ind w:right="-70"/>
+              <w:jc w:val="center"/>
+              <w:rPr>
+                <w:sz w:val="16"/>
+                <w:szCs w:val="16"/>
+              </w:rPr>
+            </w:pPr>
+            <w:r>
+              <w:rPr>
+                <w:sz w:val="16"/>
+                <w:szCs w:val="16"/>
+              </w:rPr>
+              <w:t>за одиницю</w:t>
+            </w:r>
+          </w:p>
+        </w:tc>
+        <w:tc>
+          <w:tcPr>
+            <w:tcW w:w="709" w:type="dxa"/>
+          </w:tcPr>
+          <w:p>
+            <w:pPr>
+              <w:ind w:right="-70"/>
+              <w:jc w:val="center"/>
+              <w:rPr>
+                <w:sz w:val="16"/>
+                <w:szCs w:val="16"/>
+              </w:rPr>
+            </w:pPr>
+            <w:r>
+              <w:rPr>
+                <w:sz w:val="16"/>
+                <w:szCs w:val="16"/>
+              </w:rPr>
+              <w:t>всього</w:t>
+            </w:r>
           </w:p>
         </w:tc>
         <w:tc>
@@ -1249,57 +1308,13 @@
         </w:tc>
         <w:tc>
           <w:tcPr>
-            <w:tcW w:w="993" w:type="dxa"/>
+            <w:tcW w:w="1276" w:type="dxa"/>
             <w:vMerge/>
           </w:tcPr>
           <w:p>
             <w:pPr>
               <w:jc w:val="center"/>
             </w:pPr>
-          </w:p>
-        </w:tc>
-        <w:tc>
-          <w:tcPr>
-            <w:tcW w:w="708" w:type="dxa"/>
-          </w:tcPr>
-          <w:p>
-            <w:pPr>
-              <w:ind w:right="-70"/>
-              <w:jc w:val="center"/>
-              <w:rPr>
-                <w:sz w:val="16"/>
-                <w:szCs w:val="16"/>
-              </w:rPr>
-            </w:pPr>
-            <w:r>
-              <w:rPr>
-                <w:sz w:val="16"/>
-                <w:szCs w:val="16"/>
-              </w:rPr>
-              <w:t>за одиницю</w:t>
-            </w:r>
-          </w:p>
-        </w:tc>
-        <w:tc>
-          <w:tcPr>
-            <w:tcW w:w="709" w:type="dxa"/>
-          </w:tcPr>
-          <w:p>
-            <w:pPr>
-              <w:ind w:right="-70"/>
-              <w:jc w:val="center"/>
-              <w:rPr>
-                <w:sz w:val="16"/>
-                <w:szCs w:val="16"/>
-              </w:rPr>
-            </w:pPr>
-            <w:r>
-              <w:rPr>
-                <w:sz w:val="16"/>
-                <w:szCs w:val="16"/>
-              </w:rPr>
-              <w:t>всього</w:t>
-            </w:r>
           </w:p>
         </w:tc>
         <w:tc>
@@ -1315,29 +1330,7 @@
         </w:tc>
         <w:tc>
           <w:tcPr>
-            <w:tcW w:w="1276" w:type="dxa"/>
-            <w:vMerge/>
-          </w:tcPr>
-          <w:p>
-            <w:pPr>
-              <w:jc w:val="center"/>
-            </w:pPr>
-          </w:p>
-        </w:tc>
-        <w:tc>
-          <w:tcPr>
-            <w:tcW w:w="992" w:type="dxa"/>
-            <w:vMerge/>
-          </w:tcPr>
-          <w:p>
-            <w:pPr>
-              <w:jc w:val="center"/>
-            </w:pPr>
-          </w:p>
-        </w:tc>
-        <w:tc>
-          <w:tcPr>
-            <w:tcW w:w="1418" w:type="dxa"/>
+            <w:tcW w:w="918" w:type="dxa"/>
             <w:vMerge/>
           </w:tcPr>
           <w:p>
@@ -1363,7 +1356,7 @@
         </w:tc>
         <w:tc>
           <w:tcPr>
-            <w:tcW w:w="567" w:type="dxa"/>
+            <w:tcW w:w="492" w:type="dxa"/>
           </w:tcPr>
           <w:p>
             <w:pPr>
@@ -1376,6 +1369,58 @@
         </w:tc>
         <w:tc>
           <w:tcPr>
+            <w:tcW w:w="1067" w:type="dxa"/>
+          </w:tcPr>
+          <w:p>
+            <w:pPr>
+              <w:jc w:val="center"/>
+            </w:pPr>
+            <w:r>
+              <w:t>3</w:t>
+            </w:r>
+          </w:p>
+        </w:tc>
+        <w:tc>
+          <w:tcPr>
+            <w:tcW w:w="993" w:type="dxa"/>
+          </w:tcPr>
+          <w:p>
+            <w:pPr>
+              <w:jc w:val="center"/>
+            </w:pPr>
+            <w:r>
+              <w:t>4</w:t>
+            </w:r>
+          </w:p>
+        </w:tc>
+        <w:tc>
+          <w:tcPr>
+            <w:tcW w:w="708" w:type="dxa"/>
+          </w:tcPr>
+          <w:p>
+            <w:pPr>
+              <w:jc w:val="center"/>
+            </w:pPr>
+            <w:r>
+              <w:t>5</w:t>
+            </w:r>
+          </w:p>
+        </w:tc>
+        <w:tc>
+          <w:tcPr>
+            <w:tcW w:w="709" w:type="dxa"/>
+          </w:tcPr>
+          <w:p>
+            <w:pPr>
+              <w:jc w:val="center"/>
+            </w:pPr>
+            <w:r>
+              <w:t>6</w:t>
+            </w:r>
+          </w:p>
+        </w:tc>
+        <w:tc>
+          <w:tcPr>
             <w:tcW w:w="992" w:type="dxa"/>
           </w:tcPr>
           <w:p>
@@ -1383,46 +1428,20 @@
               <w:jc w:val="center"/>
             </w:pPr>
             <w:r>
-              <w:t>3</w:t>
-            </w:r>
-          </w:p>
-        </w:tc>
-        <w:tc>
-          <w:tcPr>
-            <w:tcW w:w="993" w:type="dxa"/>
-          </w:tcPr>
-          <w:p>
-            <w:pPr>
-              <w:jc w:val="center"/>
-            </w:pPr>
-            <w:r>
-              <w:t>4</w:t>
-            </w:r>
-          </w:p>
-        </w:tc>
-        <w:tc>
-          <w:tcPr>
-            <w:tcW w:w="708" w:type="dxa"/>
-          </w:tcPr>
-          <w:p>
-            <w:pPr>
-              <w:jc w:val="center"/>
-            </w:pPr>
-            <w:r>
-              <w:t>5</w:t>
-            </w:r>
-          </w:p>
-        </w:tc>
-        <w:tc>
-          <w:tcPr>
-            <w:tcW w:w="709" w:type="dxa"/>
-          </w:tcPr>
-          <w:p>
-            <w:pPr>
-              <w:jc w:val="center"/>
-            </w:pPr>
-            <w:r>
-              <w:t>6</w:t>
+              <w:t>7</w:t>
+            </w:r>
+          </w:p>
+        </w:tc>
+        <w:tc>
+          <w:tcPr>
+            <w:tcW w:w="1276" w:type="dxa"/>
+          </w:tcPr>
+          <w:p>
+            <w:pPr>
+              <w:jc w:val="center"/>
+            </w:pPr>
+            <w:r>
+              <w:t>8</w:t>
             </w:r>
           </w:p>
         </w:tc>
@@ -1435,39 +1454,13 @@
               <w:jc w:val="center"/>
             </w:pPr>
             <w:r>
-              <w:t>7</w:t>
-            </w:r>
-          </w:p>
-        </w:tc>
-        <w:tc>
-          <w:tcPr>
-            <w:tcW w:w="1276" w:type="dxa"/>
-          </w:tcPr>
-          <w:p>
-            <w:pPr>
-              <w:jc w:val="center"/>
-            </w:pPr>
-            <w:r>
-              <w:t>8</w:t>
-            </w:r>
-          </w:p>
-        </w:tc>
-        <w:tc>
-          <w:tcPr>
-            <w:tcW w:w="992" w:type="dxa"/>
-          </w:tcPr>
-          <w:p>
-            <w:pPr>
-              <w:jc w:val="center"/>
-            </w:pPr>
-            <w:r>
               <w:t>9</w:t>
             </w:r>
           </w:p>
         </w:tc>
         <w:tc>
           <w:tcPr>
-            <w:tcW w:w="1418" w:type="dxa"/>
+            <w:tcW w:w="918" w:type="dxa"/>
           </w:tcPr>
           <w:p>
             <w:pPr>
@@ -1492,7 +1485,47 @@
         </w:tc>
         <w:tc>
           <w:tcPr>
-            <w:tcW w:w="567" w:type="dxa"/>
+            <w:tcW w:w="492" w:type="dxa"/>
+          </w:tcPr>
+          <w:p>
+            <w:pPr>
+              <w:jc w:val="center"/>
+            </w:pPr>
+          </w:p>
+        </w:tc>
+        <w:tc>
+          <w:tcPr>
+            <w:tcW w:w="1067" w:type="dxa"/>
+          </w:tcPr>
+          <w:p>
+            <w:pPr>
+              <w:jc w:val="center"/>
+            </w:pPr>
+          </w:p>
+        </w:tc>
+        <w:tc>
+          <w:tcPr>
+            <w:tcW w:w="993" w:type="dxa"/>
+          </w:tcPr>
+          <w:p>
+            <w:pPr>
+              <w:jc w:val="center"/>
+            </w:pPr>
+          </w:p>
+        </w:tc>
+        <w:tc>
+          <w:tcPr>
+            <w:tcW w:w="708" w:type="dxa"/>
+          </w:tcPr>
+          <w:p>
+            <w:pPr>
+              <w:jc w:val="center"/>
+            </w:pPr>
+          </w:p>
+        </w:tc>
+        <w:tc>
+          <w:tcPr>
+            <w:tcW w:w="709" w:type="dxa"/>
           </w:tcPr>
           <w:p>
             <w:pPr>
@@ -1512,27 +1545,7 @@
         </w:tc>
         <w:tc>
           <w:tcPr>
-            <w:tcW w:w="993" w:type="dxa"/>
-          </w:tcPr>
-          <w:p>
-            <w:pPr>
-              <w:jc w:val="center"/>
-            </w:pPr>
-          </w:p>
-        </w:tc>
-        <w:tc>
-          <w:tcPr>
-            <w:tcW w:w="708" w:type="dxa"/>
-          </w:tcPr>
-          <w:p>
-            <w:pPr>
-              <w:jc w:val="center"/>
-            </w:pPr>
-          </w:p>
-        </w:tc>
-        <w:tc>
-          <w:tcPr>
-            <w:tcW w:w="709" w:type="dxa"/>
+            <w:tcW w:w="1276" w:type="dxa"/>
           </w:tcPr>
           <w:p>
             <w:pPr>
@@ -1552,27 +1565,7 @@
         </w:tc>
         <w:tc>
           <w:tcPr>
-            <w:tcW w:w="1276" w:type="dxa"/>
-          </w:tcPr>
-          <w:p>
-            <w:pPr>
-              <w:jc w:val="center"/>
-            </w:pPr>
-          </w:p>
-        </w:tc>
-        <w:tc>
-          <w:tcPr>
-            <w:tcW w:w="992" w:type="dxa"/>
-          </w:tcPr>
-          <w:p>
-            <w:pPr>
-              <w:jc w:val="center"/>
-            </w:pPr>
-          </w:p>
-        </w:tc>
-        <w:tc>
-          <w:tcPr>
-            <w:tcW w:w="1418" w:type="dxa"/>
+            <w:tcW w:w="918" w:type="dxa"/>
           </w:tcPr>
           <w:p>
             <w:pPr>
@@ -1769,7 +1762,23 @@
           <w:sz w:val="18"/>
           <w:szCs w:val="18"/>
         </w:rPr>
-        <w:t>(назва об’єкта(ів))</w:t>
+        <w:t>(назва об’єкта(</w:t>
+      </w:r>
+      <w:proofErr w:type="spellStart"/>
+      <w:r>
+        <w:rPr>
+          <w:sz w:val="18"/>
+          <w:szCs w:val="18"/>
+        </w:rPr>
+        <w:t>ів</w:t>
+      </w:r>
+      <w:proofErr w:type="spellEnd"/>
+      <w:r>
+        <w:rPr>
+          <w:sz w:val="18"/>
+          <w:szCs w:val="18"/>
+        </w:rPr>
+        <w:t>))</w:t>
       </w:r>
     </w:p>
     <w:tbl>
@@ -1820,7 +1829,27 @@
                 <w:szCs w:val="22"/>
                 <w:lang w:eastAsia="en-US"/>
               </w:rPr>
-              <w:t xml:space="preserve">у момент введення в експлуатацію об’єкт(и) знаходиться(яться) </w:t>
+              <w:t>у момент введення в експлуатацію об’єкт(и) знаходиться(</w:t>
+            </w:r>
+            <w:proofErr w:type="spellStart"/>
+            <w:r>
+              <w:rPr>
+                <w:rFonts w:eastAsia="Calibri"/>
+                <w:sz w:val="22"/>
+                <w:szCs w:val="22"/>
+                <w:lang w:eastAsia="en-US"/>
+              </w:rPr>
+              <w:t>яться</w:t>
+            </w:r>
+            <w:proofErr w:type="spellEnd"/>
+            <w:r>
+              <w:rPr>
+                <w:rFonts w:eastAsia="Calibri"/>
+                <w:sz w:val="22"/>
+                <w:szCs w:val="22"/>
+                <w:lang w:eastAsia="en-US"/>
+              </w:rPr>
+              <w:t xml:space="preserve">) </w:t>
             </w:r>
           </w:p>
         </w:tc>
@@ -1861,7 +1890,7 @@
                 <w:u w:val="single"/>
                 <w:lang w:val="en-US" w:eastAsia="en-US"/>
               </w:rPr>
-              <w:instrText xml:space="preserve"> MERGEFIELD  PLACE_CREATED  \* MERGEFORMAT </w:instrText>
+              <w:instrText xml:space="preserve"> MERGEFIELD  COMMISSIONED_LOCATION  \* MERGEFORMAT </w:instrText>
             </w:r>
             <w:r>
               <w:rPr>
@@ -1884,31 +1913,7 @@
                 <w:u w:val="single"/>
                 <w:lang w:val="en-US" w:eastAsia="en-US"/>
               </w:rPr>
-              <w:t>«COMM</w:t>
-            </w:r>
-            <w:r>
-              <w:rPr>
-                <w:rFonts w:eastAsia="Calibri"/>
-                <w:bCs/>
-                <w:noProof/>
-                <w:sz w:val="22"/>
-                <w:szCs w:val="22"/>
-                <w:u w:val="single"/>
-                <w:lang w:val="en-US" w:eastAsia="en-US"/>
-              </w:rPr>
-              <w:t>ISSIONED</w:t>
-            </w:r>
-            <w:r>
-              <w:rPr>
-                <w:rFonts w:eastAsia="Calibri"/>
-                <w:bCs/>
-                <w:noProof/>
-                <w:sz w:val="22"/>
-                <w:szCs w:val="22"/>
-                <w:u w:val="single"/>
-                <w:lang w:val="en-US" w:eastAsia="en-US"/>
-              </w:rPr>
-              <w:t>_LOCATION»</w:t>
+              <w:t>«COMMISSIONED_LOCATION»</w:t>
             </w:r>
             <w:r>
               <w:rPr>
@@ -1971,7 +1976,27 @@
                 <w:szCs w:val="18"/>
                 <w:lang w:eastAsia="en-US"/>
               </w:rPr>
-              <w:t>(місцезнаходження об’єкта(ів))</w:t>
+              <w:t>(місцезнаходження об’єкта(</w:t>
+            </w:r>
+            <w:proofErr w:type="spellStart"/>
+            <w:r>
+              <w:rPr>
+                <w:rFonts w:eastAsia="Calibri"/>
+                <w:sz w:val="18"/>
+                <w:szCs w:val="18"/>
+                <w:lang w:eastAsia="en-US"/>
+              </w:rPr>
+              <w:t>ів</w:t>
+            </w:r>
+            <w:proofErr w:type="spellEnd"/>
+            <w:r>
+              <w:rPr>
+                <w:rFonts w:eastAsia="Calibri"/>
+                <w:sz w:val="18"/>
+                <w:szCs w:val="18"/>
+                <w:lang w:eastAsia="en-US"/>
+              </w:rPr>
+              <w:t>))</w:t>
             </w:r>
           </w:p>
         </w:tc>
@@ -2019,7 +2044,27 @@
                 <w:szCs w:val="22"/>
                 <w:lang w:eastAsia="en-US"/>
               </w:rPr>
-              <w:t xml:space="preserve">Коротка характеристика об’єкта(ів) </w:t>
+              <w:t>Коротка характеристика об’єкта(</w:t>
+            </w:r>
+            <w:proofErr w:type="spellStart"/>
+            <w:r>
+              <w:rPr>
+                <w:rFonts w:eastAsia="Calibri"/>
+                <w:sz w:val="22"/>
+                <w:szCs w:val="22"/>
+                <w:lang w:eastAsia="en-US"/>
+              </w:rPr>
+              <w:t>ів</w:t>
+            </w:r>
+            <w:proofErr w:type="spellEnd"/>
+            <w:r>
+              <w:rPr>
+                <w:rFonts w:eastAsia="Calibri"/>
+                <w:sz w:val="22"/>
+                <w:szCs w:val="22"/>
+                <w:lang w:eastAsia="en-US"/>
+              </w:rPr>
+              <w:t xml:space="preserve">) </w:t>
             </w:r>
           </w:p>
         </w:tc>
@@ -2066,7 +2111,7 @@
                 <w:u w:val="single"/>
                 <w:lang w:val="en-US" w:eastAsia="en-US"/>
               </w:rPr>
-              <w:instrText xml:space="preserve"> MERGEFIELD  PLACE_CREATED  \* MERGEFORMAT </w:instrText>
+              <w:instrText xml:space="preserve"> MERGEFIELD  SHORT_CHARACTERISTIC  \* MERGEFORMAT </w:instrText>
             </w:r>
             <w:r>
               <w:rPr>
@@ -2089,31 +2134,7 @@
                 <w:u w:val="single"/>
                 <w:lang w:val="en-US" w:eastAsia="en-US"/>
               </w:rPr>
-              <w:t>«SHORT_</w:t>
-            </w:r>
-            <w:r>
-              <w:rPr>
-                <w:rFonts w:eastAsia="Calibri"/>
-                <w:bCs/>
-                <w:noProof/>
-                <w:sz w:val="22"/>
-                <w:szCs w:val="22"/>
-                <w:u w:val="single"/>
-                <w:lang w:val="en-US" w:eastAsia="en-US"/>
-              </w:rPr>
-              <w:t>CHARACTERISTIC</w:t>
-            </w:r>
-            <w:r>
-              <w:rPr>
-                <w:rFonts w:eastAsia="Calibri"/>
-                <w:bCs/>
-                <w:noProof/>
-                <w:sz w:val="22"/>
-                <w:szCs w:val="22"/>
-                <w:u w:val="single"/>
-                <w:lang w:val="en-US" w:eastAsia="en-US"/>
-              </w:rPr>
-              <w:t>»</w:t>
+              <w:t>«SHORT_CHARACTERISTIC»</w:t>
             </w:r>
             <w:r>
               <w:rPr>
@@ -2212,7 +2233,7 @@
                 <w:u w:val="single"/>
                 <w:lang w:val="en-US" w:eastAsia="en-US"/>
               </w:rPr>
-              <w:instrText xml:space="preserve"> MERGEFIELD  PLACE_CREATED  \* MERGEFORMAT </w:instrText>
+              <w:instrText xml:space="preserve"> MERGEFIELD  ASSET_COMPLIANCE  \* MERGEFORMAT </w:instrText>
             </w:r>
             <w:r>
               <w:rPr>
@@ -2389,7 +2410,7 @@
                 <w:u w:val="single"/>
                 <w:lang w:val="en-US" w:eastAsia="en-US"/>
               </w:rPr>
-              <w:instrText xml:space="preserve"> MERGEFIELD  PLACE_CREATED  \* MERGEFORMAT </w:instrText>
+              <w:instrText xml:space="preserve"> MERGEFIELD  COMPLETION_STATE  \* MERGEFORMAT </w:instrText>
             </w:r>
             <w:r>
               <w:rPr>
@@ -2525,7 +2546,27 @@
                 <w:szCs w:val="22"/>
                 <w:lang w:eastAsia="en-US"/>
               </w:rPr>
-              <w:t>Результати випробування об’єкта(ів)</w:t>
+              <w:t>Результати випробування об’єкта(</w:t>
+            </w:r>
+            <w:proofErr w:type="spellStart"/>
+            <w:r>
+              <w:rPr>
+                <w:rFonts w:eastAsia="Calibri"/>
+                <w:sz w:val="22"/>
+                <w:szCs w:val="22"/>
+                <w:lang w:eastAsia="en-US"/>
+              </w:rPr>
+              <w:t>ів</w:t>
+            </w:r>
+            <w:proofErr w:type="spellEnd"/>
+            <w:r>
+              <w:rPr>
+                <w:rFonts w:eastAsia="Calibri"/>
+                <w:sz w:val="22"/>
+                <w:szCs w:val="22"/>
+                <w:lang w:eastAsia="en-US"/>
+              </w:rPr>
+              <w:t>)</w:t>
             </w:r>
           </w:p>
         </w:tc>
@@ -2573,7 +2614,7 @@
                 <w:u w:val="single"/>
                 <w:lang w:val="en-US" w:eastAsia="en-US"/>
               </w:rPr>
-              <w:instrText xml:space="preserve"> MERGEFIELD  PLACE_CREATED  \* MERGEFORMAT </w:instrText>
+              <w:instrText xml:space="preserve"> MERGEFIELD  TEST_RESULTS  \* MERGEFORMAT </w:instrText>
             </w:r>
             <w:r>
               <w:rPr>
@@ -2703,7 +2744,7 @@
                 <w:u w:val="single"/>
                 <w:lang w:val="en-US" w:eastAsia="en-US"/>
               </w:rPr>
-              <w:instrText xml:space="preserve"> MERGEFIELD  PLACE_CREATED  \* MERGEFORMAT </w:instrText>
+              <w:instrText xml:space="preserve"> MERGEFIELD  OTHER_INFO  \* MERGEFORMAT </w:instrText>
             </w:r>
             <w:r>
               <w:rPr>
@@ -2726,31 +2767,7 @@
                 <w:u w:val="single"/>
                 <w:lang w:val="en-US" w:eastAsia="en-US"/>
               </w:rPr>
-              <w:t>«</w:t>
-            </w:r>
-            <w:r>
-              <w:rPr>
-                <w:rFonts w:eastAsia="Calibri"/>
-                <w:bCs/>
-                <w:noProof/>
-                <w:sz w:val="22"/>
-                <w:szCs w:val="22"/>
-                <w:u w:val="single"/>
-                <w:lang w:val="en-US" w:eastAsia="en-US"/>
-              </w:rPr>
-              <w:t>OTHER_INFO</w:t>
-            </w:r>
-            <w:r>
-              <w:rPr>
-                <w:rFonts w:eastAsia="Calibri"/>
-                <w:bCs/>
-                <w:noProof/>
-                <w:sz w:val="22"/>
-                <w:szCs w:val="22"/>
-                <w:u w:val="single"/>
-                <w:lang w:val="en-US" w:eastAsia="en-US"/>
-              </w:rPr>
-              <w:t>»</w:t>
+              <w:t>«OTHER_INFO»</w:t>
             </w:r>
             <w:r>
               <w:rPr>
@@ -2858,7 +2875,7 @@
                 <w:u w:val="single"/>
                 <w:lang w:val="en-US" w:eastAsia="en-US"/>
               </w:rPr>
-              <w:instrText xml:space="preserve"> MERGEFIELD  PLACE_CREATED  \* MERGEFORMAT </w:instrText>
+              <w:instrText xml:space="preserve"> MERGEFIELD  COMISSION_CONCLUSION  \* MERGEFORMAT </w:instrText>
             </w:r>
             <w:r>
               <w:rPr>
@@ -2881,31 +2898,7 @@
                 <w:u w:val="single"/>
                 <w:lang w:val="en-US" w:eastAsia="en-US"/>
               </w:rPr>
-              <w:t>«</w:t>
-            </w:r>
-            <w:r>
-              <w:rPr>
-                <w:rFonts w:eastAsia="Calibri"/>
-                <w:bCs/>
-                <w:noProof/>
-                <w:sz w:val="22"/>
-                <w:szCs w:val="22"/>
-                <w:u w:val="single"/>
-                <w:lang w:val="en-US" w:eastAsia="en-US"/>
-              </w:rPr>
-              <w:t>COMISSION_CONCLUSION</w:t>
-            </w:r>
-            <w:r>
-              <w:rPr>
-                <w:rFonts w:eastAsia="Calibri"/>
-                <w:bCs/>
-                <w:noProof/>
-                <w:sz w:val="22"/>
-                <w:szCs w:val="22"/>
-                <w:u w:val="single"/>
-                <w:lang w:val="en-US" w:eastAsia="en-US"/>
-              </w:rPr>
-              <w:t>»</w:t>
+              <w:t>«COMISSION_CONCLUSION»</w:t>
             </w:r>
             <w:r>
               <w:rPr>
@@ -3013,7 +3006,7 @@
                 <w:u w:val="single"/>
                 <w:lang w:val="en-US" w:eastAsia="en-US"/>
               </w:rPr>
-              <w:instrText xml:space="preserve"> MERGEFIELD  PLACE_CREATED  \* MERGEFORMAT </w:instrText>
+              <w:instrText xml:space="preserve"> MERGEFIELD  ATTACHED_DOCUMENTATION  \* MERGEFORMAT </w:instrText>
             </w:r>
             <w:r>
               <w:rPr>
@@ -3036,31 +3029,7 @@
                 <w:u w:val="single"/>
                 <w:lang w:val="en-US" w:eastAsia="en-US"/>
               </w:rPr>
-              <w:t>«</w:t>
-            </w:r>
-            <w:r>
-              <w:rPr>
-                <w:rFonts w:eastAsia="Calibri"/>
-                <w:bCs/>
-                <w:noProof/>
-                <w:sz w:val="22"/>
-                <w:szCs w:val="22"/>
-                <w:u w:val="single"/>
-                <w:lang w:val="en-US" w:eastAsia="en-US"/>
-              </w:rPr>
-              <w:t>ATTACHED_DOCUMENTATION</w:t>
-            </w:r>
-            <w:r>
-              <w:rPr>
-                <w:rFonts w:eastAsia="Calibri"/>
-                <w:bCs/>
-                <w:noProof/>
-                <w:sz w:val="22"/>
-                <w:szCs w:val="22"/>
-                <w:u w:val="single"/>
-                <w:lang w:val="en-US" w:eastAsia="en-US"/>
-              </w:rPr>
-              <w:t>»</w:t>
+              <w:t>«ATTACHED_DOCUMENTATION»</w:t>
             </w:r>
             <w:r>
               <w:rPr>
@@ -3505,7 +3474,27 @@
                 <w:szCs w:val="18"/>
                 <w:lang w:val="ru-RU" w:eastAsia="en-US"/>
               </w:rPr>
-              <w:t>(підпис)</w:t>
+              <w:t>(</w:t>
+            </w:r>
+            <w:proofErr w:type="spellStart"/>
+            <w:r>
+              <w:rPr>
+                <w:rFonts w:eastAsia="Calibri"/>
+                <w:sz w:val="18"/>
+                <w:szCs w:val="18"/>
+                <w:lang w:val="ru-RU" w:eastAsia="en-US"/>
+              </w:rPr>
+              <w:t>підпис</w:t>
+            </w:r>
+            <w:proofErr w:type="spellEnd"/>
+            <w:r>
+              <w:rPr>
+                <w:rFonts w:eastAsia="Calibri"/>
+                <w:sz w:val="18"/>
+                <w:szCs w:val="18"/>
+                <w:lang w:val="ru-RU" w:eastAsia="en-US"/>
+              </w:rPr>
+              <w:t>)</w:t>
             </w:r>
           </w:p>
         </w:tc>
@@ -3539,7 +3528,47 @@
                 <w:szCs w:val="18"/>
                 <w:lang w:val="ru-RU" w:eastAsia="en-US"/>
               </w:rPr>
-              <w:t>(ініціали та прізвище)</w:t>
+              <w:t>(</w:t>
+            </w:r>
+            <w:proofErr w:type="spellStart"/>
+            <w:r>
+              <w:rPr>
+                <w:rFonts w:eastAsia="Calibri"/>
+                <w:sz w:val="18"/>
+                <w:szCs w:val="18"/>
+                <w:lang w:val="ru-RU" w:eastAsia="en-US"/>
+              </w:rPr>
+              <w:t>ініціали</w:t>
+            </w:r>
+            <w:proofErr w:type="spellEnd"/>
+            <w:r>
+              <w:rPr>
+                <w:rFonts w:eastAsia="Calibri"/>
+                <w:sz w:val="18"/>
+                <w:szCs w:val="18"/>
+                <w:lang w:val="ru-RU" w:eastAsia="en-US"/>
+              </w:rPr>
+              <w:t xml:space="preserve"> та </w:t>
+            </w:r>
+            <w:proofErr w:type="spellStart"/>
+            <w:r>
+              <w:rPr>
+                <w:rFonts w:eastAsia="Calibri"/>
+                <w:sz w:val="18"/>
+                <w:szCs w:val="18"/>
+                <w:lang w:val="ru-RU" w:eastAsia="en-US"/>
+              </w:rPr>
+              <w:t>прізвище</w:t>
+            </w:r>
+            <w:proofErr w:type="spellEnd"/>
+            <w:r>
+              <w:rPr>
+                <w:rFonts w:eastAsia="Calibri"/>
+                <w:sz w:val="18"/>
+                <w:szCs w:val="18"/>
+                <w:lang w:val="ru-RU" w:eastAsia="en-US"/>
+              </w:rPr>
+              <w:t>)</w:t>
             </w:r>
           </w:p>
         </w:tc>
@@ -3983,7 +4012,47 @@
                 <w:szCs w:val="18"/>
                 <w:lang w:val="ru-RU" w:eastAsia="en-US"/>
               </w:rPr>
-              <w:t>(ініціали та прізвище)</w:t>
+              <w:t>(</w:t>
+            </w:r>
+            <w:proofErr w:type="spellStart"/>
+            <w:r>
+              <w:rPr>
+                <w:rFonts w:eastAsia="Calibri"/>
+                <w:sz w:val="18"/>
+                <w:szCs w:val="18"/>
+                <w:lang w:val="ru-RU" w:eastAsia="en-US"/>
+              </w:rPr>
+              <w:t>ініціали</w:t>
+            </w:r>
+            <w:proofErr w:type="spellEnd"/>
+            <w:r>
+              <w:rPr>
+                <w:rFonts w:eastAsia="Calibri"/>
+                <w:sz w:val="18"/>
+                <w:szCs w:val="18"/>
+                <w:lang w:val="ru-RU" w:eastAsia="en-US"/>
+              </w:rPr>
+              <w:t xml:space="preserve"> та </w:t>
+            </w:r>
+            <w:proofErr w:type="spellStart"/>
+            <w:r>
+              <w:rPr>
+                <w:rFonts w:eastAsia="Calibri"/>
+                <w:sz w:val="18"/>
+                <w:szCs w:val="18"/>
+                <w:lang w:val="ru-RU" w:eastAsia="en-US"/>
+              </w:rPr>
+              <w:t>прізвище</w:t>
+            </w:r>
+            <w:proofErr w:type="spellEnd"/>
+            <w:r>
+              <w:rPr>
+                <w:rFonts w:eastAsia="Calibri"/>
+                <w:sz w:val="18"/>
+                <w:szCs w:val="18"/>
+                <w:lang w:val="ru-RU" w:eastAsia="en-US"/>
+              </w:rPr>
+              <w:t>)</w:t>
             </w:r>
           </w:p>
         </w:tc>
@@ -4382,7 +4451,27 @@
                 <w:szCs w:val="18"/>
                 <w:lang w:val="ru-RU" w:eastAsia="en-US"/>
               </w:rPr>
-              <w:t>(підпис)</w:t>
+              <w:t>(</w:t>
+            </w:r>
+            <w:proofErr w:type="spellStart"/>
+            <w:r>
+              <w:rPr>
+                <w:rFonts w:eastAsia="Calibri"/>
+                <w:sz w:val="18"/>
+                <w:szCs w:val="18"/>
+                <w:lang w:val="ru-RU" w:eastAsia="en-US"/>
+              </w:rPr>
+              <w:t>підпис</w:t>
+            </w:r>
+            <w:proofErr w:type="spellEnd"/>
+            <w:r>
+              <w:rPr>
+                <w:rFonts w:eastAsia="Calibri"/>
+                <w:sz w:val="18"/>
+                <w:szCs w:val="18"/>
+                <w:lang w:val="ru-RU" w:eastAsia="en-US"/>
+              </w:rPr>
+              <w:t>)</w:t>
             </w:r>
           </w:p>
         </w:tc>
@@ -4416,7 +4505,47 @@
                 <w:szCs w:val="18"/>
                 <w:lang w:val="ru-RU" w:eastAsia="en-US"/>
               </w:rPr>
-              <w:t>(ініціали та прізвище)</w:t>
+              <w:t>(</w:t>
+            </w:r>
+            <w:proofErr w:type="spellStart"/>
+            <w:r>
+              <w:rPr>
+                <w:rFonts w:eastAsia="Calibri"/>
+                <w:sz w:val="18"/>
+                <w:szCs w:val="18"/>
+                <w:lang w:val="ru-RU" w:eastAsia="en-US"/>
+              </w:rPr>
+              <w:t>ініціали</w:t>
+            </w:r>
+            <w:proofErr w:type="spellEnd"/>
+            <w:r>
+              <w:rPr>
+                <w:rFonts w:eastAsia="Calibri"/>
+                <w:sz w:val="18"/>
+                <w:szCs w:val="18"/>
+                <w:lang w:val="ru-RU" w:eastAsia="en-US"/>
+              </w:rPr>
+              <w:t xml:space="preserve"> та </w:t>
+            </w:r>
+            <w:proofErr w:type="spellStart"/>
+            <w:r>
+              <w:rPr>
+                <w:rFonts w:eastAsia="Calibri"/>
+                <w:sz w:val="18"/>
+                <w:szCs w:val="18"/>
+                <w:lang w:val="ru-RU" w:eastAsia="en-US"/>
+              </w:rPr>
+              <w:t>прізвище</w:t>
+            </w:r>
+            <w:proofErr w:type="spellEnd"/>
+            <w:r>
+              <w:rPr>
+                <w:rFonts w:eastAsia="Calibri"/>
+                <w:sz w:val="18"/>
+                <w:szCs w:val="18"/>
+                <w:lang w:val="ru-RU" w:eastAsia="en-US"/>
+              </w:rPr>
+              <w:t>)</w:t>
             </w:r>
           </w:p>
         </w:tc>
@@ -4953,9 +5082,9 @@
                 <w:rFonts w:eastAsia="Calibri"/>
                 <w:sz w:val="22"/>
                 <w:szCs w:val="22"/>
-                <w:lang w:eastAsia="en-US"/>
-              </w:rPr>
-              <w:instrText xml:space="preserve"> MERGEFIELD  COMMISION_HEAD_POSITION  \* MERGEFORMAT </w:instrText>
+                <w:lang w:val="ru-RU" w:eastAsia="en-US"/>
+              </w:rPr>
+              <w:instrText xml:space="preserve"> MERGEFIELD  ACCEPTED_PERSON_POSITION  \* MERGEFORMAT </w:instrText>
             </w:r>
             <w:r>
               <w:rPr>
@@ -4972,29 +5101,9 @@
                 <w:noProof/>
                 <w:sz w:val="22"/>
                 <w:szCs w:val="22"/>
-                <w:lang w:eastAsia="en-US"/>
-              </w:rPr>
-              <w:t>«</w:t>
-            </w:r>
-            <w:r>
-              <w:rPr>
-                <w:rFonts w:eastAsia="Calibri"/>
-                <w:noProof/>
-                <w:sz w:val="22"/>
-                <w:szCs w:val="22"/>
-                <w:lang w:val="en-US" w:eastAsia="en-US"/>
-              </w:rPr>
-              <w:t>ACCEPTED_PERSON</w:t>
-            </w:r>
-            <w:r>
-              <w:rPr>
-                <w:rFonts w:eastAsia="Calibri"/>
-                <w:noProof/>
-                <w:sz w:val="22"/>
-                <w:szCs w:val="22"/>
-                <w:lang w:eastAsia="en-US"/>
-              </w:rPr>
-              <w:t>_POSITION»</w:t>
+                <w:lang w:val="ru-RU" w:eastAsia="en-US"/>
+              </w:rPr>
+              <w:t>«ACCEPTED_PERSON_POSITION»</w:t>
             </w:r>
             <w:r>
               <w:rPr>
@@ -5044,9 +5153,9 @@
                 <w:rFonts w:eastAsia="Calibri"/>
                 <w:sz w:val="22"/>
                 <w:szCs w:val="22"/>
-                <w:lang w:eastAsia="en-US"/>
-              </w:rPr>
-              <w:instrText xml:space="preserve"> MERGEFIELD  COMMISION_HEAD_NAME  \* MERGEFORMAT </w:instrText>
+                <w:lang w:val="ru-RU" w:eastAsia="en-US"/>
+              </w:rPr>
+              <w:instrText xml:space="preserve"> MERGEFIELD  ACCEPTED_PERSON_NAME  \* MERGEFORMAT </w:instrText>
             </w:r>
             <w:r>
               <w:rPr>
@@ -5063,39 +5172,9 @@
                 <w:noProof/>
                 <w:sz w:val="22"/>
                 <w:szCs w:val="22"/>
-                <w:lang w:eastAsia="en-US"/>
-              </w:rPr>
-              <w:t>«</w:t>
-            </w:r>
-            <w:r>
-              <w:rPr>
-                <w:rFonts w:eastAsia="Calibri"/>
-                <w:noProof/>
-                <w:sz w:val="22"/>
-                <w:szCs w:val="22"/>
-                <w:lang w:val="en-US" w:eastAsia="en-US"/>
-              </w:rPr>
-              <w:t>ACCEPTED_PERSON</w:t>
-            </w:r>
-            <w:r>
-              <w:rPr>
-                <w:rFonts w:eastAsia="Calibri"/>
-                <w:noProof/>
-                <w:sz w:val="22"/>
-                <w:szCs w:val="22"/>
-                <w:lang w:eastAsia="en-US"/>
-              </w:rPr>
-              <w:t>_</w:t>
-            </w:r>
-            <w:r>
-              <w:rPr>
-                <w:rFonts w:eastAsia="Calibri"/>
-                <w:noProof/>
-                <w:sz w:val="22"/>
-                <w:szCs w:val="22"/>
-                <w:lang w:eastAsia="en-US"/>
-              </w:rPr>
-              <w:t>NAME»</w:t>
+                <w:lang w:val="ru-RU" w:eastAsia="en-US"/>
+              </w:rPr>
+              <w:t>«ACCEPTED_PERSON_NAME»</w:t>
             </w:r>
             <w:r>
               <w:rPr>
@@ -5166,9 +5245,9 @@
                 <w:rFonts w:eastAsia="Calibri"/>
                 <w:sz w:val="22"/>
                 <w:szCs w:val="22"/>
-                <w:lang w:eastAsia="en-US"/>
-              </w:rPr>
-              <w:instrText xml:space="preserve"> MERGEFIELD  COMMISION_HEAD_RANK  \* MERGEFORMAT </w:instrText>
+                <w:lang w:val="ru-RU" w:eastAsia="en-US"/>
+              </w:rPr>
+              <w:instrText xml:space="preserve"> MERGEFIELD  ACCEPTED_PERSON_RANK  \* MERGEFORMAT </w:instrText>
             </w:r>
             <w:r>
               <w:rPr>
@@ -5185,39 +5264,9 @@
                 <w:noProof/>
                 <w:sz w:val="22"/>
                 <w:szCs w:val="22"/>
-                <w:lang w:eastAsia="en-US"/>
-              </w:rPr>
-              <w:t>«</w:t>
-            </w:r>
-            <w:r>
-              <w:rPr>
-                <w:rFonts w:eastAsia="Calibri"/>
-                <w:noProof/>
-                <w:sz w:val="22"/>
-                <w:szCs w:val="22"/>
-                <w:lang w:val="en-US" w:eastAsia="en-US"/>
-              </w:rPr>
-              <w:t>ACCEPTED_PERSON</w:t>
-            </w:r>
-            <w:r>
-              <w:rPr>
-                <w:rFonts w:eastAsia="Calibri"/>
-                <w:noProof/>
-                <w:sz w:val="22"/>
-                <w:szCs w:val="22"/>
-                <w:lang w:eastAsia="en-US"/>
-              </w:rPr>
-              <w:t>_</w:t>
-            </w:r>
-            <w:r>
-              <w:rPr>
-                <w:rFonts w:eastAsia="Calibri"/>
-                <w:noProof/>
-                <w:sz w:val="22"/>
-                <w:szCs w:val="22"/>
-                <w:lang w:eastAsia="en-US"/>
-              </w:rPr>
-              <w:t>RANK»</w:t>
+                <w:lang w:val="ru-RU" w:eastAsia="en-US"/>
+              </w:rPr>
+              <w:t>«ACCEPTED_PERSON_RANK»</w:t>
             </w:r>
             <w:r>
               <w:rPr>
@@ -5365,7 +5414,27 @@
                 <w:szCs w:val="18"/>
                 <w:lang w:val="ru-RU" w:eastAsia="en-US"/>
               </w:rPr>
-              <w:t>(підпис)</w:t>
+              <w:t>(</w:t>
+            </w:r>
+            <w:proofErr w:type="spellStart"/>
+            <w:r>
+              <w:rPr>
+                <w:rFonts w:eastAsia="Calibri"/>
+                <w:sz w:val="18"/>
+                <w:szCs w:val="18"/>
+                <w:lang w:val="ru-RU" w:eastAsia="en-US"/>
+              </w:rPr>
+              <w:t>підпис</w:t>
+            </w:r>
+            <w:proofErr w:type="spellEnd"/>
+            <w:r>
+              <w:rPr>
+                <w:rFonts w:eastAsia="Calibri"/>
+                <w:sz w:val="18"/>
+                <w:szCs w:val="18"/>
+                <w:lang w:val="ru-RU" w:eastAsia="en-US"/>
+              </w:rPr>
+              <w:t>)</w:t>
             </w:r>
           </w:p>
         </w:tc>
@@ -5398,7 +5467,47 @@
                 <w:szCs w:val="18"/>
                 <w:lang w:val="ru-RU" w:eastAsia="en-US"/>
               </w:rPr>
-              <w:t>(ініціали та прізвище)</w:t>
+              <w:t>(</w:t>
+            </w:r>
+            <w:proofErr w:type="spellStart"/>
+            <w:r>
+              <w:rPr>
+                <w:rFonts w:eastAsia="Calibri"/>
+                <w:sz w:val="18"/>
+                <w:szCs w:val="18"/>
+                <w:lang w:val="ru-RU" w:eastAsia="en-US"/>
+              </w:rPr>
+              <w:t>ініціали</w:t>
+            </w:r>
+            <w:proofErr w:type="spellEnd"/>
+            <w:r>
+              <w:rPr>
+                <w:rFonts w:eastAsia="Calibri"/>
+                <w:sz w:val="18"/>
+                <w:szCs w:val="18"/>
+                <w:lang w:val="ru-RU" w:eastAsia="en-US"/>
+              </w:rPr>
+              <w:t xml:space="preserve"> та </w:t>
+            </w:r>
+            <w:proofErr w:type="spellStart"/>
+            <w:r>
+              <w:rPr>
+                <w:rFonts w:eastAsia="Calibri"/>
+                <w:sz w:val="18"/>
+                <w:szCs w:val="18"/>
+                <w:lang w:val="ru-RU" w:eastAsia="en-US"/>
+              </w:rPr>
+              <w:t>прізвище</w:t>
+            </w:r>
+            <w:proofErr w:type="spellEnd"/>
+            <w:r>
+              <w:rPr>
+                <w:rFonts w:eastAsia="Calibri"/>
+                <w:sz w:val="18"/>
+                <w:szCs w:val="18"/>
+                <w:lang w:val="ru-RU" w:eastAsia="en-US"/>
+              </w:rPr>
+              <w:t>)</w:t>
             </w:r>
           </w:p>
         </w:tc>
@@ -5487,9 +5596,9 @@
                 <w:rFonts w:eastAsia="Calibri"/>
                 <w:sz w:val="22"/>
                 <w:szCs w:val="22"/>
-                <w:lang w:eastAsia="en-US"/>
-              </w:rPr>
-              <w:instrText xml:space="preserve"> MERGEFIELD  COMMISION_HEAD_POSITION  \* MERGEFORMAT </w:instrText>
+                <w:lang w:val="ru-RU" w:eastAsia="en-US"/>
+              </w:rPr>
+              <w:instrText xml:space="preserve"> MERGEFIELD  HANDED_PERSON_POSITION  \* MERGEFORMAT </w:instrText>
             </w:r>
             <w:r>
               <w:rPr>
@@ -5506,29 +5615,9 @@
                 <w:noProof/>
                 <w:sz w:val="22"/>
                 <w:szCs w:val="22"/>
-                <w:lang w:eastAsia="en-US"/>
-              </w:rPr>
-              <w:t>«</w:t>
-            </w:r>
-            <w:r>
-              <w:rPr>
-                <w:rFonts w:eastAsia="Calibri"/>
-                <w:noProof/>
-                <w:sz w:val="22"/>
-                <w:szCs w:val="22"/>
-                <w:lang w:val="en-US" w:eastAsia="en-US"/>
-              </w:rPr>
-              <w:t>HANDED_PERSON</w:t>
-            </w:r>
-            <w:r>
-              <w:rPr>
-                <w:rFonts w:eastAsia="Calibri"/>
-                <w:noProof/>
-                <w:sz w:val="22"/>
-                <w:szCs w:val="22"/>
-                <w:lang w:eastAsia="en-US"/>
-              </w:rPr>
-              <w:t>_POSITION»</w:t>
+                <w:lang w:val="ru-RU" w:eastAsia="en-US"/>
+              </w:rPr>
+              <w:t>«HANDED_PERSON_POSITION»</w:t>
             </w:r>
             <w:r>
               <w:rPr>
@@ -5578,9 +5667,9 @@
                 <w:rFonts w:eastAsia="Calibri"/>
                 <w:sz w:val="22"/>
                 <w:szCs w:val="22"/>
-                <w:lang w:eastAsia="en-US"/>
-              </w:rPr>
-              <w:instrText xml:space="preserve"> MERGEFIELD  COMMISION_HEAD_NAME  \* MERGEFORMAT </w:instrText>
+                <w:lang w:val="ru-RU" w:eastAsia="en-US"/>
+              </w:rPr>
+              <w:instrText xml:space="preserve"> MERGEFIELD  HANDED_PERSON_NAME  \* MERGEFORMAT </w:instrText>
             </w:r>
             <w:r>
               <w:rPr>
@@ -5597,29 +5686,9 @@
                 <w:noProof/>
                 <w:sz w:val="22"/>
                 <w:szCs w:val="22"/>
-                <w:lang w:eastAsia="en-US"/>
-              </w:rPr>
-              <w:t>«</w:t>
-            </w:r>
-            <w:r>
-              <w:rPr>
-                <w:rFonts w:eastAsia="Calibri"/>
-                <w:noProof/>
-                <w:sz w:val="22"/>
-                <w:szCs w:val="22"/>
-                <w:lang w:val="en-US" w:eastAsia="en-US"/>
-              </w:rPr>
-              <w:t>HANDED_PERSON</w:t>
-            </w:r>
-            <w:r>
-              <w:rPr>
-                <w:rFonts w:eastAsia="Calibri"/>
-                <w:noProof/>
-                <w:sz w:val="22"/>
-                <w:szCs w:val="22"/>
-                <w:lang w:eastAsia="en-US"/>
-              </w:rPr>
-              <w:t>_NAME»</w:t>
+                <w:lang w:val="ru-RU" w:eastAsia="en-US"/>
+              </w:rPr>
+              <w:t>«HANDED_PERSON_NAME»</w:t>
             </w:r>
             <w:r>
               <w:rPr>
@@ -5690,9 +5759,9 @@
                 <w:rFonts w:eastAsia="Calibri"/>
                 <w:sz w:val="22"/>
                 <w:szCs w:val="22"/>
-                <w:lang w:eastAsia="en-US"/>
-              </w:rPr>
-              <w:instrText xml:space="preserve"> MERGEFIELD  COMMISION_HEAD_RANK  \* MERGEFORMAT </w:instrText>
+                <w:lang w:val="ru-RU" w:eastAsia="en-US"/>
+              </w:rPr>
+              <w:instrText xml:space="preserve"> MERGEFIELD  HANDED_PERSON_RANK  \* MERGEFORMAT </w:instrText>
             </w:r>
             <w:r>
               <w:rPr>
@@ -5709,29 +5778,9 @@
                 <w:noProof/>
                 <w:sz w:val="22"/>
                 <w:szCs w:val="22"/>
-                <w:lang w:eastAsia="en-US"/>
-              </w:rPr>
-              <w:t>«</w:t>
-            </w:r>
-            <w:r>
-              <w:rPr>
-                <w:rFonts w:eastAsia="Calibri"/>
-                <w:noProof/>
-                <w:sz w:val="22"/>
-                <w:szCs w:val="22"/>
-                <w:lang w:val="en-US" w:eastAsia="en-US"/>
-              </w:rPr>
-              <w:t>HANDED_PERSON</w:t>
-            </w:r>
-            <w:r>
-              <w:rPr>
-                <w:rFonts w:eastAsia="Calibri"/>
-                <w:noProof/>
-                <w:sz w:val="22"/>
-                <w:szCs w:val="22"/>
-                <w:lang w:eastAsia="en-US"/>
-              </w:rPr>
-              <w:t>_RANK»</w:t>
+                <w:lang w:val="ru-RU" w:eastAsia="en-US"/>
+              </w:rPr>
+              <w:t>«HANDED_PERSON_RANK»</w:t>
             </w:r>
             <w:r>
               <w:rPr>
@@ -5879,7 +5928,27 @@
                 <w:szCs w:val="18"/>
                 <w:lang w:val="ru-RU" w:eastAsia="en-US"/>
               </w:rPr>
-              <w:t>(підпис)</w:t>
+              <w:t>(</w:t>
+            </w:r>
+            <w:proofErr w:type="spellStart"/>
+            <w:r>
+              <w:rPr>
+                <w:rFonts w:eastAsia="Calibri"/>
+                <w:sz w:val="18"/>
+                <w:szCs w:val="18"/>
+                <w:lang w:val="ru-RU" w:eastAsia="en-US"/>
+              </w:rPr>
+              <w:t>підпис</w:t>
+            </w:r>
+            <w:proofErr w:type="spellEnd"/>
+            <w:r>
+              <w:rPr>
+                <w:rFonts w:eastAsia="Calibri"/>
+                <w:sz w:val="18"/>
+                <w:szCs w:val="18"/>
+                <w:lang w:val="ru-RU" w:eastAsia="en-US"/>
+              </w:rPr>
+              <w:t>)</w:t>
             </w:r>
           </w:p>
         </w:tc>
@@ -5912,7 +5981,47 @@
                 <w:szCs w:val="18"/>
                 <w:lang w:val="ru-RU" w:eastAsia="en-US"/>
               </w:rPr>
-              <w:t>(ініціали та прізвище)</w:t>
+              <w:t>(</w:t>
+            </w:r>
+            <w:proofErr w:type="spellStart"/>
+            <w:r>
+              <w:rPr>
+                <w:rFonts w:eastAsia="Calibri"/>
+                <w:sz w:val="18"/>
+                <w:szCs w:val="18"/>
+                <w:lang w:val="ru-RU" w:eastAsia="en-US"/>
+              </w:rPr>
+              <w:t>ініціали</w:t>
+            </w:r>
+            <w:proofErr w:type="spellEnd"/>
+            <w:r>
+              <w:rPr>
+                <w:rFonts w:eastAsia="Calibri"/>
+                <w:sz w:val="18"/>
+                <w:szCs w:val="18"/>
+                <w:lang w:val="ru-RU" w:eastAsia="en-US"/>
+              </w:rPr>
+              <w:t xml:space="preserve"> та </w:t>
+            </w:r>
+            <w:proofErr w:type="spellStart"/>
+            <w:r>
+              <w:rPr>
+                <w:rFonts w:eastAsia="Calibri"/>
+                <w:sz w:val="18"/>
+                <w:szCs w:val="18"/>
+                <w:lang w:val="ru-RU" w:eastAsia="en-US"/>
+              </w:rPr>
+              <w:t>прізвище</w:t>
+            </w:r>
+            <w:proofErr w:type="spellEnd"/>
+            <w:r>
+              <w:rPr>
+                <w:rFonts w:eastAsia="Calibri"/>
+                <w:sz w:val="18"/>
+                <w:szCs w:val="18"/>
+                <w:lang w:val="ru-RU" w:eastAsia="en-US"/>
+              </w:rPr>
+              <w:t>)</w:t>
             </w:r>
           </w:p>
         </w:tc>
@@ -6368,6 +6477,726 @@
           </w:p>
         </w:tc>
       </w:tr>
+      <w:tr>
+        <w:tc>
+          <w:tcPr>
+            <w:tcW w:w="2553" w:type="dxa"/>
+            <w:tcBorders>
+              <w:top w:val="single" w:sz="4" w:space="0" w:color="auto"/>
+              <w:left w:val="single" w:sz="4" w:space="0" w:color="auto"/>
+              <w:bottom w:val="single" w:sz="4" w:space="0" w:color="auto"/>
+              <w:right w:val="single" w:sz="4" w:space="0" w:color="auto"/>
+            </w:tcBorders>
+          </w:tcPr>
+          <w:p>
+            <w:pPr>
+              <w:keepNext/>
+              <w:keepLines/>
+              <w:jc w:val="both"/>
+              <w:rPr>
+                <w:sz w:val="22"/>
+                <w:szCs w:val="22"/>
+              </w:rPr>
+            </w:pPr>
+          </w:p>
+        </w:tc>
+        <w:tc>
+          <w:tcPr>
+            <w:tcW w:w="2835" w:type="dxa"/>
+            <w:tcBorders>
+              <w:top w:val="single" w:sz="4" w:space="0" w:color="auto"/>
+              <w:left w:val="single" w:sz="4" w:space="0" w:color="auto"/>
+              <w:bottom w:val="single" w:sz="4" w:space="0" w:color="auto"/>
+              <w:right w:val="single" w:sz="4" w:space="0" w:color="auto"/>
+            </w:tcBorders>
+          </w:tcPr>
+          <w:p>
+            <w:pPr>
+              <w:keepNext/>
+              <w:keepLines/>
+              <w:jc w:val="both"/>
+              <w:rPr>
+                <w:sz w:val="22"/>
+                <w:szCs w:val="22"/>
+              </w:rPr>
+            </w:pPr>
+          </w:p>
+        </w:tc>
+        <w:tc>
+          <w:tcPr>
+            <w:tcW w:w="2693" w:type="dxa"/>
+            <w:tcBorders>
+              <w:top w:val="single" w:sz="4" w:space="0" w:color="auto"/>
+              <w:left w:val="single" w:sz="4" w:space="0" w:color="auto"/>
+              <w:bottom w:val="single" w:sz="4" w:space="0" w:color="auto"/>
+              <w:right w:val="single" w:sz="4" w:space="0" w:color="auto"/>
+            </w:tcBorders>
+          </w:tcPr>
+          <w:p>
+            <w:pPr>
+              <w:keepNext/>
+              <w:keepLines/>
+              <w:jc w:val="both"/>
+              <w:rPr>
+                <w:sz w:val="22"/>
+                <w:szCs w:val="22"/>
+              </w:rPr>
+            </w:pPr>
+          </w:p>
+        </w:tc>
+        <w:tc>
+          <w:tcPr>
+            <w:tcW w:w="1276" w:type="dxa"/>
+            <w:tcBorders>
+              <w:top w:val="single" w:sz="4" w:space="0" w:color="auto"/>
+              <w:left w:val="single" w:sz="4" w:space="0" w:color="auto"/>
+              <w:bottom w:val="single" w:sz="4" w:space="0" w:color="auto"/>
+              <w:right w:val="single" w:sz="4" w:space="0" w:color="auto"/>
+            </w:tcBorders>
+          </w:tcPr>
+          <w:p>
+            <w:pPr>
+              <w:keepNext/>
+              <w:keepLines/>
+              <w:jc w:val="both"/>
+              <w:rPr>
+                <w:sz w:val="22"/>
+                <w:szCs w:val="22"/>
+              </w:rPr>
+            </w:pPr>
+          </w:p>
+        </w:tc>
+      </w:tr>
+      <w:tr>
+        <w:tc>
+          <w:tcPr>
+            <w:tcW w:w="2553" w:type="dxa"/>
+            <w:tcBorders>
+              <w:top w:val="single" w:sz="4" w:space="0" w:color="auto"/>
+              <w:left w:val="single" w:sz="4" w:space="0" w:color="auto"/>
+              <w:bottom w:val="single" w:sz="4" w:space="0" w:color="auto"/>
+              <w:right w:val="single" w:sz="4" w:space="0" w:color="auto"/>
+            </w:tcBorders>
+          </w:tcPr>
+          <w:p>
+            <w:pPr>
+              <w:keepNext/>
+              <w:keepLines/>
+              <w:jc w:val="both"/>
+              <w:rPr>
+                <w:sz w:val="22"/>
+                <w:szCs w:val="22"/>
+              </w:rPr>
+            </w:pPr>
+          </w:p>
+        </w:tc>
+        <w:tc>
+          <w:tcPr>
+            <w:tcW w:w="2835" w:type="dxa"/>
+            <w:tcBorders>
+              <w:top w:val="single" w:sz="4" w:space="0" w:color="auto"/>
+              <w:left w:val="single" w:sz="4" w:space="0" w:color="auto"/>
+              <w:bottom w:val="single" w:sz="4" w:space="0" w:color="auto"/>
+              <w:right w:val="single" w:sz="4" w:space="0" w:color="auto"/>
+            </w:tcBorders>
+          </w:tcPr>
+          <w:p>
+            <w:pPr>
+              <w:keepNext/>
+              <w:keepLines/>
+              <w:jc w:val="both"/>
+              <w:rPr>
+                <w:sz w:val="22"/>
+                <w:szCs w:val="22"/>
+              </w:rPr>
+            </w:pPr>
+          </w:p>
+        </w:tc>
+        <w:tc>
+          <w:tcPr>
+            <w:tcW w:w="2693" w:type="dxa"/>
+            <w:tcBorders>
+              <w:top w:val="single" w:sz="4" w:space="0" w:color="auto"/>
+              <w:left w:val="single" w:sz="4" w:space="0" w:color="auto"/>
+              <w:bottom w:val="single" w:sz="4" w:space="0" w:color="auto"/>
+              <w:right w:val="single" w:sz="4" w:space="0" w:color="auto"/>
+            </w:tcBorders>
+          </w:tcPr>
+          <w:p>
+            <w:pPr>
+              <w:keepNext/>
+              <w:keepLines/>
+              <w:jc w:val="both"/>
+              <w:rPr>
+                <w:sz w:val="22"/>
+                <w:szCs w:val="22"/>
+              </w:rPr>
+            </w:pPr>
+          </w:p>
+        </w:tc>
+        <w:tc>
+          <w:tcPr>
+            <w:tcW w:w="1276" w:type="dxa"/>
+            <w:tcBorders>
+              <w:top w:val="single" w:sz="4" w:space="0" w:color="auto"/>
+              <w:left w:val="single" w:sz="4" w:space="0" w:color="auto"/>
+              <w:bottom w:val="single" w:sz="4" w:space="0" w:color="auto"/>
+              <w:right w:val="single" w:sz="4" w:space="0" w:color="auto"/>
+            </w:tcBorders>
+          </w:tcPr>
+          <w:p>
+            <w:pPr>
+              <w:keepNext/>
+              <w:keepLines/>
+              <w:jc w:val="both"/>
+              <w:rPr>
+                <w:sz w:val="22"/>
+                <w:szCs w:val="22"/>
+              </w:rPr>
+            </w:pPr>
+          </w:p>
+        </w:tc>
+      </w:tr>
+      <w:tr>
+        <w:tc>
+          <w:tcPr>
+            <w:tcW w:w="2553" w:type="dxa"/>
+            <w:tcBorders>
+              <w:top w:val="single" w:sz="4" w:space="0" w:color="auto"/>
+              <w:left w:val="single" w:sz="4" w:space="0" w:color="auto"/>
+              <w:bottom w:val="single" w:sz="4" w:space="0" w:color="auto"/>
+              <w:right w:val="single" w:sz="4" w:space="0" w:color="auto"/>
+            </w:tcBorders>
+          </w:tcPr>
+          <w:p>
+            <w:pPr>
+              <w:keepNext/>
+              <w:keepLines/>
+              <w:jc w:val="both"/>
+              <w:rPr>
+                <w:sz w:val="22"/>
+                <w:szCs w:val="22"/>
+              </w:rPr>
+            </w:pPr>
+          </w:p>
+        </w:tc>
+        <w:tc>
+          <w:tcPr>
+            <w:tcW w:w="2835" w:type="dxa"/>
+            <w:tcBorders>
+              <w:top w:val="single" w:sz="4" w:space="0" w:color="auto"/>
+              <w:left w:val="single" w:sz="4" w:space="0" w:color="auto"/>
+              <w:bottom w:val="single" w:sz="4" w:space="0" w:color="auto"/>
+              <w:right w:val="single" w:sz="4" w:space="0" w:color="auto"/>
+            </w:tcBorders>
+          </w:tcPr>
+          <w:p>
+            <w:pPr>
+              <w:keepNext/>
+              <w:keepLines/>
+              <w:jc w:val="both"/>
+              <w:rPr>
+                <w:sz w:val="22"/>
+                <w:szCs w:val="22"/>
+              </w:rPr>
+            </w:pPr>
+          </w:p>
+        </w:tc>
+        <w:tc>
+          <w:tcPr>
+            <w:tcW w:w="2693" w:type="dxa"/>
+            <w:tcBorders>
+              <w:top w:val="single" w:sz="4" w:space="0" w:color="auto"/>
+              <w:left w:val="single" w:sz="4" w:space="0" w:color="auto"/>
+              <w:bottom w:val="single" w:sz="4" w:space="0" w:color="auto"/>
+              <w:right w:val="single" w:sz="4" w:space="0" w:color="auto"/>
+            </w:tcBorders>
+          </w:tcPr>
+          <w:p>
+            <w:pPr>
+              <w:keepNext/>
+              <w:keepLines/>
+              <w:jc w:val="both"/>
+              <w:rPr>
+                <w:sz w:val="22"/>
+                <w:szCs w:val="22"/>
+              </w:rPr>
+            </w:pPr>
+          </w:p>
+        </w:tc>
+        <w:tc>
+          <w:tcPr>
+            <w:tcW w:w="1276" w:type="dxa"/>
+            <w:tcBorders>
+              <w:top w:val="single" w:sz="4" w:space="0" w:color="auto"/>
+              <w:left w:val="single" w:sz="4" w:space="0" w:color="auto"/>
+              <w:bottom w:val="single" w:sz="4" w:space="0" w:color="auto"/>
+              <w:right w:val="single" w:sz="4" w:space="0" w:color="auto"/>
+            </w:tcBorders>
+          </w:tcPr>
+          <w:p>
+            <w:pPr>
+              <w:keepNext/>
+              <w:keepLines/>
+              <w:jc w:val="both"/>
+              <w:rPr>
+                <w:sz w:val="22"/>
+                <w:szCs w:val="22"/>
+              </w:rPr>
+            </w:pPr>
+          </w:p>
+        </w:tc>
+      </w:tr>
+      <w:tr>
+        <w:tc>
+          <w:tcPr>
+            <w:tcW w:w="2553" w:type="dxa"/>
+            <w:tcBorders>
+              <w:top w:val="single" w:sz="4" w:space="0" w:color="auto"/>
+              <w:left w:val="single" w:sz="4" w:space="0" w:color="auto"/>
+              <w:bottom w:val="single" w:sz="4" w:space="0" w:color="auto"/>
+              <w:right w:val="single" w:sz="4" w:space="0" w:color="auto"/>
+            </w:tcBorders>
+          </w:tcPr>
+          <w:p>
+            <w:pPr>
+              <w:keepNext/>
+              <w:keepLines/>
+              <w:jc w:val="both"/>
+              <w:rPr>
+                <w:sz w:val="22"/>
+                <w:szCs w:val="22"/>
+              </w:rPr>
+            </w:pPr>
+          </w:p>
+        </w:tc>
+        <w:tc>
+          <w:tcPr>
+            <w:tcW w:w="2835" w:type="dxa"/>
+            <w:tcBorders>
+              <w:top w:val="single" w:sz="4" w:space="0" w:color="auto"/>
+              <w:left w:val="single" w:sz="4" w:space="0" w:color="auto"/>
+              <w:bottom w:val="single" w:sz="4" w:space="0" w:color="auto"/>
+              <w:right w:val="single" w:sz="4" w:space="0" w:color="auto"/>
+            </w:tcBorders>
+          </w:tcPr>
+          <w:p>
+            <w:pPr>
+              <w:keepNext/>
+              <w:keepLines/>
+              <w:jc w:val="both"/>
+              <w:rPr>
+                <w:sz w:val="22"/>
+                <w:szCs w:val="22"/>
+              </w:rPr>
+            </w:pPr>
+          </w:p>
+        </w:tc>
+        <w:tc>
+          <w:tcPr>
+            <w:tcW w:w="2693" w:type="dxa"/>
+            <w:tcBorders>
+              <w:top w:val="single" w:sz="4" w:space="0" w:color="auto"/>
+              <w:left w:val="single" w:sz="4" w:space="0" w:color="auto"/>
+              <w:bottom w:val="single" w:sz="4" w:space="0" w:color="auto"/>
+              <w:right w:val="single" w:sz="4" w:space="0" w:color="auto"/>
+            </w:tcBorders>
+          </w:tcPr>
+          <w:p>
+            <w:pPr>
+              <w:keepNext/>
+              <w:keepLines/>
+              <w:jc w:val="both"/>
+              <w:rPr>
+                <w:sz w:val="22"/>
+                <w:szCs w:val="22"/>
+              </w:rPr>
+            </w:pPr>
+          </w:p>
+        </w:tc>
+        <w:tc>
+          <w:tcPr>
+            <w:tcW w:w="1276" w:type="dxa"/>
+            <w:tcBorders>
+              <w:top w:val="single" w:sz="4" w:space="0" w:color="auto"/>
+              <w:left w:val="single" w:sz="4" w:space="0" w:color="auto"/>
+              <w:bottom w:val="single" w:sz="4" w:space="0" w:color="auto"/>
+              <w:right w:val="single" w:sz="4" w:space="0" w:color="auto"/>
+            </w:tcBorders>
+          </w:tcPr>
+          <w:p>
+            <w:pPr>
+              <w:keepNext/>
+              <w:keepLines/>
+              <w:jc w:val="both"/>
+              <w:rPr>
+                <w:sz w:val="22"/>
+                <w:szCs w:val="22"/>
+              </w:rPr>
+            </w:pPr>
+          </w:p>
+        </w:tc>
+      </w:tr>
+      <w:tr>
+        <w:tc>
+          <w:tcPr>
+            <w:tcW w:w="2553" w:type="dxa"/>
+            <w:tcBorders>
+              <w:top w:val="single" w:sz="4" w:space="0" w:color="auto"/>
+              <w:left w:val="single" w:sz="4" w:space="0" w:color="auto"/>
+              <w:bottom w:val="single" w:sz="4" w:space="0" w:color="auto"/>
+              <w:right w:val="single" w:sz="4" w:space="0" w:color="auto"/>
+            </w:tcBorders>
+          </w:tcPr>
+          <w:p>
+            <w:pPr>
+              <w:keepNext/>
+              <w:keepLines/>
+              <w:jc w:val="both"/>
+              <w:rPr>
+                <w:sz w:val="22"/>
+                <w:szCs w:val="22"/>
+              </w:rPr>
+            </w:pPr>
+          </w:p>
+        </w:tc>
+        <w:tc>
+          <w:tcPr>
+            <w:tcW w:w="2835" w:type="dxa"/>
+            <w:tcBorders>
+              <w:top w:val="single" w:sz="4" w:space="0" w:color="auto"/>
+              <w:left w:val="single" w:sz="4" w:space="0" w:color="auto"/>
+              <w:bottom w:val="single" w:sz="4" w:space="0" w:color="auto"/>
+              <w:right w:val="single" w:sz="4" w:space="0" w:color="auto"/>
+            </w:tcBorders>
+          </w:tcPr>
+          <w:p>
+            <w:pPr>
+              <w:keepNext/>
+              <w:keepLines/>
+              <w:jc w:val="both"/>
+              <w:rPr>
+                <w:sz w:val="22"/>
+                <w:szCs w:val="22"/>
+              </w:rPr>
+            </w:pPr>
+          </w:p>
+        </w:tc>
+        <w:tc>
+          <w:tcPr>
+            <w:tcW w:w="2693" w:type="dxa"/>
+            <w:tcBorders>
+              <w:top w:val="single" w:sz="4" w:space="0" w:color="auto"/>
+              <w:left w:val="single" w:sz="4" w:space="0" w:color="auto"/>
+              <w:bottom w:val="single" w:sz="4" w:space="0" w:color="auto"/>
+              <w:right w:val="single" w:sz="4" w:space="0" w:color="auto"/>
+            </w:tcBorders>
+          </w:tcPr>
+          <w:p>
+            <w:pPr>
+              <w:keepNext/>
+              <w:keepLines/>
+              <w:jc w:val="both"/>
+              <w:rPr>
+                <w:sz w:val="22"/>
+                <w:szCs w:val="22"/>
+              </w:rPr>
+            </w:pPr>
+          </w:p>
+        </w:tc>
+        <w:tc>
+          <w:tcPr>
+            <w:tcW w:w="1276" w:type="dxa"/>
+            <w:tcBorders>
+              <w:top w:val="single" w:sz="4" w:space="0" w:color="auto"/>
+              <w:left w:val="single" w:sz="4" w:space="0" w:color="auto"/>
+              <w:bottom w:val="single" w:sz="4" w:space="0" w:color="auto"/>
+              <w:right w:val="single" w:sz="4" w:space="0" w:color="auto"/>
+            </w:tcBorders>
+          </w:tcPr>
+          <w:p>
+            <w:pPr>
+              <w:keepNext/>
+              <w:keepLines/>
+              <w:jc w:val="both"/>
+              <w:rPr>
+                <w:sz w:val="22"/>
+                <w:szCs w:val="22"/>
+              </w:rPr>
+            </w:pPr>
+          </w:p>
+        </w:tc>
+      </w:tr>
+      <w:tr>
+        <w:tc>
+          <w:tcPr>
+            <w:tcW w:w="2553" w:type="dxa"/>
+            <w:tcBorders>
+              <w:top w:val="single" w:sz="4" w:space="0" w:color="auto"/>
+              <w:left w:val="single" w:sz="4" w:space="0" w:color="auto"/>
+              <w:bottom w:val="single" w:sz="4" w:space="0" w:color="auto"/>
+              <w:right w:val="single" w:sz="4" w:space="0" w:color="auto"/>
+            </w:tcBorders>
+          </w:tcPr>
+          <w:p>
+            <w:pPr>
+              <w:keepNext/>
+              <w:keepLines/>
+              <w:jc w:val="both"/>
+              <w:rPr>
+                <w:sz w:val="22"/>
+                <w:szCs w:val="22"/>
+              </w:rPr>
+            </w:pPr>
+          </w:p>
+        </w:tc>
+        <w:tc>
+          <w:tcPr>
+            <w:tcW w:w="2835" w:type="dxa"/>
+            <w:tcBorders>
+              <w:top w:val="single" w:sz="4" w:space="0" w:color="auto"/>
+              <w:left w:val="single" w:sz="4" w:space="0" w:color="auto"/>
+              <w:bottom w:val="single" w:sz="4" w:space="0" w:color="auto"/>
+              <w:right w:val="single" w:sz="4" w:space="0" w:color="auto"/>
+            </w:tcBorders>
+          </w:tcPr>
+          <w:p>
+            <w:pPr>
+              <w:keepNext/>
+              <w:keepLines/>
+              <w:jc w:val="both"/>
+              <w:rPr>
+                <w:sz w:val="22"/>
+                <w:szCs w:val="22"/>
+              </w:rPr>
+            </w:pPr>
+          </w:p>
+        </w:tc>
+        <w:tc>
+          <w:tcPr>
+            <w:tcW w:w="2693" w:type="dxa"/>
+            <w:tcBorders>
+              <w:top w:val="single" w:sz="4" w:space="0" w:color="auto"/>
+              <w:left w:val="single" w:sz="4" w:space="0" w:color="auto"/>
+              <w:bottom w:val="single" w:sz="4" w:space="0" w:color="auto"/>
+              <w:right w:val="single" w:sz="4" w:space="0" w:color="auto"/>
+            </w:tcBorders>
+          </w:tcPr>
+          <w:p>
+            <w:pPr>
+              <w:keepNext/>
+              <w:keepLines/>
+              <w:jc w:val="both"/>
+              <w:rPr>
+                <w:sz w:val="22"/>
+                <w:szCs w:val="22"/>
+              </w:rPr>
+            </w:pPr>
+          </w:p>
+        </w:tc>
+        <w:tc>
+          <w:tcPr>
+            <w:tcW w:w="1276" w:type="dxa"/>
+            <w:tcBorders>
+              <w:top w:val="single" w:sz="4" w:space="0" w:color="auto"/>
+              <w:left w:val="single" w:sz="4" w:space="0" w:color="auto"/>
+              <w:bottom w:val="single" w:sz="4" w:space="0" w:color="auto"/>
+              <w:right w:val="single" w:sz="4" w:space="0" w:color="auto"/>
+            </w:tcBorders>
+          </w:tcPr>
+          <w:p>
+            <w:pPr>
+              <w:keepNext/>
+              <w:keepLines/>
+              <w:jc w:val="both"/>
+              <w:rPr>
+                <w:sz w:val="22"/>
+                <w:szCs w:val="22"/>
+              </w:rPr>
+            </w:pPr>
+          </w:p>
+        </w:tc>
+      </w:tr>
+      <w:tr>
+        <w:tc>
+          <w:tcPr>
+            <w:tcW w:w="2553" w:type="dxa"/>
+            <w:tcBorders>
+              <w:top w:val="single" w:sz="4" w:space="0" w:color="auto"/>
+              <w:left w:val="single" w:sz="4" w:space="0" w:color="auto"/>
+              <w:bottom w:val="single" w:sz="4" w:space="0" w:color="auto"/>
+              <w:right w:val="single" w:sz="4" w:space="0" w:color="auto"/>
+            </w:tcBorders>
+          </w:tcPr>
+          <w:p>
+            <w:pPr>
+              <w:keepNext/>
+              <w:keepLines/>
+              <w:jc w:val="both"/>
+              <w:rPr>
+                <w:sz w:val="22"/>
+                <w:szCs w:val="22"/>
+              </w:rPr>
+            </w:pPr>
+          </w:p>
+        </w:tc>
+        <w:tc>
+          <w:tcPr>
+            <w:tcW w:w="2835" w:type="dxa"/>
+            <w:tcBorders>
+              <w:top w:val="single" w:sz="4" w:space="0" w:color="auto"/>
+              <w:left w:val="single" w:sz="4" w:space="0" w:color="auto"/>
+              <w:bottom w:val="single" w:sz="4" w:space="0" w:color="auto"/>
+              <w:right w:val="single" w:sz="4" w:space="0" w:color="auto"/>
+            </w:tcBorders>
+          </w:tcPr>
+          <w:p>
+            <w:pPr>
+              <w:keepNext/>
+              <w:keepLines/>
+              <w:jc w:val="both"/>
+              <w:rPr>
+                <w:sz w:val="22"/>
+                <w:szCs w:val="22"/>
+              </w:rPr>
+            </w:pPr>
+          </w:p>
+        </w:tc>
+        <w:tc>
+          <w:tcPr>
+            <w:tcW w:w="2693" w:type="dxa"/>
+            <w:tcBorders>
+              <w:top w:val="single" w:sz="4" w:space="0" w:color="auto"/>
+              <w:left w:val="single" w:sz="4" w:space="0" w:color="auto"/>
+              <w:bottom w:val="single" w:sz="4" w:space="0" w:color="auto"/>
+              <w:right w:val="single" w:sz="4" w:space="0" w:color="auto"/>
+            </w:tcBorders>
+          </w:tcPr>
+          <w:p>
+            <w:pPr>
+              <w:keepNext/>
+              <w:keepLines/>
+              <w:jc w:val="both"/>
+              <w:rPr>
+                <w:sz w:val="22"/>
+                <w:szCs w:val="22"/>
+              </w:rPr>
+            </w:pPr>
+          </w:p>
+        </w:tc>
+        <w:tc>
+          <w:tcPr>
+            <w:tcW w:w="1276" w:type="dxa"/>
+            <w:tcBorders>
+              <w:top w:val="single" w:sz="4" w:space="0" w:color="auto"/>
+              <w:left w:val="single" w:sz="4" w:space="0" w:color="auto"/>
+              <w:bottom w:val="single" w:sz="4" w:space="0" w:color="auto"/>
+              <w:right w:val="single" w:sz="4" w:space="0" w:color="auto"/>
+            </w:tcBorders>
+          </w:tcPr>
+          <w:p>
+            <w:pPr>
+              <w:keepNext/>
+              <w:keepLines/>
+              <w:jc w:val="both"/>
+              <w:rPr>
+                <w:sz w:val="22"/>
+                <w:szCs w:val="22"/>
+              </w:rPr>
+            </w:pPr>
+          </w:p>
+        </w:tc>
+      </w:tr>
+      <w:tr>
+        <w:tc>
+          <w:tcPr>
+            <w:tcW w:w="2553" w:type="dxa"/>
+            <w:tcBorders>
+              <w:top w:val="single" w:sz="4" w:space="0" w:color="auto"/>
+              <w:left w:val="single" w:sz="4" w:space="0" w:color="auto"/>
+              <w:bottom w:val="single" w:sz="4" w:space="0" w:color="auto"/>
+              <w:right w:val="single" w:sz="4" w:space="0" w:color="auto"/>
+            </w:tcBorders>
+          </w:tcPr>
+          <w:p>
+            <w:pPr>
+              <w:keepNext/>
+              <w:keepLines/>
+              <w:jc w:val="both"/>
+              <w:rPr>
+                <w:sz w:val="22"/>
+                <w:szCs w:val="22"/>
+              </w:rPr>
+            </w:pPr>
+          </w:p>
+        </w:tc>
+        <w:tc>
+          <w:tcPr>
+            <w:tcW w:w="2835" w:type="dxa"/>
+            <w:tcBorders>
+              <w:top w:val="single" w:sz="4" w:space="0" w:color="auto"/>
+              <w:left w:val="single" w:sz="4" w:space="0" w:color="auto"/>
+              <w:bottom w:val="single" w:sz="4" w:space="0" w:color="auto"/>
+              <w:right w:val="single" w:sz="4" w:space="0" w:color="auto"/>
+            </w:tcBorders>
+          </w:tcPr>
+          <w:p>
+            <w:pPr>
+              <w:keepNext/>
+              <w:keepLines/>
+              <w:jc w:val="both"/>
+              <w:rPr>
+                <w:sz w:val="22"/>
+                <w:szCs w:val="22"/>
+              </w:rPr>
+            </w:pPr>
+          </w:p>
+        </w:tc>
+        <w:tc>
+          <w:tcPr>
+            <w:tcW w:w="2693" w:type="dxa"/>
+            <w:tcBorders>
+              <w:top w:val="single" w:sz="4" w:space="0" w:color="auto"/>
+              <w:left w:val="single" w:sz="4" w:space="0" w:color="auto"/>
+              <w:bottom w:val="single" w:sz="4" w:space="0" w:color="auto"/>
+              <w:right w:val="single" w:sz="4" w:space="0" w:color="auto"/>
+            </w:tcBorders>
+          </w:tcPr>
+          <w:p>
+            <w:pPr>
+              <w:keepNext/>
+              <w:keepLines/>
+              <w:jc w:val="both"/>
+              <w:rPr>
+                <w:sz w:val="22"/>
+                <w:szCs w:val="22"/>
+              </w:rPr>
+            </w:pPr>
+          </w:p>
+        </w:tc>
+        <w:tc>
+          <w:tcPr>
+            <w:tcW w:w="1276" w:type="dxa"/>
+            <w:tcBorders>
+              <w:top w:val="single" w:sz="4" w:space="0" w:color="auto"/>
+              <w:left w:val="single" w:sz="4" w:space="0" w:color="auto"/>
+              <w:bottom w:val="single" w:sz="4" w:space="0" w:color="auto"/>
+              <w:right w:val="single" w:sz="4" w:space="0" w:color="auto"/>
+            </w:tcBorders>
+          </w:tcPr>
+          <w:p>
+            <w:pPr>
+              <w:keepNext/>
+              <w:keepLines/>
+              <w:jc w:val="both"/>
+              <w:rPr>
+                <w:sz w:val="22"/>
+                <w:szCs w:val="22"/>
+              </w:rPr>
+            </w:pPr>
+          </w:p>
+        </w:tc>
+      </w:tr>
     </w:tbl>
     <w:p>
       <w:pPr>
@@ -6964,7 +7793,7 @@
 </file>
 
 <file path=word/endnotes.xml><?xml version="1.0" encoding="utf-8"?>
-<w:endnotes xmlns:wpc="http://schemas.microsoft.com/office/word/2010/wordprocessingCanvas" xmlns:cx="http://schemas.microsoft.com/office/drawing/2014/chartex" xmlns:cx1="http://schemas.microsoft.com/office/drawing/2015/9/8/chartex" xmlns:cx2="http://schemas.microsoft.com/office/drawing/2015/10/21/chartex" xmlns:cx3="http://schemas.microsoft.com/office/drawing/2016/5/9/chartex" xmlns:cx4="http://schemas.microsoft.com/office/drawing/2016/5/10/chartex" xmlns:cx5="http://schemas.microsoft.com/office/drawing/2016/5/11/chartex" xmlns:cx6="http://schemas.microsoft.com/office/drawing/2016/5/12/chartex" xmlns:cx7="http://schemas.microsoft.com/office/drawing/2016/5/13/chartex" xmlns:cx8="http://schemas.microsoft.com/office/drawing/2016/5/14/chartex" xmlns:mc="http://schemas.openxmlformats.org/markup-compatibility/2006" xmlns:aink="http://schemas.microsoft.com/office/drawing/2016/ink" xmlns:am3d="http://schemas.microsoft.com/office/drawing/2017/model3d" xmlns:o="urn:schemas-microsoft-com:office:office" xmlns:r="http://schemas.openxmlformats.org/officeDocument/2006/relationships" xmlns:m="http://schemas.openxmlformats.org/officeDocument/2006/math" xmlns:v="urn:schemas-microsoft-com:vml" xmlns:wp14="http://schemas.microsoft.com/office/word/2010/wordprocessingDrawing" xmlns:wp="http://schemas.openxmlformats.org/drawingml/2006/wordprocessingDrawing" xmlns:w10="urn:schemas-microsoft-com:office:word" xmlns:w="http://schemas.openxmlformats.org/wordprocessingml/2006/main" xmlns:w14="http://schemas.microsoft.com/office/word/2010/wordml" xmlns:w15="http://schemas.microsoft.com/office/word/2012/wordml" xmlns:w16cex="http://schemas.microsoft.com/office/word/2018/wordml/cex" xmlns:w16cid="http://schemas.microsoft.com/office/word/2016/wordml/cid" xmlns:w16="http://schemas.microsoft.com/office/word/2018/wordml" xmlns:w16sdtdh="http://schemas.microsoft.com/office/word/2020/wordml/sdtdatahash" xmlns:w16se="http://schemas.microsoft.com/office/word/2015/wordml/symex" xmlns:wpg="http://schemas.microsoft.com/office/word/2010/wordprocessingGroup" xmlns:wpi="http://schemas.microsoft.com/office/word/2010/wordprocessingInk" xmlns:wne="http://schemas.microsoft.com/office/word/2006/wordml" xmlns:wps="http://schemas.microsoft.com/office/word/2010/wordprocessingShape" mc:Ignorable="w14 w15 w16se w16cid w16 w16cex w16sdtdh wp14">
+<w:endnotes xmlns:wpc="http://schemas.microsoft.com/office/word/2010/wordprocessingCanvas" xmlns:cx="http://schemas.microsoft.com/office/drawing/2014/chartex" xmlns:cx1="http://schemas.microsoft.com/office/drawing/2015/9/8/chartex" xmlns:cx2="http://schemas.microsoft.com/office/drawing/2015/10/21/chartex" xmlns:cx3="http://schemas.microsoft.com/office/drawing/2016/5/9/chartex" xmlns:cx4="http://schemas.microsoft.com/office/drawing/2016/5/10/chartex" xmlns:cx5="http://schemas.microsoft.com/office/drawing/2016/5/11/chartex" xmlns:cx6="http://schemas.microsoft.com/office/drawing/2016/5/12/chartex" xmlns:cx7="http://schemas.microsoft.com/office/drawing/2016/5/13/chartex" xmlns:cx8="http://schemas.microsoft.com/office/drawing/2016/5/14/chartex" xmlns:mc="http://schemas.openxmlformats.org/markup-compatibility/2006" xmlns:aink="http://schemas.microsoft.com/office/drawing/2016/ink" xmlns:am3d="http://schemas.microsoft.com/office/drawing/2017/model3d" xmlns:o="urn:schemas-microsoft-com:office:office" xmlns:oel="http://schemas.microsoft.com/office/2019/extlst" xmlns:r="http://schemas.openxmlformats.org/officeDocument/2006/relationships" xmlns:m="http://schemas.openxmlformats.org/officeDocument/2006/math" xmlns:v="urn:schemas-microsoft-com:vml" xmlns:wp14="http://schemas.microsoft.com/office/word/2010/wordprocessingDrawing" xmlns:wp="http://schemas.openxmlformats.org/drawingml/2006/wordprocessingDrawing" xmlns:w10="urn:schemas-microsoft-com:office:word" xmlns:w="http://schemas.openxmlformats.org/wordprocessingml/2006/main" xmlns:w14="http://schemas.microsoft.com/office/word/2010/wordml" xmlns:w15="http://schemas.microsoft.com/office/word/2012/wordml" xmlns:w16cex="http://schemas.microsoft.com/office/word/2018/wordml/cex" xmlns:w16cid="http://schemas.microsoft.com/office/word/2016/wordml/cid" xmlns:w16="http://schemas.microsoft.com/office/word/2018/wordml" xmlns:w16du="http://schemas.microsoft.com/office/word/2023/wordml/word16du" xmlns:w16sdtdh="http://schemas.microsoft.com/office/word/2020/wordml/sdtdatahash" xmlns:w16se="http://schemas.microsoft.com/office/word/2015/wordml/symex" xmlns:wpg="http://schemas.microsoft.com/office/word/2010/wordprocessingGroup" xmlns:wpi="http://schemas.microsoft.com/office/word/2010/wordprocessingInk" xmlns:wne="http://schemas.microsoft.com/office/word/2006/wordml" xmlns:wps="http://schemas.microsoft.com/office/word/2010/wordprocessingShape" mc:Ignorable="w14 w15 w16se w16cid w16 w16cex w16sdtdh w16du wp14">
   <w:endnote w:type="separator" w:id="-1">
     <w:p>
       <w:r>
@@ -6983,7 +7812,7 @@
 </file>
 
 <file path=word/footnotes.xml><?xml version="1.0" encoding="utf-8"?>
-<w:footnotes xmlns:wpc="http://schemas.microsoft.com/office/word/2010/wordprocessingCanvas" xmlns:cx="http://schemas.microsoft.com/office/drawing/2014/chartex" xmlns:cx1="http://schemas.microsoft.com/office/drawing/2015/9/8/chartex" xmlns:cx2="http://schemas.microsoft.com/office/drawing/2015/10/21/chartex" xmlns:cx3="http://schemas.microsoft.com/office/drawing/2016/5/9/chartex" xmlns:cx4="http://schemas.microsoft.com/office/drawing/2016/5/10/chartex" xmlns:cx5="http://schemas.microsoft.com/office/drawing/2016/5/11/chartex" xmlns:cx6="http://schemas.microsoft.com/office/drawing/2016/5/12/chartex" xmlns:cx7="http://schemas.microsoft.com/office/drawing/2016/5/13/chartex" xmlns:cx8="http://schemas.microsoft.com/office/drawing/2016/5/14/chartex" xmlns:mc="http://schemas.openxmlformats.org/markup-compatibility/2006" xmlns:aink="http://schemas.microsoft.com/office/drawing/2016/ink" xmlns:am3d="http://schemas.microsoft.com/office/drawing/2017/model3d" xmlns:o="urn:schemas-microsoft-com:office:office" xmlns:r="http://schemas.openxmlformats.org/officeDocument/2006/relationships" xmlns:m="http://schemas.openxmlformats.org/officeDocument/2006/math" xmlns:v="urn:schemas-microsoft-com:vml" xmlns:wp14="http://schemas.microsoft.com/office/word/2010/wordprocessingDrawing" xmlns:wp="http://schemas.openxmlformats.org/drawingml/2006/wordprocessingDrawing" xmlns:w10="urn:schemas-microsoft-com:office:word" xmlns:w="http://schemas.openxmlformats.org/wordprocessingml/2006/main" xmlns:w14="http://schemas.microsoft.com/office/word/2010/wordml" xmlns:w15="http://schemas.microsoft.com/office/word/2012/wordml" xmlns:w16cex="http://schemas.microsoft.com/office/word/2018/wordml/cex" xmlns:w16cid="http://schemas.microsoft.com/office/word/2016/wordml/cid" xmlns:w16="http://schemas.microsoft.com/office/word/2018/wordml" xmlns:w16sdtdh="http://schemas.microsoft.com/office/word/2020/wordml/sdtdatahash" xmlns:w16se="http://schemas.microsoft.com/office/word/2015/wordml/symex" xmlns:wpg="http://schemas.microsoft.com/office/word/2010/wordprocessingGroup" xmlns:wpi="http://schemas.microsoft.com/office/word/2010/wordprocessingInk" xmlns:wne="http://schemas.microsoft.com/office/word/2006/wordml" xmlns:wps="http://schemas.microsoft.com/office/word/2010/wordprocessingShape" mc:Ignorable="w14 w15 w16se w16cid w16 w16cex w16sdtdh wp14">
+<w:footnotes xmlns:wpc="http://schemas.microsoft.com/office/word/2010/wordprocessingCanvas" xmlns:cx="http://schemas.microsoft.com/office/drawing/2014/chartex" xmlns:cx1="http://schemas.microsoft.com/office/drawing/2015/9/8/chartex" xmlns:cx2="http://schemas.microsoft.com/office/drawing/2015/10/21/chartex" xmlns:cx3="http://schemas.microsoft.com/office/drawing/2016/5/9/chartex" xmlns:cx4="http://schemas.microsoft.com/office/drawing/2016/5/10/chartex" xmlns:cx5="http://schemas.microsoft.com/office/drawing/2016/5/11/chartex" xmlns:cx6="http://schemas.microsoft.com/office/drawing/2016/5/12/chartex" xmlns:cx7="http://schemas.microsoft.com/office/drawing/2016/5/13/chartex" xmlns:cx8="http://schemas.microsoft.com/office/drawing/2016/5/14/chartex" xmlns:mc="http://schemas.openxmlformats.org/markup-compatibility/2006" xmlns:aink="http://schemas.microsoft.com/office/drawing/2016/ink" xmlns:am3d="http://schemas.microsoft.com/office/drawing/2017/model3d" xmlns:o="urn:schemas-microsoft-com:office:office" xmlns:oel="http://schemas.microsoft.com/office/2019/extlst" xmlns:r="http://schemas.openxmlformats.org/officeDocument/2006/relationships" xmlns:m="http://schemas.openxmlformats.org/officeDocument/2006/math" xmlns:v="urn:schemas-microsoft-com:vml" xmlns:wp14="http://schemas.microsoft.com/office/word/2010/wordprocessingDrawing" xmlns:wp="http://schemas.openxmlformats.org/drawingml/2006/wordprocessingDrawing" xmlns:w10="urn:schemas-microsoft-com:office:word" xmlns:w="http://schemas.openxmlformats.org/wordprocessingml/2006/main" xmlns:w14="http://schemas.microsoft.com/office/word/2010/wordml" xmlns:w15="http://schemas.microsoft.com/office/word/2012/wordml" xmlns:w16cex="http://schemas.microsoft.com/office/word/2018/wordml/cex" xmlns:w16cid="http://schemas.microsoft.com/office/word/2016/wordml/cid" xmlns:w16="http://schemas.microsoft.com/office/word/2018/wordml" xmlns:w16du="http://schemas.microsoft.com/office/word/2023/wordml/word16du" xmlns:w16sdtdh="http://schemas.microsoft.com/office/word/2020/wordml/sdtdatahash" xmlns:w16se="http://schemas.microsoft.com/office/word/2015/wordml/symex" xmlns:wpg="http://schemas.microsoft.com/office/word/2010/wordprocessingGroup" xmlns:wpi="http://schemas.microsoft.com/office/word/2010/wordprocessingInk" xmlns:wne="http://schemas.microsoft.com/office/word/2006/wordml" xmlns:wps="http://schemas.microsoft.com/office/word/2010/wordprocessingShape" mc:Ignorable="w14 w15 w16se w16cid w16 w16cex w16sdtdh w16du wp14">
   <w:footnote w:type="separator" w:id="-1">
     <w:p>
       <w:r>
@@ -7002,7 +7831,7 @@
 </file>
 
 <file path=word/header1.xml><?xml version="1.0" encoding="utf-8"?>
-<w:hdr xmlns:wpc="http://schemas.microsoft.com/office/word/2010/wordprocessingCanvas" xmlns:cx="http://schemas.microsoft.com/office/drawing/2014/chartex" xmlns:cx1="http://schemas.microsoft.com/office/drawing/2015/9/8/chartex" xmlns:cx2="http://schemas.microsoft.com/office/drawing/2015/10/21/chartex" xmlns:cx3="http://schemas.microsoft.com/office/drawing/2016/5/9/chartex" xmlns:cx4="http://schemas.microsoft.com/office/drawing/2016/5/10/chartex" xmlns:cx5="http://schemas.microsoft.com/office/drawing/2016/5/11/chartex" xmlns:cx6="http://schemas.microsoft.com/office/drawing/2016/5/12/chartex" xmlns:cx7="http://schemas.microsoft.com/office/drawing/2016/5/13/chartex" xmlns:cx8="http://schemas.microsoft.com/office/drawing/2016/5/14/chartex" xmlns:mc="http://schemas.openxmlformats.org/markup-compatibility/2006" xmlns:aink="http://schemas.microsoft.com/office/drawing/2016/ink" xmlns:am3d="http://schemas.microsoft.com/office/drawing/2017/model3d" xmlns:o="urn:schemas-microsoft-com:office:office" xmlns:r="http://schemas.openxmlformats.org/officeDocument/2006/relationships" xmlns:m="http://schemas.openxmlformats.org/officeDocument/2006/math" xmlns:v="urn:schemas-microsoft-com:vml" xmlns:wp14="http://schemas.microsoft.com/office/word/2010/wordprocessingDrawing" xmlns:wp="http://schemas.openxmlformats.org/drawingml/2006/wordprocessingDrawing" xmlns:w10="urn:schemas-microsoft-com:office:word" xmlns:w="http://schemas.openxmlformats.org/wordprocessingml/2006/main" xmlns:w14="http://schemas.microsoft.com/office/word/2010/wordml" xmlns:w15="http://schemas.microsoft.com/office/word/2012/wordml" xmlns:w16cex="http://schemas.microsoft.com/office/word/2018/wordml/cex" xmlns:w16cid="http://schemas.microsoft.com/office/word/2016/wordml/cid" xmlns:w16="http://schemas.microsoft.com/office/word/2018/wordml" xmlns:w16sdtdh="http://schemas.microsoft.com/office/word/2020/wordml/sdtdatahash" xmlns:w16se="http://schemas.microsoft.com/office/word/2015/wordml/symex" xmlns:wpg="http://schemas.microsoft.com/office/word/2010/wordprocessingGroup" xmlns:wpi="http://schemas.microsoft.com/office/word/2010/wordprocessingInk" xmlns:wne="http://schemas.microsoft.com/office/word/2006/wordml" xmlns:wps="http://schemas.microsoft.com/office/word/2010/wordprocessingShape" mc:Ignorable="w14 w15 w16se w16cid w16 w16cex w16sdtdh wp14">
+<w:hdr xmlns:wpc="http://schemas.microsoft.com/office/word/2010/wordprocessingCanvas" xmlns:cx="http://schemas.microsoft.com/office/drawing/2014/chartex" xmlns:cx1="http://schemas.microsoft.com/office/drawing/2015/9/8/chartex" xmlns:cx2="http://schemas.microsoft.com/office/drawing/2015/10/21/chartex" xmlns:cx3="http://schemas.microsoft.com/office/drawing/2016/5/9/chartex" xmlns:cx4="http://schemas.microsoft.com/office/drawing/2016/5/10/chartex" xmlns:cx5="http://schemas.microsoft.com/office/drawing/2016/5/11/chartex" xmlns:cx6="http://schemas.microsoft.com/office/drawing/2016/5/12/chartex" xmlns:cx7="http://schemas.microsoft.com/office/drawing/2016/5/13/chartex" xmlns:cx8="http://schemas.microsoft.com/office/drawing/2016/5/14/chartex" xmlns:mc="http://schemas.openxmlformats.org/markup-compatibility/2006" xmlns:aink="http://schemas.microsoft.com/office/drawing/2016/ink" xmlns:am3d="http://schemas.microsoft.com/office/drawing/2017/model3d" xmlns:o="urn:schemas-microsoft-com:office:office" xmlns:oel="http://schemas.microsoft.com/office/2019/extlst" xmlns:r="http://schemas.openxmlformats.org/officeDocument/2006/relationships" xmlns:m="http://schemas.openxmlformats.org/officeDocument/2006/math" xmlns:v="urn:schemas-microsoft-com:vml" xmlns:wp14="http://schemas.microsoft.com/office/word/2010/wordprocessingDrawing" xmlns:wp="http://schemas.openxmlformats.org/drawingml/2006/wordprocessingDrawing" xmlns:w10="urn:schemas-microsoft-com:office:word" xmlns:w="http://schemas.openxmlformats.org/wordprocessingml/2006/main" xmlns:w14="http://schemas.microsoft.com/office/word/2010/wordml" xmlns:w15="http://schemas.microsoft.com/office/word/2012/wordml" xmlns:w16cex="http://schemas.microsoft.com/office/word/2018/wordml/cex" xmlns:w16cid="http://schemas.microsoft.com/office/word/2016/wordml/cid" xmlns:w16="http://schemas.microsoft.com/office/word/2018/wordml" xmlns:w16du="http://schemas.microsoft.com/office/word/2023/wordml/word16du" xmlns:w16sdtdh="http://schemas.microsoft.com/office/word/2020/wordml/sdtdatahash" xmlns:w16se="http://schemas.microsoft.com/office/word/2015/wordml/symex" xmlns:wpg="http://schemas.microsoft.com/office/word/2010/wordprocessingGroup" xmlns:wpi="http://schemas.microsoft.com/office/word/2010/wordprocessingInk" xmlns:wne="http://schemas.microsoft.com/office/word/2006/wordml" xmlns:wps="http://schemas.microsoft.com/office/word/2010/wordprocessingShape" mc:Ignorable="w14 w15 w16se w16cid w16 w16cex w16sdtdh w16du wp14">
   <w:p>
     <w:pPr>
       <w:pStyle w:val="a6"/>
@@ -7026,7 +7855,7 @@
 </file>
 
 <file path=word/numbering.xml><?xml version="1.0" encoding="utf-8"?>
-<w:numbering xmlns:wpc="http://schemas.microsoft.com/office/word/2010/wordprocessingCanvas" xmlns:cx="http://schemas.microsoft.com/office/drawing/2014/chartex" xmlns:cx1="http://schemas.microsoft.com/office/drawing/2015/9/8/chartex" xmlns:cx2="http://schemas.microsoft.com/office/drawing/2015/10/21/chartex" xmlns:cx3="http://schemas.microsoft.com/office/drawing/2016/5/9/chartex" xmlns:cx4="http://schemas.microsoft.com/office/drawing/2016/5/10/chartex" xmlns:cx5="http://schemas.microsoft.com/office/drawing/2016/5/11/chartex" xmlns:cx6="http://schemas.microsoft.com/office/drawing/2016/5/12/chartex" xmlns:cx7="http://schemas.microsoft.com/office/drawing/2016/5/13/chartex" xmlns:cx8="http://schemas.microsoft.com/office/drawing/2016/5/14/chartex" xmlns:mc="http://schemas.openxmlformats.org/markup-compatibility/2006" xmlns:aink="http://schemas.microsoft.com/office/drawing/2016/ink" xmlns:am3d="http://schemas.microsoft.com/office/drawing/2017/model3d" xmlns:o="urn:schemas-microsoft-com:office:office" xmlns:r="http://schemas.openxmlformats.org/officeDocument/2006/relationships" xmlns:m="http://schemas.openxmlformats.org/officeDocument/2006/math" xmlns:v="urn:schemas-microsoft-com:vml" xmlns:wp14="http://schemas.microsoft.com/office/word/2010/wordprocessingDrawing" xmlns:wp="http://schemas.openxmlformats.org/drawingml/2006/wordprocessingDrawing" xmlns:w10="urn:schemas-microsoft-com:office:word" xmlns:w="http://schemas.openxmlformats.org/wordprocessingml/2006/main" xmlns:w14="http://schemas.microsoft.com/office/word/2010/wordml" xmlns:w15="http://schemas.microsoft.com/office/word/2012/wordml" xmlns:w16cex="http://schemas.microsoft.com/office/word/2018/wordml/cex" xmlns:w16cid="http://schemas.microsoft.com/office/word/2016/wordml/cid" xmlns:w16="http://schemas.microsoft.com/office/word/2018/wordml" xmlns:w16sdtdh="http://schemas.microsoft.com/office/word/2020/wordml/sdtdatahash" xmlns:w16se="http://schemas.microsoft.com/office/word/2015/wordml/symex" xmlns:wpg="http://schemas.microsoft.com/office/word/2010/wordprocessingGroup" xmlns:wpi="http://schemas.microsoft.com/office/word/2010/wordprocessingInk" xmlns:wne="http://schemas.microsoft.com/office/word/2006/wordml" xmlns:wps="http://schemas.microsoft.com/office/word/2010/wordprocessingShape" mc:Ignorable="w14 w15 w16se w16cid w16 w16cex w16sdtdh wp14">
+<w:numbering xmlns:wpc="http://schemas.microsoft.com/office/word/2010/wordprocessingCanvas" xmlns:cx="http://schemas.microsoft.com/office/drawing/2014/chartex" xmlns:cx1="http://schemas.microsoft.com/office/drawing/2015/9/8/chartex" xmlns:cx2="http://schemas.microsoft.com/office/drawing/2015/10/21/chartex" xmlns:cx3="http://schemas.microsoft.com/office/drawing/2016/5/9/chartex" xmlns:cx4="http://schemas.microsoft.com/office/drawing/2016/5/10/chartex" xmlns:cx5="http://schemas.microsoft.com/office/drawing/2016/5/11/chartex" xmlns:cx6="http://schemas.microsoft.com/office/drawing/2016/5/12/chartex" xmlns:cx7="http://schemas.microsoft.com/office/drawing/2016/5/13/chartex" xmlns:cx8="http://schemas.microsoft.com/office/drawing/2016/5/14/chartex" xmlns:mc="http://schemas.openxmlformats.org/markup-compatibility/2006" xmlns:aink="http://schemas.microsoft.com/office/drawing/2016/ink" xmlns:am3d="http://schemas.microsoft.com/office/drawing/2017/model3d" xmlns:o="urn:schemas-microsoft-com:office:office" xmlns:oel="http://schemas.microsoft.com/office/2019/extlst" xmlns:r="http://schemas.openxmlformats.org/officeDocument/2006/relationships" xmlns:m="http://schemas.openxmlformats.org/officeDocument/2006/math" xmlns:v="urn:schemas-microsoft-com:vml" xmlns:wp14="http://schemas.microsoft.com/office/word/2010/wordprocessingDrawing" xmlns:wp="http://schemas.openxmlformats.org/drawingml/2006/wordprocessingDrawing" xmlns:w10="urn:schemas-microsoft-com:office:word" xmlns:w="http://schemas.openxmlformats.org/wordprocessingml/2006/main" xmlns:w14="http://schemas.microsoft.com/office/word/2010/wordml" xmlns:w15="http://schemas.microsoft.com/office/word/2012/wordml" xmlns:w16cex="http://schemas.microsoft.com/office/word/2018/wordml/cex" xmlns:w16cid="http://schemas.microsoft.com/office/word/2016/wordml/cid" xmlns:w16="http://schemas.microsoft.com/office/word/2018/wordml" xmlns:w16du="http://schemas.microsoft.com/office/word/2023/wordml/word16du" xmlns:w16sdtdh="http://schemas.microsoft.com/office/word/2020/wordml/sdtdatahash" xmlns:w16se="http://schemas.microsoft.com/office/word/2015/wordml/symex" xmlns:wpg="http://schemas.microsoft.com/office/word/2010/wordprocessingGroup" xmlns:wpi="http://schemas.microsoft.com/office/word/2010/wordprocessingInk" xmlns:wne="http://schemas.microsoft.com/office/word/2006/wordml" xmlns:wps="http://schemas.microsoft.com/office/word/2010/wordprocessingShape" mc:Ignorable="w14 w15 w16se w16cid w16 w16cex w16sdtdh w16du wp14">
   <w:abstractNum w:abstractNumId="0" w15:restartNumberingAfterBreak="0">
     <w:nsid w:val="4B5E1A49"/>
     <w:multiLevelType w:val="hybridMultilevel"/>
@@ -7140,14 +7969,14 @@
       </w:rPr>
     </w:lvl>
   </w:abstractNum>
-  <w:num w:numId="1">
+  <w:num w:numId="1" w16cid:durableId="1089817387">
     <w:abstractNumId w:val="0"/>
   </w:num>
 </w:numbering>
 </file>
 
 <file path=word/styles.xml><?xml version="1.0" encoding="utf-8"?>
-<w:styles xmlns:mc="http://schemas.openxmlformats.org/markup-compatibility/2006" xmlns:r="http://schemas.openxmlformats.org/officeDocument/2006/relationships" xmlns:w="http://schemas.openxmlformats.org/wordprocessingml/2006/main" xmlns:w14="http://schemas.microsoft.com/office/word/2010/wordml" xmlns:w15="http://schemas.microsoft.com/office/word/2012/wordml" xmlns:w16cex="http://schemas.microsoft.com/office/word/2018/wordml/cex" xmlns:w16cid="http://schemas.microsoft.com/office/word/2016/wordml/cid" xmlns:w16="http://schemas.microsoft.com/office/word/2018/wordml" xmlns:w16sdtdh="http://schemas.microsoft.com/office/word/2020/wordml/sdtdatahash" xmlns:w16se="http://schemas.microsoft.com/office/word/2015/wordml/symex" mc:Ignorable="w14 w15 w16se w16cid w16 w16cex w16sdtdh">
+<w:styles xmlns:mc="http://schemas.openxmlformats.org/markup-compatibility/2006" xmlns:r="http://schemas.openxmlformats.org/officeDocument/2006/relationships" xmlns:w="http://schemas.openxmlformats.org/wordprocessingml/2006/main" xmlns:w14="http://schemas.microsoft.com/office/word/2010/wordml" xmlns:w15="http://schemas.microsoft.com/office/word/2012/wordml" xmlns:w16cex="http://schemas.microsoft.com/office/word/2018/wordml/cex" xmlns:w16cid="http://schemas.microsoft.com/office/word/2016/wordml/cid" xmlns:w16="http://schemas.microsoft.com/office/word/2018/wordml" xmlns:w16du="http://schemas.microsoft.com/office/word/2023/wordml/word16du" xmlns:w16sdtdh="http://schemas.microsoft.com/office/word/2020/wordml/sdtdatahash" xmlns:w16se="http://schemas.microsoft.com/office/word/2015/wordml/symex" mc:Ignorable="w14 w15 w16se w16cid w16 w16cex w16sdtdh w16du">
   <w:docDefaults>
     <w:rPrDefault>
       <w:rPr>

</xml_diff>